<commit_message>
vault backup: 2026-08-20 12:59:03
</commit_message>
<xml_diff>
--- a/4-SYSTEM/Pipelines/wikipedia/paper/draft/Expanding-the-Digital-Footprint-of-Tibetan.docx
+++ b/4-SYSTEM/Pipelines/wikipedia/paper/draft/Expanding-the-Digital-Footprint-of-Tibetan.docx
@@ -37,7 +37,7 @@
           <w:sz w:val="20"/>
           <w:szCs w:val="20"/>
         </w:rPr>
-        <w:t xml:space="preserve">Working draft, 10 August 2026 — evaluation slots that await team data are marked [TO FILL]</w:t>
+        <w:t xml:space="preserve">Working draft, 19 August 2026 — evaluation slots that await team data are marked [TO FILL]</w:t>
       </w:r>
     </w:p>
     <w:p>
@@ -63,7 +63,7 @@
         <w:t xml:space="preserve">Praise to the Twenty-One Tārās</w:t>
       </w:r>
       <w:r>
-        <w:t xml:space="preserve"> with sixteen Tibetan commentaries, producing 2,975 typed, source-anchored claims, 24 consolidated topic pages and six drafted articles. In the audited pilot, all 81 quotations across three generated articles verify character-for-character against their cited sources, and an independent cross-model audit caught five blocking errors that a same-model audit had passed — four confirmed by hand. We argue that the difference between machine content that degrades small-language wikis and machine content that revives them is a single variable: verification before publication, with a human hand on the gate. The pipeline's by-product — a typed, school-tagged, block-located claims database over a verse-aligned commentarial corpus — is a research artifact for Tibetan studies independent of Wikipedia.</w:t>
+        <w:t xml:space="preserve"> with sixteen Tibetan commentaries, producing 2,975 typed, source-anchored claims, 67 consolidated topic pages, and 69 drafted articles — a deeply audited three-article pilot and a corpus-wide batch — with native-speaker review feeding style rules back into the drafting step. In the audited pilot, all 81 quotations across three generated articles verify character-for-character against their cited sources, and an independent cross-model audit caught five blocking errors that a same-model audit had passed — four confirmed by hand. Across the batch, 861 of 882 rendered quotations (97.6%) verify character-for-character. We argue that the difference between machine content that degrades small-language wikis and machine content that revives them is a single variable: verification before publication, with a human hand on the gate. The pipeline's by-product — a typed, school-tagged, block-located claims database over a verse-aligned commentarial corpus — is a research artifact for Tibetan studies independent of Wikipedia.</w:t>
       </w:r>
     </w:p>
     <w:p>
@@ -96,7 +96,7 @@
         <w:jc w:val="both"/>
       </w:pPr>
       <w:r>
-        <w:t xml:space="preserve">Tibetan is spoken by some seven million people and carries one of the largest classical literatures in Asia, yet its digital footprint is out of all proportion to both facts. As of July 2026 the Tibetan Wikipedia holds roughly 8,000 content articles — against hundreds of thousands for comparable-population European languages — with about 31 active editors in a given month, two administrators, and on the order of 350 new articles a year. The consequences now compound in a new place. On the TLUE benchmark, most large models score </w:t>
+        <w:t xml:space="preserve">Tibetan is spoken by some seven million people and carries one of the largest classical literatures in Asia, yet its digital footprint is out of all proportion to both facts. As of August 2026 the Tibetan Wikipedia holds 8,073 content articles (live API count, 19 August 2026) — against hundreds of thousands for comparable-population European languages — with 36 active users in the trailing month, two administrators, and on the order of 350 new articles a year. The consequences now compound in a new place. On the TLUE benchmark, most large models score </w:t>
       </w:r>
       <w:r>
         <w:rPr>
@@ -183,7 +183,7 @@
         <w:t xml:space="preserve">the sign of the feedback loop is determined by verification</w:t>
       </w:r>
       <w:r>
-        <w:t xml:space="preserve">. The evidence is a complete pipeline; a deeply audited three-article pilot; a corpus of 2,975 extracted claims, 24 consolidated topic pages and a 418-citation adversarial audit; three further articles drafted from the consolidated pages; and, as of writing, </w:t>
+        <w:t xml:space="preserve">. The evidence is a complete pipeline; a deeply audited three-article pilot; a corpus of 2,975 extracted claims, 67 consolidated topic pages and a 418-citation adversarial audit; a corpus-wide batch of 66 further articles drafted from the consolidated pages and re-verified by the deterministic gate; a native-speaker review loop whose findings became executable drafting rules; and, as of writing, </w:t>
       </w:r>
       <w:r>
         <w:rPr>
@@ -222,7 +222,7 @@
         <w:t xml:space="preserve">Contributions.</w:t>
       </w:r>
       <w:r>
-        <w:t xml:space="preserve"> (1) A working end-to-end pipeline: raw OCR → cleaned, block-addressable sources → structural trees → atomic claims → consolidated topic pages → cited Tibetan wikitext, behind a deterministic character-exact verification gate (§5). (2) A measured negative result about self-evaluation: a same-model audit returned "publish, no findings" on drafts in which an independent cross-model audit found five blocking errors (§8). (3) An adversarial-audit error taxonomy — from a re-check of every one of 418 citations on three consolidated pages — converted wholesale into executable rules and two standing gates (§5.7, §8). (4) The claims database itself as a dataset (§7). (5) A transferable design pattern for under-resourced languages: model judgment everywhere, model authority nowhere (§9).</w:t>
+        <w:t xml:space="preserve"> (1) A working end-to-end pipeline: raw OCR → cleaned, block-addressable sources → structural trees → atomic claims → consolidated topic pages → cited Tibetan wikitext, behind a deterministic character-exact verification gate (§5). (2) A measured negative result about self-evaluation: a same-model audit returned "publish, no findings" on drafts in which an independent cross-model audit found five blocking errors (§8). (3) An adversarial-audit error taxonomy — from a re-check of every one of 418 citations on three consolidated pages — converted wholesale into executable rules and two standing gates (§5.8, §8). (4) The claims database itself as a dataset (§7). (5) A transferable design pattern for under-resourced languages: model judgment everywhere, model authority nowhere (§9).</w:t>
       </w:r>
     </w:p>
     <w:p>
@@ -473,7 +473,7 @@
         <w:t xml:space="preserve">By hand.</w:t>
       </w:r>
       <w:r>
-        <w:t xml:space="preserve"> The manual mode's throughput on the Tibetan Wikipedia is public record: roughly 350 new articles a year since 2020, 31 active editors in a typical month, two administrators — and, eighteen years after founding, a total the size of a single English-language WikiProject. Organized effort does not escape the arithmetic: the Dzongkha Wikipedia Education Program took institutional backing, dozens of trained participants and five months to produce about eighty articles. The authors' own editor-training programs for Tibetan Wikipedia point the same way </w:t>
+        <w:t xml:space="preserve"> The manual mode's throughput on the Tibetan Wikipedia is public record: roughly 350 new articles a year since 2020, some thirty active editors in a typical month, two administrators — and, eighteen years after founding, a total the size of a single English-language WikiProject. Organized effort does not escape the arithmetic: the Dzongkha Wikipedia Education Program took institutional backing, dozens of trained participants and five months to produce about eighty articles. The authors' own editor-training programs for Tibetan Wikipedia point the same way </w:t>
       </w:r>
       <w:r>
         <w:rPr>
@@ -1621,7 +1621,7 @@
         <w:t xml:space="preserve">sic</w:t>
       </w:r>
       <w:r>
-        <w:t xml:space="preserve">-faithful to whatever the ingested edition says (§5.9), textual correction happens here, at the source layer, or not at all.</w:t>
+        <w:t xml:space="preserve">-faithful to whatever the ingested edition says (§5.10), textual correction happens here, at the source layer, or not at all.</w:t>
       </w:r>
     </w:p>
     <w:p>
@@ -1640,7 +1640,7 @@
         <w:t xml:space="preserve">Obsidian vault</w:t>
       </w:r>
       <w:r>
-        <w:t xml:space="preserve">, and every verse and discrete prose block carries a stable Obsidian block ID — the corpus-wide citation primitive, and the reason a citation can name a passage rather than a file (§5.10):</w:t>
+        <w:t xml:space="preserve">, and every verse and discrete prose block carries a stable Obsidian block ID — the corpus-wide citation primitive, and the reason a citation can name a passage rather than a file (§5.11):</w:t>
       </w:r>
     </w:p>
     <w:p>
@@ -1766,7 +1766,7 @@
         <w:t xml:space="preserve">skills</w:t>
       </w:r>
       <w:r>
-        <w:t xml:space="preserve"> — versioned, step-by-step procedures, one file per operation — driven by a tested Python command-line tool (547 passing tests) and small deterministic scripts. It reads and writes the vault's markdown directly rather than loading the corpus into a database, so every intermediate stays human-readable and reviewable in place (§5.10). Three principles repeat at every stage. </w:t>
+        <w:t xml:space="preserve"> — versioned, step-by-step procedures, one file per operation — driven by a tested Python command-line tool (568 passing tests) and small deterministic scripts. It reads and writes the vault's markdown directly rather than loading the corpus into a database, so every intermediate stays human-readable and reviewable in place (§5.11). Three principles repeat at every stage. </w:t>
       </w:r>
       <w:r>
         <w:rPr>
@@ -1796,20 +1796,39 @@
         <w:t xml:space="preserve">Nothing interpretive touches the source layer:</w:t>
       </w:r>
       <w:r>
-        <w:t xml:space="preserve"> source files receive only structure, behind a no-loss assertion that aborts if one non-whitespace character changed. Two invariants govern the article chain: nothing downstream touches source wording after the claims stage — the claims table is the only drafting input — and nothing is published that has not survived both the audit and the pre-publication review. Fourteen stages follow, each ending in the gate named where it is described. Table 2 states the layered defense as failure class against catching layer, with the on-disk evidence that each layer has fired; Table 3 enumerates the human decision points, because "semi-automatic" is not a mood.</w:t>
-      </w:r>
-    </w:p>
-    <w:p>
-      <w:pPr>
-        <w:spacing w:after="120" w:line="252"/>
-        <w:jc w:val="both"/>
-      </w:pPr>
-      <w:r>
-        <w:rPr>
-          <w:i/>
-          <w:iCs/>
-        </w:rPr>
-        <w:t xml:space="preserve">[Figure 2 near here: pipeline diagram — ingest (5.1) → structure, alignment and claims (5.2–5.5) → consolidation and audit (5.6–5.7) → articles and verification (5.8–5.9) → review and publication (5.10).]</w:t>
+        <w:t xml:space="preserve"> source files receive only structure, behind a no-loss assertion that aborts if one non-whitespace character changed. Two invariants govern the article chain: nothing downstream touches source wording after the claims stage — the claims table is the only drafting input — and nothing is published that has not survived both the audit and the pre-publication review.</w:t>
+      </w:r>
+    </w:p>
+    <w:p>
+      <w:pPr>
+        <w:spacing w:after="120" w:line="252"/>
+        <w:jc w:val="both"/>
+      </w:pPr>
+      <w:r>
+        <w:t xml:space="preserve">The pipeline runs in five phases: preparing the sources (§5.1–5.3), choosing the subjects (§5.4), building the claims layer (§5.5–5.8), generating and verifying articles (§5.9–5.10), and publication (§5.11). For every step we state, in plain terms, </w:t>
+      </w:r>
+      <w:r>
+        <w:rPr>
+          <w:b/>
+          <w:bCs/>
+        </w:rPr>
+        <w:t xml:space="preserve">what goes in, what comes out, and how it works</w:t>
+      </w:r>
+      <w:r>
+        <w:t xml:space="preserve"> — the core logic of the prompt or the script behind it — and name the gate the step ends in. Table 2 states the layered defense as failure class against catching layer, with the on-disk evidence that each layer has fired; Table 3 enumerates the human decision points, because "semi-automatic" is not a mood.</w:t>
+      </w:r>
+    </w:p>
+    <w:p>
+      <w:pPr>
+        <w:spacing w:after="120" w:line="252"/>
+        <w:jc w:val="both"/>
+      </w:pPr>
+      <w:r>
+        <w:rPr>
+          <w:i/>
+          <w:iCs/>
+        </w:rPr>
+        <w:t xml:space="preserve">[Figure 2 near here: pipeline diagram — source preparation (5.1–5.3) → subject selection (5.4) → claims, consolidation and audit (5.5–5.8) → articles and verification (5.9–5.10) → review and publication (5.11).]</w:t>
       </w:r>
     </w:p>
     <w:p>
@@ -2496,7 +2515,7 @@
           <w:i/>
           <w:iCs/>
         </w:rPr>
-        <w:t xml:space="preserve">Table 3. Human checkpoints — most exercised in the vault itself (§5.10).</w:t>
+        <w:t xml:space="preserve">Table 3. Human checkpoints — most exercised in the vault itself (§5.11).</w:t>
       </w:r>
     </w:p>
     <w:tbl>
@@ -3010,36 +3029,76 @@
           <w:b/>
           <w:bCs/>
         </w:rPr>
-        <w:t xml:space="preserve">Cleaning</w:t>
-      </w:r>
-      <w:r>
-        <w:t xml:space="preserve"> does not clean directly: it </w:t>
-      </w:r>
-      <w:r>
-        <w:rPr>
-          <w:i/>
-          <w:iCs/>
-        </w:rPr>
-        <w:t xml:space="preserve">profiles</w:t>
-      </w:r>
-      <w:r>
-        <w:t xml:space="preserve"> the raw OCR text, reports the profile to the human before touching anything, then runs a bespoke cleaner limited to eight mechanical transformations, under two rules — never overwrite the raw file, and never interpret text. Broken syllables and doubtful readings are deferred to the human edition (§4).</w:t>
-      </w:r>
-    </w:p>
-    <w:p>
-      <w:pPr>
-        <w:spacing w:after="120" w:line="252"/>
-        <w:jc w:val="both"/>
-      </w:pPr>
-      <w:r>
-        <w:rPr>
-          <w:b/>
-          <w:bCs/>
-        </w:rPr>
-        <w:t xml:space="preserve">Normalisation</w:t>
-      </w:r>
-      <w:r>
-        <w:t xml:space="preserve"> is a shared library, not a stage that edits files, because every guarantee the pipeline makes about a quotation is really a claim about </w:t>
+        <w:t xml:space="preserve">Cleaning.</w:t>
+      </w:r>
+      <w:r>
+        <w:t xml:space="preserve"> </w:t>
+      </w:r>
+      <w:r>
+        <w:rPr>
+          <w:i/>
+          <w:iCs/>
+        </w:rPr>
+        <w:t xml:space="preserve">In:</w:t>
+      </w:r>
+      <w:r>
+        <w:t xml:space="preserve"> the raw OCR text file, kept read-only. </w:t>
+      </w:r>
+      <w:r>
+        <w:rPr>
+          <w:i/>
+          <w:iCs/>
+        </w:rPr>
+        <w:t xml:space="preserve">Out:</w:t>
+      </w:r>
+      <w:r>
+        <w:t xml:space="preserve"> a cleaned working copy; the raw file untouched. </w:t>
+      </w:r>
+      <w:r>
+        <w:rPr>
+          <w:i/>
+          <w:iCs/>
+        </w:rPr>
+        <w:t xml:space="preserve">How:</w:t>
+      </w:r>
+      <w:r>
+        <w:t xml:space="preserve"> the script does not clean directly — it first builds a </w:t>
+      </w:r>
+      <w:r>
+        <w:rPr>
+          <w:i/>
+          <w:iCs/>
+        </w:rPr>
+        <w:t xml:space="preserve">profile</w:t>
+      </w:r>
+      <w:r>
+        <w:t xml:space="preserve"> of the mechanical debris it found (page-number lines, repeated running headers, spaces broken into the middle of words, the wrong tsheg character), shows that profile to the human, and only then runs a small cleaner limited to exactly those mechanical fixes. Two rules: never overwrite the raw file, and never interpret text — broken syllables and doubtful readings are deferred to the human edition (§4).</w:t>
+      </w:r>
+    </w:p>
+    <w:p>
+      <w:pPr>
+        <w:spacing w:after="120" w:line="252"/>
+        <w:jc w:val="both"/>
+      </w:pPr>
+      <w:r>
+        <w:rPr>
+          <w:b/>
+          <w:bCs/>
+        </w:rPr>
+        <w:t xml:space="preserve">Normalisation.</w:t>
+      </w:r>
+      <w:r>
+        <w:t xml:space="preserve"> </w:t>
+      </w:r>
+      <w:r>
+        <w:rPr>
+          <w:i/>
+          <w:iCs/>
+        </w:rPr>
+        <w:t xml:space="preserve">In/Out:</w:t>
+      </w:r>
+      <w:r>
+        <w:t xml:space="preserve"> none — this is a shared library every later stage calls, not a stage that edits files. Every guarantee the pipeline makes about a quotation is really a claim about </w:t>
       </w:r>
       <w:r>
         <w:rPr>
@@ -3112,26 +3171,76 @@
           <w:b/>
           <w:bCs/>
         </w:rPr>
-        <w:t xml:space="preserve">Segmentation</w:t>
-      </w:r>
-      <w:r>
-        <w:t xml:space="preserve"> turns a cleaned root text into one-stanza-per-paragraph verse with chapter-relative block IDs under a small grammar of Tibetan punctuation, and cuts each commentary into citation-sized blocks by a rule engine over seven lexical boundary cues. What makes the stage safe to run is the no-loss gate in code: if the segmented text differs from the original by one non-whitespace character once whitespace is squeezed out, the script aborts and writes no file. The residue no cue can cut goes to a human, under the stage's stated bias: "Over-long is safer than wrong."</w:t>
-      </w:r>
-    </w:p>
-    <w:p>
-      <w:pPr>
-        <w:spacing w:after="120" w:line="252"/>
-        <w:jc w:val="both"/>
-      </w:pPr>
-      <w:r>
-        <w:rPr>
-          <w:b/>
-          <w:bCs/>
-        </w:rPr>
-        <w:t xml:space="preserve">Structural annotation</w:t>
-      </w:r>
-      <w:r>
-        <w:t xml:space="preserve"> makes each commentary's inline </w:t>
+        <w:t xml:space="preserve">Segmentation.</w:t>
+      </w:r>
+      <w:r>
+        <w:t xml:space="preserve"> </w:t>
+      </w:r>
+      <w:r>
+        <w:rPr>
+          <w:i/>
+          <w:iCs/>
+        </w:rPr>
+        <w:t xml:space="preserve">In:</w:t>
+      </w:r>
+      <w:r>
+        <w:t xml:space="preserve"> the cleaned text. </w:t>
+      </w:r>
+      <w:r>
+        <w:rPr>
+          <w:i/>
+          <w:iCs/>
+        </w:rPr>
+        <w:t xml:space="preserve">Out:</w:t>
+      </w:r>
+      <w:r>
+        <w:t xml:space="preserve"> the same text divided into citable blocks, each ending in a stable block ID — the address every later citation uses. </w:t>
+      </w:r>
+      <w:r>
+        <w:rPr>
+          <w:i/>
+          <w:iCs/>
+        </w:rPr>
+        <w:t xml:space="preserve">How:</w:t>
+      </w:r>
+      <w:r>
+        <w:t xml:space="preserve"> the root text is formatted one stanza per paragraph by a small grammar of Tibetan punctuation (the verse-line separator, the double shad that marks colophons); each commentary is cut into citation-sized blocks by a rule engine over seven lexical boundary cues — terminal particles, quotation openers and closers, enumeration heads, ordinal openers — with verse stanzas detected by their meter and peeled out whole, never re-cut. What makes the stage safe to run is the no-loss gate in code: if the segmented text differs from the original by one non-whitespace character once whitespace is squeezed out, the script aborts and writes no file. The residue no cue can cut goes to a human, under the stage's stated bias: "Over-long is safer than wrong."</w:t>
+      </w:r>
+    </w:p>
+    <w:p>
+      <w:pPr>
+        <w:spacing w:after="120" w:line="252"/>
+        <w:jc w:val="both"/>
+      </w:pPr>
+      <w:r>
+        <w:rPr>
+          <w:b/>
+          <w:bCs/>
+        </w:rPr>
+        <w:t xml:space="preserve">Structural annotation.</w:t>
+      </w:r>
+      <w:r>
+        <w:t xml:space="preserve"> </w:t>
+      </w:r>
+      <w:r>
+        <w:rPr>
+          <w:i/>
+          <w:iCs/>
+        </w:rPr>
+        <w:t xml:space="preserve">In:</w:t>
+      </w:r>
+      <w:r>
+        <w:t xml:space="preserve"> the segmented commentary. </w:t>
+      </w:r>
+      <w:r>
+        <w:rPr>
+          <w:i/>
+          <w:iCs/>
+        </w:rPr>
+        <w:t xml:space="preserve">Out:</w:t>
+      </w:r>
+      <w:r>
+        <w:t xml:space="preserve"> the same file with editorial headings marking the commentary's own inline outline — the </w:t>
       </w:r>
       <w:r>
         <w:rPr>
@@ -3141,7 +3250,17 @@
         <w:t xml:space="preserve">sa-bcad</w:t>
       </w:r>
       <w:r>
-        <w:t xml:space="preserve"> — the topical outline its author announces before elaborating each section — navigable. Editorial headings carry block IDs ending in a reserved zero slot (^1-0, ^1-2-0, …) so a heading ID can never collide with a content ID, and each announced term is wrapped in a wikilink to the heading it announces, so the backlinks pane shows, for any section, every place its structure was announced (§5.10). Detection is </w:t>
+        <w:t xml:space="preserve">, the topical divisions its author announces before elaborating each section. </w:t>
+      </w:r>
+      <w:r>
+        <w:rPr>
+          <w:i/>
+          <w:iCs/>
+        </w:rPr>
+        <w:t xml:space="preserve">How:</w:t>
+      </w:r>
+      <w:r>
+        <w:t xml:space="preserve"> the labour is split by kind. Detection is </w:t>
       </w:r>
       <w:r>
         <w:rPr>
@@ -3151,7 +3270,17 @@
         <w:t xml:space="preserve">model-only</w:t>
       </w:r>
       <w:r>
-        <w:t xml:space="preserve">, the skill forbidding regex extraction on recorded experience that sa-bcad surface variants are too many; rendering is </w:t>
+        <w:t xml:space="preserve"> — the skill forbids regex extraction, on recorded experience that sa-bcad surface variants are too many — and the model's entire job is to </w:t>
+      </w:r>
+      <w:r>
+        <w:rPr>
+          <w:i/>
+          <w:iCs/>
+        </w:rPr>
+        <w:t xml:space="preserve">point</w:t>
+      </w:r>
+      <w:r>
+        <w:t xml:space="preserve"> at lines that already exist, never to retype them. Rendering is </w:t>
       </w:r>
       <w:r>
         <w:rPr>
@@ -3161,17 +3290,7 @@
         <w:t xml:space="preserve">script-only</w:t>
       </w:r>
       <w:r>
-        <w:t xml:space="preserve">, so block IDs are derived from depth by code, wraps are exact substrings, and the result is compared back against the source, raising a "PROSE INTEGRITY VIOLATION" on the first divergent line. </w:t>
-      </w:r>
-      <w:r>
-        <w:rPr>
-          <w:b/>
-          <w:bCs/>
-        </w:rPr>
-        <w:t xml:space="preserve">The model never retypes prose</w:t>
-      </w:r>
-      <w:r>
-        <w:t xml:space="preserve">; it only points at substrings that already exist.</w:t>
+        <w:t xml:space="preserve">: block IDs are derived from outline depth by code, so numbering mistakes are impossible by construction; headings carry IDs ending in a reserved zero slot (^1-0, ^1-2-0, …) so a heading ID can never collide with a content ID; and each announced term is wrapped in a wikilink to the heading it announces, so the backlinks pane shows, for any section, every place its structure was announced (§5.11). The gate compares the result back against the source and raises a "PROSE INTEGRITY VIOLATION" on the first line of prose that changed.</w:t>
       </w:r>
     </w:p>
     <w:p>
@@ -3188,17 +3307,34 @@
         <w:jc w:val="both"/>
       </w:pPr>
       <w:r>
-        <w:t xml:space="preserve">Each commentary then receives a complete nested decimal tree of its </w:t>
-      </w:r>
-      <w:r>
-        <w:rPr>
-          <w:i/>
-          <w:iCs/>
-        </w:rPr>
-        <w:t xml:space="preserve">sa-bcad</w:t>
-      </w:r>
-      <w:r>
-        <w:t xml:space="preserve"> — the scaffold claims extraction, spine mapping and consolidation all lean on. Extraction is staged in five isolated passes (chunk, extract candidates, copy the enumeration announcements verbatim, build, check) rather than written as one prompt, on a finding about prompt design: the candidate-extraction call never sees the tree-building instructions and so cannot drift into tree-building, the verbatim-copy call never sees the "interpret and reconcile" instructions and so stays literal, and merging the jobs collapses that isolation and drops precision. Tree building treats the author's own enumerations as </w:t>
+        <w:rPr>
+          <w:i/>
+          <w:iCs/>
+        </w:rPr>
+        <w:t xml:space="preserve">In:</w:t>
+      </w:r>
+      <w:r>
+        <w:t xml:space="preserve"> one commentary file. </w:t>
+      </w:r>
+      <w:r>
+        <w:rPr>
+          <w:i/>
+          <w:iCs/>
+        </w:rPr>
+        <w:t xml:space="preserve">Out:</w:t>
+      </w:r>
+      <w:r>
+        <w:t xml:space="preserve"> its complete nested decimal outline — every sa-bcad node, numbered, each carrying a line pointer into the source — the scaffold claims extraction, spine mapping and consolidation all lean on. </w:t>
+      </w:r>
+      <w:r>
+        <w:rPr>
+          <w:i/>
+          <w:iCs/>
+        </w:rPr>
+        <w:t xml:space="preserve">How:</w:t>
+      </w:r>
+      <w:r>
+        <w:t xml:space="preserve"> extraction is staged in five isolated passes (chunk, extract candidates, copy the enumeration announcements verbatim, build, check) rather than written as one prompt, on a finding about prompt design: the candidate-extraction call never sees the tree-building instructions and so cannot drift into tree-building, the verbatim-copy call never sees the "interpret and reconcile" instructions and so stays literal, and merging the jobs collapses that isolation and drops precision. Tree building treats the author's own enumerations as </w:t>
       </w:r>
       <w:r>
         <w:rPr>
@@ -3254,7 +3390,34 @@
         <w:jc w:val="both"/>
       </w:pPr>
       <w:r>
-        <w:t xml:space="preserve">Two mechanisms, deliberately ordered — deterministic first, because alignment errors are silent: a verse anchored to the wrong span produces a citation that looks perfectly well-formed and is simply wrong. Deterministic matching can fail to find a verse, but it cannot invent a location. Where a commentary quotes the stanza, a </w:t>
+        <w:rPr>
+          <w:i/>
+          <w:iCs/>
+        </w:rPr>
+        <w:t xml:space="preserve">In:</w:t>
+      </w:r>
+      <w:r>
+        <w:t xml:space="preserve"> the root text and each commentary, both segmented and block-addressed. </w:t>
+      </w:r>
+      <w:r>
+        <w:rPr>
+          <w:i/>
+          <w:iCs/>
+        </w:rPr>
+        <w:t xml:space="preserve">Out:</w:t>
+      </w:r>
+      <w:r>
+        <w:t xml:space="preserve"> for every root stanza, the commentary passage that explains it — recorded as an anchor line in the commentary file itself where the stanza is quoted, and as machine-readable span records for the rest. </w:t>
+      </w:r>
+      <w:r>
+        <w:rPr>
+          <w:i/>
+          <w:iCs/>
+        </w:rPr>
+        <w:t xml:space="preserve">How:</w:t>
+      </w:r>
+      <w:r>
+        <w:t xml:space="preserve"> two mechanisms, deliberately ordered — deterministic first, because alignment errors are silent: a verse anchored to the wrong span produces a citation that looks perfectly well-formed and is simply wrong. Deterministic matching can fail to find a verse, but it cannot invent a location. Where a commentary quotes the stanza, a </w:t>
       </w:r>
       <w:r>
         <w:rPr>
@@ -3338,7 +3501,445 @@
         <w:pStyle w:val="Heading2"/>
       </w:pPr>
       <w:r>
-        <w:t xml:space="preserve">5.4 Claims extraction</w:t>
+        <w:t xml:space="preserve">5.4 Choosing the subjects: the keyword chain</w:t>
+      </w:r>
+    </w:p>
+    <w:p>
+      <w:pPr>
+        <w:spacing w:after="120" w:line="252"/>
+        <w:jc w:val="both"/>
+      </w:pPr>
+      <w:r>
+        <w:t xml:space="preserve">Which subjects get articles is itself a pipeline, run after ingest and governed by one boundary rule: keywords </w:t>
+      </w:r>
+      <w:r>
+        <w:rPr>
+          <w:i/>
+          <w:iCs/>
+        </w:rPr>
+        <w:t xml:space="preserve">select and order</w:t>
+      </w:r>
+      <w:r>
+        <w:t xml:space="preserve"> the article queue; they never define what the claims layer records. A high-scoring term with no claims behind it is a finding, not an article. The chain's design slogan is </w:t>
+      </w:r>
+      <w:r>
+        <w:rPr>
+          <w:b/>
+          <w:bCs/>
+        </w:rPr>
+        <w:t xml:space="preserve">detect in English, measure in Tibetan</w:t>
+      </w:r>
+      <w:r>
+        <w:t xml:space="preserve"> — Tibetan is written without word boundaries (the tsheg separates syllables, not words), so standard keyword statistics cannot run on it directly, but </w:t>
+      </w:r>
+      <w:r>
+        <w:rPr>
+          <w:i/>
+          <w:iCs/>
+        </w:rPr>
+        <w:t xml:space="preserve">counting a known string</w:t>
+      </w:r>
+      <w:r>
+        <w:t xml:space="preserve"> needs no word segmentation at all. So English is used only to discover what the candidate terms are, and every measurement that matters is then made on the Tibetan side, where the truth lives.</w:t>
+      </w:r>
+    </w:p>
+    <w:p>
+      <w:pPr>
+        <w:spacing w:after="120" w:line="252"/>
+        <w:jc w:val="both"/>
+      </w:pPr>
+      <w:r>
+        <w:rPr>
+          <w:b/>
+          <w:bCs/>
+        </w:rPr>
+        <w:t xml:space="preserve">Finding candidates.</w:t>
+      </w:r>
+      <w:r>
+        <w:t xml:space="preserve"> </w:t>
+      </w:r>
+      <w:r>
+        <w:rPr>
+          <w:i/>
+          <w:iCs/>
+        </w:rPr>
+        <w:t xml:space="preserve">In:</w:t>
+      </w:r>
+      <w:r>
+        <w:t xml:space="preserve"> the Tibetan root text. </w:t>
+      </w:r>
+      <w:r>
+        <w:rPr>
+          <w:i/>
+          <w:iCs/>
+        </w:rPr>
+        <w:t xml:space="preserve">Out:</w:t>
+      </w:r>
+      <w:r>
+        <w:t xml:space="preserve"> a registry of unique Tibetan terms. </w:t>
+      </w:r>
+      <w:r>
+        <w:rPr>
+          <w:i/>
+          <w:iCs/>
+        </w:rPr>
+        <w:t xml:space="preserve">How:</w:t>
+      </w:r>
+      <w:r>
+        <w:t xml:space="preserve"> a deliberately </w:t>
+      </w:r>
+      <w:r>
+        <w:rPr>
+          <w:i/>
+          <w:iCs/>
+        </w:rPr>
+        <w:t xml:space="preserve">literal</w:t>
+      </w:r>
+      <w:r>
+        <w:t xml:space="preserve"> English translation is generated verse by verse, every block ID kept in place — literal because published translations paraphrase, and a keyword absent in English is not absent in Tibetan. Standard keyword tools then run over the English (one pass treating each verse as its own document, one pass against a general-English reference corpus), yielding a generous candidate pool. For each English candidate, a model opens the same-numbered Tibetan block and identifies the exact Tibetan span it translates; the results are regrouped by Tibetan term, merging spelling variants. This per-occurrence mapping fixes the two ways translation statistics lie: one Tibetan term split across several English renderings (its count divided, its rank sunk) and two distinct Tibetan terms merged under one English word. </w:t>
+      </w:r>
+      <w:r>
+        <w:rPr>
+          <w:b/>
+          <w:bCs/>
+        </w:rPr>
+        <w:t xml:space="preserve">Numbers:</w:t>
+      </w:r>
+      <w:r>
+        <w:t xml:space="preserve"> 193 + 313 English candidates → 367 unique Tibetan terms.</w:t>
+      </w:r>
+    </w:p>
+    <w:p>
+      <w:pPr>
+        <w:spacing w:after="120" w:line="252"/>
+        <w:jc w:val="both"/>
+      </w:pPr>
+      <w:r>
+        <w:rPr>
+          <w:b/>
+          <w:bCs/>
+        </w:rPr>
+        <w:t xml:space="preserve">Scoring: attention beats presence.</w:t>
+      </w:r>
+      <w:r>
+        <w:t xml:space="preserve"> </w:t>
+      </w:r>
+      <w:r>
+        <w:rPr>
+          <w:i/>
+          <w:iCs/>
+        </w:rPr>
+        <w:t xml:space="preserve">In:</w:t>
+      </w:r>
+      <w:r>
+        <w:t xml:space="preserve"> the term registry, the claims files (§5.5), the structural trees. </w:t>
+      </w:r>
+      <w:r>
+        <w:rPr>
+          <w:i/>
+          <w:iCs/>
+        </w:rPr>
+        <w:t xml:space="preserve">Out:</w:t>
+      </w:r>
+      <w:r>
+        <w:t xml:space="preserve"> a ranked list, every signal and weight recorded. </w:t>
+      </w:r>
+      <w:r>
+        <w:rPr>
+          <w:i/>
+          <w:iCs/>
+        </w:rPr>
+        <w:t xml:space="preserve">How:</w:t>
+      </w:r>
+      <w:r>
+        <w:t xml:space="preserve"> raw frequency cannot separate a grammatical particle (frequent everywhere, meaning nothing) from a doctrinal term, so three signal classes are combined, and mere presence is deliberately the weakest. The dominant signal is </w:t>
+      </w:r>
+      <w:r>
+        <w:rPr>
+          <w:b/>
+          <w:bCs/>
+        </w:rPr>
+        <w:t xml:space="preserve">attention</w:t>
+      </w:r>
+      <w:r>
+        <w:t xml:space="preserve">: how many claims are </w:t>
+      </w:r>
+      <w:r>
+        <w:rPr>
+          <w:i/>
+          <w:iCs/>
+        </w:rPr>
+        <w:t xml:space="preserve">about</w:t>
+      </w:r>
+      <w:r>
+        <w:t xml:space="preserve"> the term, across how many commentaries. Next is </w:t>
+      </w:r>
+      <w:r>
+        <w:rPr>
+          <w:b/>
+          <w:bCs/>
+        </w:rPr>
+        <w:t xml:space="preserve">structure</w:t>
+      </w:r>
+      <w:r>
+        <w:t xml:space="preserve">: whether the term appears in section titles, and whether commentaries explicitly define it. Last, as a tie-breaker only, </w:t>
+      </w:r>
+      <w:r>
+        <w:rPr>
+          <w:b/>
+          <w:bCs/>
+        </w:rPr>
+        <w:t xml:space="preserve">presence</w:t>
+      </w:r>
+      <w:r>
+        <w:t xml:space="preserve">: the term's frequency, counted in the commentators' own prose with root-text quotations excluded — a commentary that quotes the verse inflates every word in it. The validation is empirical: before the attention signal, Tibetan intensifier particles sat in the top 20; after it, none survives into the top 60.</w:t>
+      </w:r>
+    </w:p>
+    <w:p>
+      <w:pPr>
+        <w:spacing w:after="120" w:line="252"/>
+        <w:jc w:val="both"/>
+      </w:pPr>
+      <w:r>
+        <w:rPr>
+          <w:b/>
+          <w:bCs/>
+        </w:rPr>
+        <w:t xml:space="preserve">The viability gate.</w:t>
+      </w:r>
+      <w:r>
+        <w:t xml:space="preserve"> </w:t>
+      </w:r>
+      <w:r>
+        <w:rPr>
+          <w:i/>
+          <w:iCs/>
+        </w:rPr>
+        <w:t xml:space="preserve">In:</w:t>
+      </w:r>
+      <w:r>
+        <w:t xml:space="preserve"> the ranked registry. </w:t>
+      </w:r>
+      <w:r>
+        <w:rPr>
+          <w:i/>
+          <w:iCs/>
+        </w:rPr>
+        <w:t xml:space="preserve">Out:</w:t>
+      </w:r>
+      <w:r>
+        <w:t xml:space="preserve"> the article queue. </w:t>
+      </w:r>
+      <w:r>
+        <w:rPr>
+          <w:i/>
+          <w:iCs/>
+        </w:rPr>
+        <w:t xml:space="preserve">How:</w:t>
+      </w:r>
+      <w:r>
+        <w:t xml:space="preserve"> a mechanical cutoff, calibrated once and frozen so the selection is reproducible rather than re-argued per run: a term enters the queue only if at least half the commentaries engage it </w:t>
+      </w:r>
+      <w:r>
+        <w:rPr>
+          <w:i/>
+          <w:iCs/>
+        </w:rPr>
+        <w:t xml:space="preserve">and</w:t>
+      </w:r>
+      <w:r>
+        <w:t xml:space="preserve"> at least 20 claims are about it — because consolidation shrinks many raw claims into each cited statement, 20 claims is roughly a lead plus two or three cited sections. Terms that fail stay in the registry as glossary candidates; nothing is deleted. </w:t>
+      </w:r>
+      <w:r>
+        <w:rPr>
+          <w:b/>
+          <w:bCs/>
+        </w:rPr>
+        <w:t xml:space="preserve">Numbers: 114 of 367 terms pass.</w:t>
+      </w:r>
+    </w:p>
+    <w:p>
+      <w:pPr>
+        <w:spacing w:after="120" w:line="252"/>
+        <w:jc w:val="both"/>
+      </w:pPr>
+      <w:r>
+        <w:rPr>
+          <w:b/>
+          <w:bCs/>
+        </w:rPr>
+        <w:t xml:space="preserve">From terms to subjects.</w:t>
+      </w:r>
+      <w:r>
+        <w:t xml:space="preserve"> </w:t>
+      </w:r>
+      <w:r>
+        <w:rPr>
+          <w:i/>
+          <w:iCs/>
+        </w:rPr>
+        <w:t xml:space="preserve">In:</w:t>
+      </w:r>
+      <w:r>
+        <w:t xml:space="preserve"> the 114-term queue. </w:t>
+      </w:r>
+      <w:r>
+        <w:rPr>
+          <w:i/>
+          <w:iCs/>
+        </w:rPr>
+        <w:t xml:space="preserve">Out:</w:t>
+      </w:r>
+      <w:r>
+        <w:t xml:space="preserve"> a classified subject list, every verdict carrying a recorded one-line reason. </w:t>
+      </w:r>
+      <w:r>
+        <w:rPr>
+          <w:i/>
+          <w:iCs/>
+        </w:rPr>
+        <w:t xml:space="preserve">How:</w:t>
+      </w:r>
+      <w:r>
+        <w:t xml:space="preserve"> a model pass first merges queue rows that are the same subject under spelling or grammatical variants (never merging doctrinally distinct terms, however close — when in doubt, don't, and flag it), then classifies each subject: </w:t>
+      </w:r>
+      <w:r>
+        <w:rPr>
+          <w:b/>
+          <w:bCs/>
+        </w:rPr>
+        <w:t xml:space="preserve">standalone</w:t>
+      </w:r>
+      <w:r>
+        <w:t xml:space="preserve"> (a general encyclopedia would give it its own entry), </w:t>
+      </w:r>
+      <w:r>
+        <w:rPr>
+          <w:b/>
+          <w:bCs/>
+        </w:rPr>
+        <w:t xml:space="preserve">section-material</w:t>
+      </w:r>
+      <w:r>
+        <w:t xml:space="preserve"> (an attribute or implement whose claims really describe another subject — it must name its target), or </w:t>
+      </w:r>
+      <w:r>
+        <w:rPr>
+          <w:b/>
+          <w:bCs/>
+        </w:rPr>
+        <w:t xml:space="preserve">glossary</w:t>
+      </w:r>
+      <w:r>
+        <w:t xml:space="preserve">. The rule is to judge subjecthood, not material volume: a 100-claim body part is still section material; a 20-claim deity is still standalone. The gate is </w:t>
+      </w:r>
+      <w:r>
+        <w:rPr>
+          <w:i/>
+          <w:iCs/>
+        </w:rPr>
+        <w:t xml:space="preserve">conservation of terms</w:t>
+      </w:r>
+      <w:r>
+        <w:t xml:space="preserve">: the four verdict classes must sum exactly to the input count, every term appearing exactly once — a term lost or double-counted is a hard failure. </w:t>
+      </w:r>
+      <w:r>
+        <w:rPr>
+          <w:b/>
+          <w:bCs/>
+        </w:rPr>
+        <w:t xml:space="preserve">Numbers: 44 standalone + 47 section-material + 10 glossary + 13 merged = 114/114.</w:t>
+      </w:r>
+    </w:p>
+    <w:p>
+      <w:pPr>
+        <w:spacing w:after="120" w:line="252"/>
+        <w:jc w:val="both"/>
+      </w:pPr>
+      <w:r>
+        <w:rPr>
+          <w:b/>
+          <w:bCs/>
+        </w:rPr>
+        <w:t xml:space="preserve">What already exists on the wiki.</w:t>
+      </w:r>
+      <w:r>
+        <w:t xml:space="preserve"> </w:t>
+      </w:r>
+      <w:r>
+        <w:rPr>
+          <w:i/>
+          <w:iCs/>
+        </w:rPr>
+        <w:t xml:space="preserve">In:</w:t>
+      </w:r>
+      <w:r>
+        <w:t xml:space="preserve"> the 44 standalone subjects. </w:t>
+      </w:r>
+      <w:r>
+        <w:rPr>
+          <w:i/>
+          <w:iCs/>
+        </w:rPr>
+        <w:t xml:space="preserve">Out:</w:t>
+      </w:r>
+      <w:r>
+        <w:t xml:space="preserve"> a per-subject verdict, </w:t>
+      </w:r>
+      <w:r>
+        <w:rPr>
+          <w:i/>
+          <w:iCs/>
+        </w:rPr>
+        <w:t xml:space="preserve">create</w:t>
+      </w:r>
+      <w:r>
+        <w:t xml:space="preserve"> or </w:t>
+      </w:r>
+      <w:r>
+        <w:rPr>
+          <w:i/>
+          <w:iCs/>
+        </w:rPr>
+        <w:t xml:space="preserve">update</w:t>
+      </w:r>
+      <w:r>
+        <w:t xml:space="preserve">, with dated snapshots of every existing article. </w:t>
+      </w:r>
+      <w:r>
+        <w:rPr>
+          <w:i/>
+          <w:iCs/>
+        </w:rPr>
+        <w:t xml:space="preserve">How:</w:t>
+      </w:r>
+      <w:r>
+        <w:t xml:space="preserve"> both lookups always run against the live wiki — title search with redirects and spelling variants, and a structured-data search checking for a Tibetan-Wikipedia sitelink — because existence is the fact that chooses between the pipeline's create path and its update path, and the editorial rule fixed with the human contributor is </w:t>
+      </w:r>
+      <w:r>
+        <w:rPr>
+          <w:i/>
+          <w:iCs/>
+        </w:rPr>
+        <w:t xml:space="preserve">one subject, one article</w:t>
+      </w:r>
+      <w:r>
+        <w:t xml:space="preserve">: existing articles are updated with cited sections, never forked. If the live wiki cannot be reached, the step stops rather than guess. </w:t>
+      </w:r>
+      <w:r>
+        <w:rPr>
+          <w:b/>
+          <w:bCs/>
+        </w:rPr>
+        <w:t xml:space="preserve">Numbers: 25 update, 19 create, 0 unresolved.</w:t>
+      </w:r>
+    </w:p>
+    <w:p>
+      <w:pPr>
+        <w:pStyle w:val="Heading2"/>
+      </w:pPr>
+      <w:r>
+        <w:t xml:space="preserve">5.5 Claims extraction</w:t>
       </w:r>
     </w:p>
     <w:p>
@@ -3376,6 +3977,82 @@
         <w:jc w:val="both"/>
       </w:pPr>
       <w:r>
+        <w:rPr>
+          <w:i/>
+          <w:iCs/>
+        </w:rPr>
+        <w:t xml:space="preserve">In:</w:t>
+      </w:r>
+      <w:r>
+        <w:t xml:space="preserve"> one commentary and its QC-clean structural tree (§5.2) — never another commentary, never an earlier extraction. </w:t>
+      </w:r>
+      <w:r>
+        <w:rPr>
+          <w:i/>
+          <w:iCs/>
+        </w:rPr>
+        <w:t xml:space="preserve">Out:</w:t>
+      </w:r>
+      <w:r>
+        <w:t xml:space="preserve"> one claims file per commentary — every distinct claim it makes, one section per tree node, each claim carrying verbatim Tibetan, an English gloss, a type, a referent, and a block-level citation. </w:t>
+      </w:r>
+      <w:r>
+        <w:rPr>
+          <w:i/>
+          <w:iCs/>
+        </w:rPr>
+        <w:t xml:space="preserve">How:</w:t>
+      </w:r>
+      <w:r>
+        <w:t xml:space="preserve"> the orchestrator computes each tree node's reading window (from its own line pointer to the next node's), and sends </w:t>
+      </w:r>
+      <w:r>
+        <w:rPr>
+          <w:b/>
+          <w:bCs/>
+        </w:rPr>
+        <w:t xml:space="preserve">one isolated model call per node</w:t>
+      </w:r>
+      <w:r>
+        <w:t xml:space="preserve">, each seeing only the extraction rules, its own window, and its own node title. Isolation makes the guards structural rather than disciplinary: a call that only ever sees one node's text </w:t>
+      </w:r>
+      <w:r>
+        <w:rPr>
+          <w:i/>
+          <w:iCs/>
+        </w:rPr>
+        <w:t xml:space="preserve">cannot</w:t>
+      </w:r>
+      <w:r>
+        <w:t xml:space="preserve"> file a claim under the wrong node, </w:t>
+      </w:r>
+      <w:r>
+        <w:rPr>
+          <w:i/>
+          <w:iCs/>
+        </w:rPr>
+        <w:t xml:space="preserve">cannot</w:t>
+      </w:r>
+      <w:r>
+        <w:t xml:space="preserve"> re-bucket an earlier extraction it was never given, and </w:t>
+      </w:r>
+      <w:r>
+        <w:rPr>
+          <w:i/>
+          <w:iCs/>
+        </w:rPr>
+        <w:t xml:space="preserve">cannot</w:t>
+      </w:r>
+      <w:r>
+        <w:t xml:space="preserve"> import content from another commentary — each a documented failure of earlier, less isolated method runs. The orchestrator assembles the replies in tree order, computes the claim count by counting, and runs the deterministic checker.</w:t>
+      </w:r>
+    </w:p>
+    <w:p>
+      <w:pPr>
+        <w:spacing w:after="120" w:line="252"/>
+        <w:jc w:val="both"/>
+      </w:pPr>
+      <w:r>
         <w:t xml:space="preserve">Three extraction methods were compared: a one-pass inventory under nine fixed categories; a re-bucketing of an existing extraction under the commentary's own tree; and a fresh extraction guided node-by-node by the tree. The negative findings are why the third is now the standard: the re-bucketed run was not an independent extraction at all — </w:t>
       </w:r>
       <w:r>
@@ -3433,16 +4110,53 @@
         <w:pStyle w:val="Heading2"/>
       </w:pPr>
       <w:r>
-        <w:t xml:space="preserve">5.5 Spine maps</w:t>
-      </w:r>
-    </w:p>
-    <w:p>
-      <w:pPr>
-        <w:spacing w:after="120" w:line="252"/>
-        <w:jc w:val="both"/>
-      </w:pPr>
-      <w:r>
-        <w:t xml:space="preserve">Consolidation needs to know, for every commentary, which of its own tree nodes hold which canonical slot of the root text. Answering that inside every topic run, as the pilot did, is quadratic in the wrong variable: sixteen commentaries × ~22 slots implied roughly 400 full-file reads of an unchanged 3.8 MB corpus. The fix is a routing index, one small table per commentary, built once and reused, which records addresses and never interpretation. Node numbering is never assumed uniform — one commentary nests a homage at 1.1.N, another at top level N, another titles nodes by epithet, another runs all twenty-one homages inside one undivided node — so a rule that worked for the last commentary is evidence of nothing about this one, and that hard case is routed instead by </w:t>
+        <w:t xml:space="preserve">5.6 Spine maps</w:t>
+      </w:r>
+    </w:p>
+    <w:p>
+      <w:pPr>
+        <w:spacing w:after="120" w:line="252"/>
+        <w:jc w:val="both"/>
+      </w:pPr>
+      <w:r>
+        <w:rPr>
+          <w:i/>
+          <w:iCs/>
+        </w:rPr>
+        <w:t xml:space="preserve">In:</w:t>
+      </w:r>
+      <w:r>
+        <w:t xml:space="preserve"> one commentary's tree, the heading lines of its claims file, the root text, and the registry of canonical topic slots (one per homage stanza, plus the benefits section and two observed global slots — 24 in all). </w:t>
+      </w:r>
+      <w:r>
+        <w:rPr>
+          <w:i/>
+          <w:iCs/>
+        </w:rPr>
+        <w:t xml:space="preserve">Out:</w:t>
+      </w:r>
+      <w:r>
+        <w:t xml:space="preserve"> one small routing table per commentary: which of its own tree nodes hold which slot's content, with </w:t>
+      </w:r>
+      <w:r>
+        <w:rPr>
+          <w:b/>
+          <w:bCs/>
+        </w:rPr>
+        <w:t xml:space="preserve">exactly one disposition for every claim</w:t>
+      </w:r>
+      <w:r>
+        <w:t xml:space="preserve">. </w:t>
+      </w:r>
+      <w:r>
+        <w:rPr>
+          <w:i/>
+          <w:iCs/>
+        </w:rPr>
+        <w:t xml:space="preserve">How and why:</w:t>
+      </w:r>
+      <w:r>
+        <w:t xml:space="preserve"> consolidation needs to know, for every commentary, which of its own tree nodes hold which canonical slot of the root text. Answering that inside every topic run, as the pilot did, is quadratic in the wrong variable: sixteen commentaries × ~22 slots implied roughly 400 full-file reads of an unchanged 3.8 MB corpus. The fix is a routing index, one small table per commentary, built once and reused, which records addresses and never interpretation. Node numbering is never assumed uniform — one commentary nests a homage at 1.1.N, another at top level N, another titles nodes by epithet, another runs all twenty-one homages inside one undivided node — so a rule that worked for the last commentary is evidence of nothing about this one, and that hard case is routed instead by </w:t>
       </w:r>
       <w:r>
         <w:rPr>
@@ -3470,7 +4184,7 @@
         <w:pStyle w:val="Heading2"/>
       </w:pPr>
       <w:r>
-        <w:t xml:space="preserve">5.6 Packet assembly, question generation, and consolidation</w:t>
+        <w:t xml:space="preserve">5.7 Packet assembly, question generation, and consolidation</w:t>
       </w:r>
     </w:p>
     <w:p>
@@ -3486,7 +4200,37 @@
         <w:t xml:space="preserve">Packet assembly is a script, not a model.</w:t>
       </w:r>
       <w:r>
-        <w:t xml:space="preserve"> For one topic slot it collects the routed claims out of every commentary's raw file, copying each claim block </w:t>
+        <w:t xml:space="preserve"> </w:t>
+      </w:r>
+      <w:r>
+        <w:rPr>
+          <w:i/>
+          <w:iCs/>
+        </w:rPr>
+        <w:t xml:space="preserve">In:</w:t>
+      </w:r>
+      <w:r>
+        <w:t xml:space="preserve"> one topic slot; the claims files; the spine maps. </w:t>
+      </w:r>
+      <w:r>
+        <w:rPr>
+          <w:i/>
+          <w:iCs/>
+        </w:rPr>
+        <w:t xml:space="preserve">Out:</w:t>
+      </w:r>
+      <w:r>
+        <w:t xml:space="preserve"> a single packet holding every claim routed to that slot, plus a manifest of every claim ID included. </w:t>
+      </w:r>
+      <w:r>
+        <w:rPr>
+          <w:i/>
+          <w:iCs/>
+        </w:rPr>
+        <w:t xml:space="preserve">How:</w:t>
+      </w:r>
+      <w:r>
+        <w:t xml:space="preserve"> the script collects the routed claims out of every commentary's raw file, copying each claim block </w:t>
       </w:r>
       <w:r>
         <w:rPr>
@@ -3496,7 +4240,7 @@
         <w:t xml:space="preserve">character-for-character</w:t>
       </w:r>
       <w:r>
-        <w:t xml:space="preserve"> — a script cannot introduce a transcription error — and emits a manifest of every claim ID included. Two hard errors are loud by design: a commentary with no disposition for the slot aborts the build, and so does a commentary with a claims file but no spine map, because it would otherwise be silently absent from every topic page.</w:t>
+        <w:t xml:space="preserve"> — a script cannot introduce a transcription error — and emits the manifest that the later coverage check diffs against. Two hard errors are loud by design: a commentary with no disposition for the slot aborts the build, and so does a commentary with a claims file but no spine map, because it would otherwise be silently absent from every topic page.</w:t>
       </w:r>
     </w:p>
     <w:p>
@@ -3588,14 +4332,14 @@
         <w:t xml:space="preserve">coverage check</w:t>
       </w:r>
       <w:r>
-        <w:t xml:space="preserve"> compares the packet manifest against every claim ID the page cites; every claim in the gap is either folded in or logged with a one-line reason — no third state. In the pilot this caught real gaps in roughly 5–12% of a topic's mapped claims per page. </w:t>
-      </w:r>
-      <w:r>
-        <w:rPr>
-          <w:b/>
-          <w:bCs/>
-        </w:rPr>
-        <w:t xml:space="preserve">State on disk: 24 consolidated topic pages, all status: draft.</w:t>
+        <w:t xml:space="preserve"> compares the packet manifest against every claim ID the page cites; every claim in the gap is either folded in or logged with a one-line reason — no third state. In the pilot this caught real gaps in roughly 5–12% of a topic's mapped claims per page. Consolidation ran at two scales: the 24 slot topics of the root text's own structure, and — after the subject chain of §5.4 delivered its queue — the keyword subjects, consolidated by the same skill under the same gates. </w:t>
+      </w:r>
+      <w:r>
+        <w:rPr>
+          <w:b/>
+          <w:bCs/>
+        </w:rPr>
+        <w:t xml:space="preserve">State on disk: 67 consolidated topic pages (24 slot + 43 term), all status: draft.</w:t>
       </w:r>
     </w:p>
     <w:p>
@@ -3603,7 +4347,7 @@
         <w:pStyle w:val="Heading2"/>
       </w:pPr>
       <w:r>
-        <w:t xml:space="preserve">5.7 The consolidation audits</w:t>
+        <w:t xml:space="preserve">5.8 The consolidation audits</w:t>
       </w:r>
     </w:p>
     <w:p>
@@ -3696,19 +4440,38 @@
     </w:p>
     <w:p>
       <w:pPr>
+        <w:spacing w:after="120" w:line="252"/>
+        <w:jc w:val="both"/>
+      </w:pPr>
+      <w:r>
+        <w:t xml:space="preserve">The batch confirmed the division of labour the hard way. On the first two keyword pages audited, </w:t>
+      </w:r>
+      <w:r>
+        <w:rPr>
+          <w:b/>
+          <w:bCs/>
+        </w:rPr>
+        <w:t xml:space="preserve">every quotation was character-perfect and Gate 2 still found four critical defects</w:t>
+      </w:r>
+      <w:r>
+        <w:t xml:space="preserve">: a divergence manufactured out of English-gloss noise over identical Tibetan, an inverted corpus fact, a citation corroborating content it does not contain, and a uniqueness claim pinned to the wrong claim ID. The deterministic gate reads characters; the audit reads meaning; neither replaces the other, and a clean quote check is never, by itself, publication-ready.</w:t>
+      </w:r>
+    </w:p>
+    <w:p>
+      <w:pPr>
         <w:pStyle w:val="Heading2"/>
       </w:pPr>
       <w:r>
-        <w:t xml:space="preserve">5.8 Article generation</w:t>
-      </w:r>
-    </w:p>
-    <w:p>
-      <w:pPr>
-        <w:spacing w:after="120" w:line="252"/>
-        <w:jc w:val="both"/>
-      </w:pPr>
-      <w:r>
-        <w:t xml:space="preserve">Term and topic selection precede drafting and are a human gate: candidate terms were machine-proposed by corpus keyness (frequency × distribution across the sixteen commentaries) and marked as candidates in the term registry, which records who or what proposed each entry; no human has yet approved the list. Two drafting routes share one doctrine — </w:t>
+        <w:t xml:space="preserve">5.9 Article generation</w:t>
+      </w:r>
+    </w:p>
+    <w:p>
+      <w:pPr>
+        <w:spacing w:after="120" w:line="252"/>
+        <w:jc w:val="both"/>
+      </w:pPr>
+      <w:r>
+        <w:t xml:space="preserve">Subjects arrive from the selection chain of §5.4 and stay marked as machine-proposed in the registry, which records who or what proposed each entry. Under the project's review-at-end governance there is no human sign-off mid-chain; instead every judgment step leaves a full audit trail — per-term verdicts with reasons, merge mappings — so the single human review over finished articles can reject selectively rather than rerun the pipeline. Two drafting routes share one doctrine — </w:t>
       </w:r>
       <w:r>
         <w:rPr>
@@ -3718,7 +4481,7 @@
         <w:t xml:space="preserve">claims-only drafting</w:t>
       </w:r>
       <w:r>
-        <w:t xml:space="preserve"> — and one gate (§5.9).</w:t>
+        <w:t xml:space="preserve"> — and one gate (§5.10).</w:t>
       </w:r>
     </w:p>
     <w:p>
@@ -3734,7 +4497,27 @@
         <w:t xml:space="preserve">Route A: the per-term chain</w:t>
       </w:r>
       <w:r>
-        <w:t xml:space="preserve"> (extract → claims → outline → draft → audit) produced the audited pilot's three articles (སྒྲོལ་མ "Tārā"; འཇིག་རྟེན་གསུམ "the three worlds"; སྡུག་བསྔལ "suffering"). The extraction prompt is written in Tibetan, and the first of its seven rules is the contract: quote character-for-character (ཡི་གེ་གཅིག་ཀྱང་བསྒྱུར་བ་དང་། བསྡུ་བ་དང་། ཚིག་སྒྱུར་བྱེད་མི་ཆོག — "not one letter may be changed, condensed, or paraphrased"), with the warning that a machine will check every letter. The rest take only passages that </w:t>
+        <w:t xml:space="preserve"> (extract → claims → outline → draft → audit) produced the audited pilot's three articles (སྒྲོལ་མ "Tārā"; འཇིག་རྟེན་གསུམ "the three worlds"; སྡུག་བསྔལ "suffering"). </w:t>
+      </w:r>
+      <w:r>
+        <w:rPr>
+          <w:i/>
+          <w:iCs/>
+        </w:rPr>
+        <w:t xml:space="preserve">In:</w:t>
+      </w:r>
+      <w:r>
+        <w:t xml:space="preserve"> one term and the aligned corpus. </w:t>
+      </w:r>
+      <w:r>
+        <w:rPr>
+          <w:i/>
+          <w:iCs/>
+        </w:rPr>
+        <w:t xml:space="preserve">Out:</w:t>
+      </w:r>
+      <w:r>
+        <w:t xml:space="preserve"> one artifact per stage — extracted passages, the claims table, an outline, the drafted wikitext, an audit report — every stage's model and prompt version pinned in a per-article record. The extraction prompt is written in Tibetan, and the first of its seven rules is the contract: quote character-for-character (ཡི་གེ་གཅིག་ཀྱང་བསྒྱུར་བ་དང་། བསྡུ་བ་དང་། ཚིག་སྒྱུར་བྱེད་མི་ཆོག — "not one letter may be changed, condensed, or paraphrased"), with the warning that a machine will check every letter. The rest take only passages that </w:t>
       </w:r>
       <w:r>
         <w:rPr>
@@ -3845,7 +4628,173 @@
         <w:t xml:space="preserve">Route B: articles from consolidated pages</w:t>
       </w:r>
       <w:r>
-        <w:t xml:space="preserve"> — the route behind the three per-homage articles drafted so far. The consolidated page supplies the facts, the raw claims files the verbatim Tibetan and the block citations, and parametric knowledge nothing: no dates, Sanskrit forms, iconographic details or doctrinal framing that is not in a claim, however standard they seem. The resolution chain is fixed (consolidated attestation → raw claim → Tibetan text + block citation), and an attestation that does not resolve is dropped and logged, never guessed. Each article ships with a citation trail — named reference → commentary → claim IDs → verbatim Tibetan → source blocks, the provenance chain of every footnote in one table — plus a per-quotation verification table.</w:t>
+        <w:t xml:space="preserve"> — the route that ran at corpus scale. </w:t>
+      </w:r>
+      <w:r>
+        <w:rPr>
+          <w:i/>
+          <w:iCs/>
+        </w:rPr>
+        <w:t xml:space="preserve">In:</w:t>
+      </w:r>
+      <w:r>
+        <w:t xml:space="preserve"> one consolidated topic page (the facts) plus the raw claims files it cites (the verbatim Tibetan and block citations) plus the wikitext output contract. </w:t>
+      </w:r>
+      <w:r>
+        <w:rPr>
+          <w:i/>
+          <w:iCs/>
+        </w:rPr>
+        <w:t xml:space="preserve">Out:</w:t>
+      </w:r>
+      <w:r>
+        <w:t xml:space="preserve"> two files per article — the article itself, as publishable wikitext inside a fenced markdown file the reviewer can read and edit in the vault, and a citation trail: named reference → commentary → claim IDs → verbatim Tibetan → source blocks, the provenance chain of every footnote in one table, plus a per-quotation verification table. </w:t>
+      </w:r>
+      <w:r>
+        <w:rPr>
+          <w:i/>
+          <w:iCs/>
+        </w:rPr>
+        <w:t xml:space="preserve">How:</w:t>
+      </w:r>
+      <w:r>
+        <w:t xml:space="preserve"> before a sentence is drafted, every attestation on the consolidated page is resolved through a fixed chain (consolidated attestation → raw claim → Tibetan text + block citation); an attestation that does not resolve is dropped and logged, never guessed. Drafting then uses the page and the resolved claims and </w:t>
+      </w:r>
+      <w:r>
+        <w:rPr>
+          <w:b/>
+          <w:bCs/>
+        </w:rPr>
+        <w:t xml:space="preserve">parametric knowledge nothing</w:t>
+      </w:r>
+      <w:r>
+        <w:t xml:space="preserve">: no dates, Sanskrit forms, iconographic details or doctrinal framing that is not in a claim, however standard they seem. Due weight follows attestation counts — consensus forms the backbone, unique claims are attributed inline, divergences present every position and adjudicate none — and a subject with no citable claims is </w:t>
+      </w:r>
+      <w:r>
+        <w:rPr>
+          <w:i/>
+          <w:iCs/>
+        </w:rPr>
+        <w:t xml:space="preserve">refused</w:t>
+      </w:r>
+      <w:r>
+        <w:t xml:space="preserve"> rather than padded: of the 44 standalone subjects, one ends exactly there, refused for lack of citable material. </w:t>
+      </w:r>
+      <w:r>
+        <w:rPr>
+          <w:b/>
+          <w:bCs/>
+        </w:rPr>
+        <w:t xml:space="preserve">Numbers: 43 term articles and 23 slot articles drafted; every citation trail records openly which references still lack a public URL and which consolidated pages are still marked draft.</w:t>
+      </w:r>
+    </w:p>
+    <w:p>
+      <w:pPr>
+        <w:spacing w:after="120" w:line="252"/>
+        <w:jc w:val="both"/>
+      </w:pPr>
+      <w:r>
+        <w:rPr>
+          <w:b/>
+          <w:bCs/>
+        </w:rPr>
+        <w:t xml:space="preserve">The import bridge.</w:t>
+      </w:r>
+      <w:r>
+        <w:t xml:space="preserve"> </w:t>
+      </w:r>
+      <w:r>
+        <w:rPr>
+          <w:i/>
+          <w:iCs/>
+        </w:rPr>
+        <w:t xml:space="preserve">In:</w:t>
+      </w:r>
+      <w:r>
+        <w:t xml:space="preserve"> a Route B article and its hand-written citation trail. </w:t>
+      </w:r>
+      <w:r>
+        <w:rPr>
+          <w:i/>
+          <w:iCs/>
+        </w:rPr>
+        <w:t xml:space="preserve">Out:</w:t>
+      </w:r>
+      <w:r>
+        <w:t xml:space="preserve"> the same article in the code pipeline's own layout — machine-readable citation records, registry-joined sources, a ledger entry. </w:t>
+      </w:r>
+      <w:r>
+        <w:rPr>
+          <w:i/>
+          <w:iCs/>
+        </w:rPr>
+        <w:t xml:space="preserve">How:</w:t>
+      </w:r>
+      <w:r>
+        <w:t xml:space="preserve"> a fully deterministic script — it moves and reshapes, it never rewrites wikitext and never invents a citation; a citation row it cannot resolve to a registered source is reported, never guessed at. Ledger discipline is explicit: imported articles enter as </w:t>
+      </w:r>
+      <w:r>
+        <w:rPr>
+          <w:i/>
+          <w:iCs/>
+        </w:rPr>
+        <w:t xml:space="preserve">drafted</w:t>
+      </w:r>
+      <w:r>
+        <w:t xml:space="preserve">, never </w:t>
+      </w:r>
+      <w:r>
+        <w:rPr>
+          <w:i/>
+          <w:iCs/>
+        </w:rPr>
+        <w:t xml:space="preserve">verified</w:t>
+      </w:r>
+      <w:r>
+        <w:t xml:space="preserve"> — "verified" means the gate passed and the audit cleared, and neither is this script's to assert. </w:t>
+      </w:r>
+      <w:r>
+        <w:rPr>
+          <w:b/>
+          <w:bCs/>
+        </w:rPr>
+        <w:t xml:space="preserve">42 of the batch articles are imported and batch-verified (§5.10).</w:t>
+      </w:r>
+    </w:p>
+    <w:p>
+      <w:pPr>
+        <w:spacing w:after="120" w:line="252"/>
+        <w:jc w:val="both"/>
+      </w:pPr>
+      <w:r>
+        <w:rPr>
+          <w:b/>
+          <w:bCs/>
+        </w:rPr>
+        <w:t xml:space="preserve">The style-revision loop — reader feedback becoming executable rules.</w:t>
+      </w:r>
+      <w:r>
+        <w:t xml:space="preserve"> The first native-reviewer reading of the batch (by the project's Tibetan linguist, with a Tibetan-language expert in the second round) returned six findings, three about review ergonomics and prose register — inline reference tags make the raw wikitext unreadable; statements carry more citations than they need; the articles read as stitched-together claims, a literature review rather than an encyclopedia — and three about Tibetan orthography and respect: every paragraph must close with the double shad (།།), the comma character does not exist in Tibetan and must not appear, and commentators must be named in prose by a respectful, human-curated form of their name. Every finding became a rule in a </w:t>
+      </w:r>
+      <w:r>
+        <w:rPr>
+          <w:b/>
+          <w:bCs/>
+        </w:rPr>
+        <w:t xml:space="preserve">new versioned drafting skill</w:t>
+      </w:r>
+      <w:r>
+        <w:t xml:space="preserve">, never an in-place edit of the shipped one: consensus statements move to plain encyclopedic voice with at most three supporting references (the full attestation list migrating to the citation trail, so nothing is lost); at most two verbatim quotations per article, spent only where exact wording is the point; the punctuation contract; and a new human-curated field on every source commentary carrying the respectful name form, which the model may only copy — never invent, translate, or upgrade an honorific. For reviewers, a small script now derives a read-only </w:t>
+      </w:r>
+      <w:r>
+        <w:rPr>
+          <w:i/>
+          <w:iCs/>
+        </w:rPr>
+        <w:t xml:space="preserve">preview</w:t>
+      </w:r>
+      <w:r>
+        <w:t xml:space="preserve"> of each article with citations rendered as footnote superscripts, regenerated from the article and never hand-edited. The loop is deliberately gated at pilot scale: three revised pilot articles await the linguist's approval, and the corpus-wide redraft waits on that approval — never batch-redraft ahead of the human gate.</w:t>
       </w:r>
     </w:p>
     <w:p>
@@ -3853,16 +4802,46 @@
         <w:pStyle w:val="Heading2"/>
       </w:pPr>
       <w:r>
-        <w:t xml:space="preserve">5.9 The deterministic verification gate</w:t>
-      </w:r>
-    </w:p>
-    <w:p>
-      <w:pPr>
-        <w:spacing w:after="120" w:line="252"/>
-        <w:jc w:val="both"/>
-      </w:pPr>
-      <w:r>
-        <w:t xml:space="preserve">Last in the chain, blocking, and LLM-free. The quotation checker's tiering </w:t>
+        <w:t xml:space="preserve">5.10 The deterministic verification gate</w:t>
+      </w:r>
+    </w:p>
+    <w:p>
+      <w:pPr>
+        <w:spacing w:after="120" w:line="252"/>
+        <w:jc w:val="both"/>
+      </w:pPr>
+      <w:r>
+        <w:t xml:space="preserve">Last in the chain, blocking, and LLM-free. </w:t>
+      </w:r>
+      <w:r>
+        <w:rPr>
+          <w:i/>
+          <w:iCs/>
+        </w:rPr>
+        <w:t xml:space="preserve">In:</w:t>
+      </w:r>
+      <w:r>
+        <w:t xml:space="preserve"> a drafted article and its citation records; the source files, read through the reading view described below. </w:t>
+      </w:r>
+      <w:r>
+        <w:rPr>
+          <w:i/>
+          <w:iCs/>
+        </w:rPr>
+        <w:t xml:space="preserve">Out:</w:t>
+      </w:r>
+      <w:r>
+        <w:t xml:space="preserve"> a pass/fail report per quotation and per validator rule — and, in batch form, one distribution report over every drafted article instead of a per-article exit, which is right for a gate and useless for a batch. </w:t>
+      </w:r>
+      <w:r>
+        <w:rPr>
+          <w:i/>
+          <w:iCs/>
+        </w:rPr>
+        <w:t xml:space="preserve">How:</w:t>
+      </w:r>
+      <w:r>
+        <w:t xml:space="preserve"> the quotation checker's tiering </w:t>
       </w:r>
       <w:r>
         <w:rPr>
@@ -3985,10 +4964,29 @@
     </w:p>
     <w:p>
       <w:pPr>
+        <w:spacing w:after="120" w:line="252"/>
+        <w:jc w:val="both"/>
+      </w:pPr>
+      <w:r>
+        <w:t xml:space="preserve">Run over the full batch of 42 imported articles, the gate reports: </w:t>
+      </w:r>
+      <w:r>
+        <w:rPr>
+          <w:b/>
+          <w:bCs/>
+        </w:rPr>
+        <w:t xml:space="preserve">861 of 882 quotations (97.6%) appear character-for-character in the commentary they cite</w:t>
+      </w:r>
+      <w:r>
+        <w:t xml:space="preserve">; one article of 42 carries no validator error. The error mass is instructive rather than alarming: 269 of the 293 validator findings are a single reference-format mismatch between the two drafting routes — the batch route hand-writes its reference text from the raw files' metadata where the validator expects the registry-composed form — a mechanical bridge reconciliation, not fabricated citations. The genuine residue is 21 quotation misses (two of them import artifacts — English note-text that leaked into a quote field), three unsourced sections, one category error and one script error, each named per article in the batch report and owned by a fix pass, with the gate re-run as the fix's evidence.</w:t>
+      </w:r>
+    </w:p>
+    <w:p>
+      <w:pPr>
         <w:pStyle w:val="Heading2"/>
       </w:pPr>
       <w:r>
-        <w:t xml:space="preserve">5.10 The review environment and the publication path</w:t>
+        <w:t xml:space="preserve">5.11 The review environment and the publication path</w:t>
       </w:r>
     </w:p>
     <w:p>
@@ -4203,7 +5201,7 @@
         <w:jc w:val="both"/>
       </w:pPr>
       <w:r>
-        <w:t xml:space="preserve">The reviewing surface is deliberately narrowed: the pipeline's own working directories are excluded from the vault's search and graph, so the reviewer sees sources, rails and articles rather than machine intermediates. Honest current state: the review queue (pending → approved → published) is defined but empty, and the pilot's three articles sit at </w:t>
+        <w:t xml:space="preserve">The reviewing surface is deliberately narrowed: the pipeline's own working directories are excluded from the vault's search and graph, so the reviewer sees sources, rails and articles rather than machine intermediates. Honest current state: the review queue (pending → approved → published) is defined but empty; the pilot's three articles sit at </w:t>
       </w:r>
       <w:r>
         <w:rPr>
@@ -4223,7 +5221,17 @@
         <w:t xml:space="preserve">approved</w:t>
       </w:r>
       <w:r>
-        <w:t xml:space="preserve">.</w:t>
+        <w:t xml:space="preserve">; the 42 imported batch articles sit at </w:t>
+      </w:r>
+      <w:r>
+        <w:rPr>
+          <w:i/>
+          <w:iCs/>
+        </w:rPr>
+        <w:t xml:space="preserve">drafted</w:t>
+      </w:r>
+      <w:r>
+        <w:t xml:space="preserve">, awaiting the per-article audit stage; and native-speaker review has begun — its first product being the style rules of §5.9, not yet an approval.</w:t>
       </w:r>
     </w:p>
     <w:p>
@@ -4277,7 +5285,7 @@
         <w:pStyle w:val="Heading2"/>
       </w:pPr>
       <w:r>
-        <w:t xml:space="preserve">5.11 Execution model and provenance</w:t>
+        <w:t xml:space="preserve">5.12 Execution model and provenance</w:t>
       </w:r>
     </w:p>
     <w:p>
@@ -4431,7 +5439,7 @@
         <w:jc w:val="both"/>
       </w:pPr>
       <w:r>
-        <w:t xml:space="preserve">Publication is where small-wiki damage happens, so the path is deliberately narrow (§5.10). The data model beneath it routes by copyright.</w:t>
+        <w:t xml:space="preserve">Publication is where small-wiki damage happens, so the path is deliberately narrow (§5.11). The data model beneath it routes by copyright.</w:t>
       </w:r>
     </w:p>
     <w:p>
@@ -4447,7 +5455,7 @@
         <w:t xml:space="preserve">Cite, don't copy.</w:t>
       </w:r>
       <w:r>
-        <w:t xml:space="preserve"> None of the canonical Tibetan source repositories licenses its text for the CC BY-SA reuse Wikipedia requires, so the pipeline generates original Tibetan prose over cited facts — facts are not copyrightable — and never translates or excerpts source text into articles. What look like quotations are renderer-inserted passages from the extraction record, each character-verified (§5.9). We state the limit as plainly as the strength: a claims table is still a paraphrase of its sources, so close paraphrase remains possible in principle; the audit reads for it, the pre-publication review checks it, and the human reviewer owns the final judgment.</w:t>
+        <w:t xml:space="preserve"> None of the canonical Tibetan source repositories licenses its text for the CC BY-SA reuse Wikipedia requires, so the pipeline generates original Tibetan prose over cited facts — facts are not copyrightable — and never translates or excerpts source text into articles. What look like quotations are renderer-inserted passages from the extraction record, each character-verified (§5.10). We state the limit as plainly as the strength: a claims table is still a paraphrase of its sources, so close paraphrase remains possible in principle; the audit reads for it, the pre-publication review checks it, and the human reviewer owns the final judgment.</w:t>
       </w:r>
     </w:p>
     <w:p>
@@ -4489,7 +5497,7 @@
         <w:t xml:space="preserve">The claims database as a dataset.</w:t>
       </w:r>
       <w:r>
-        <w:t xml:space="preserve"> Every article leaves behind its by-product regardless: 2,975 claims over sixteen commentaries — each row carrying verbatim Tibetan, an English gloss, a type from a twelve-value vocabulary, a referent with attestation basis, and a block-level source citation — plus sixteen spine maps and twenty-four consolidated topic pages (Table 4), all as vault markdown, readable in the same editor the reviewers use. Release intent is stated with the licensing question named honestly: the </w:t>
+        <w:t xml:space="preserve"> Every article leaves behind its by-product regardless: 2,975 claims over sixteen commentaries — each row carrying verbatim Tibetan, an English gloss, a type from a twelve-value vocabulary, a referent with attestation basis, and a block-level source citation — plus sixteen spine maps and sixty-seven consolidated topic pages (Table 4), all as vault markdown, readable in the same editor the reviewers use. Release intent is stated with the licensing question named honestly: the </w:t>
       </w:r>
       <w:r>
         <w:rPr>
@@ -4544,10 +5552,10 @@
         </w:tblCellMar>
       </w:tblPr>
       <w:tblGrid>
-        <w:gridCol w:w="2560"/>
-        <w:gridCol w:w="960"/>
-        <w:gridCol w:w="4640"/>
-        <w:gridCol w:w="1440"/>
+        <w:gridCol w:w="2104"/>
+        <w:gridCol w:w="789"/>
+        <w:gridCol w:w="3814"/>
+        <w:gridCol w:w="2893"/>
       </w:tblGrid>
       <w:tr>
         <w:trPr>
@@ -4555,7 +5563,7 @@
         </w:trPr>
         <w:tc>
           <w:tcPr>
-            <w:tcW w:type="dxa" w:w="2560"/>
+            <w:tcW w:type="dxa" w:w="2104"/>
             <w:shd w:fill="E8E8E8" w:color="auto" w:val="clear"/>
           </w:tcPr>
           <w:p>
@@ -4575,7 +5583,7 @@
         </w:tc>
         <w:tc>
           <w:tcPr>
-            <w:tcW w:type="dxa" w:w="960"/>
+            <w:tcW w:type="dxa" w:w="789"/>
             <w:shd w:fill="E8E8E8" w:color="auto" w:val="clear"/>
           </w:tcPr>
           <w:p>
@@ -4595,7 +5603,7 @@
         </w:tc>
         <w:tc>
           <w:tcPr>
-            <w:tcW w:type="dxa" w:w="4640"/>
+            <w:tcW w:type="dxa" w:w="3814"/>
             <w:shd w:fill="E8E8E8" w:color="auto" w:val="clear"/>
           </w:tcPr>
           <w:p>
@@ -4615,7 +5623,7 @@
         </w:tc>
         <w:tc>
           <w:tcPr>
-            <w:tcW w:type="dxa" w:w="1440"/>
+            <w:tcW w:type="dxa" w:w="2893"/>
             <w:shd w:fill="E8E8E8" w:color="auto" w:val="clear"/>
           </w:tcPr>
           <w:p>
@@ -4640,7 +5648,7 @@
         </w:trPr>
         <w:tc>
           <w:tcPr>
-            <w:tcW w:type="dxa" w:w="2560"/>
+            <w:tcW w:type="dxa" w:w="2104"/>
           </w:tcPr>
           <w:p>
             <w:pPr>
@@ -4657,7 +5665,7 @@
         </w:tc>
         <w:tc>
           <w:tcPr>
-            <w:tcW w:type="dxa" w:w="960"/>
+            <w:tcW w:type="dxa" w:w="789"/>
           </w:tcPr>
           <w:p>
             <w:pPr>
@@ -4674,7 +5682,7 @@
         </w:tc>
         <w:tc>
           <w:tcPr>
-            <w:tcW w:type="dxa" w:w="4640"/>
+            <w:tcW w:type="dxa" w:w="3814"/>
           </w:tcPr>
           <w:p>
             <w:pPr>
@@ -4691,7 +5699,7 @@
         </w:tc>
         <w:tc>
           <w:tcPr>
-            <w:tcW w:type="dxa" w:w="1440"/>
+            <w:tcW w:type="dxa" w:w="2893"/>
           </w:tcPr>
           <w:p>
             <w:pPr>
@@ -4713,7 +5721,7 @@
         </w:trPr>
         <w:tc>
           <w:tcPr>
-            <w:tcW w:type="dxa" w:w="2560"/>
+            <w:tcW w:type="dxa" w:w="2104"/>
           </w:tcPr>
           <w:p>
             <w:pPr>
@@ -4730,7 +5738,7 @@
         </w:tc>
         <w:tc>
           <w:tcPr>
-            <w:tcW w:type="dxa" w:w="960"/>
+            <w:tcW w:type="dxa" w:w="789"/>
           </w:tcPr>
           <w:p>
             <w:pPr>
@@ -4747,7 +5755,7 @@
         </w:tc>
         <w:tc>
           <w:tcPr>
-            <w:tcW w:type="dxa" w:w="4640"/>
+            <w:tcW w:type="dxa" w:w="3814"/>
           </w:tcPr>
           <w:p>
             <w:pPr>
@@ -4764,7 +5772,7 @@
         </w:tc>
         <w:tc>
           <w:tcPr>
-            <w:tcW w:type="dxa" w:w="1440"/>
+            <w:tcW w:type="dxa" w:w="2893"/>
           </w:tcPr>
           <w:p>
             <w:pPr>
@@ -4786,7 +5794,7 @@
         </w:trPr>
         <w:tc>
           <w:tcPr>
-            <w:tcW w:type="dxa" w:w="2560"/>
+            <w:tcW w:type="dxa" w:w="2104"/>
           </w:tcPr>
           <w:p>
             <w:pPr>
@@ -4803,7 +5811,7 @@
         </w:tc>
         <w:tc>
           <w:tcPr>
-            <w:tcW w:type="dxa" w:w="960"/>
+            <w:tcW w:type="dxa" w:w="789"/>
           </w:tcPr>
           <w:p>
             <w:pPr>
@@ -4820,7 +5828,7 @@
         </w:tc>
         <w:tc>
           <w:tcPr>
-            <w:tcW w:type="dxa" w:w="4640"/>
+            <w:tcW w:type="dxa" w:w="3814"/>
           </w:tcPr>
           <w:p>
             <w:pPr>
@@ -4837,7 +5845,7 @@
         </w:tc>
         <w:tc>
           <w:tcPr>
-            <w:tcW w:type="dxa" w:w="1440"/>
+            <w:tcW w:type="dxa" w:w="2893"/>
           </w:tcPr>
           <w:p>
             <w:pPr>
@@ -4859,7 +5867,7 @@
         </w:trPr>
         <w:tc>
           <w:tcPr>
-            <w:tcW w:type="dxa" w:w="2560"/>
+            <w:tcW w:type="dxa" w:w="2104"/>
           </w:tcPr>
           <w:p>
             <w:pPr>
@@ -4876,7 +5884,7 @@
         </w:tc>
         <w:tc>
           <w:tcPr>
-            <w:tcW w:type="dxa" w:w="960"/>
+            <w:tcW w:type="dxa" w:w="789"/>
           </w:tcPr>
           <w:p>
             <w:pPr>
@@ -4893,7 +5901,7 @@
         </w:tc>
         <w:tc>
           <w:tcPr>
-            <w:tcW w:type="dxa" w:w="4640"/>
+            <w:tcW w:type="dxa" w:w="3814"/>
           </w:tcPr>
           <w:p>
             <w:pPr>
@@ -4910,7 +5918,7 @@
         </w:tc>
         <w:tc>
           <w:tcPr>
-            <w:tcW w:type="dxa" w:w="1440"/>
+            <w:tcW w:type="dxa" w:w="2893"/>
           </w:tcPr>
           <w:p>
             <w:pPr>
@@ -4932,7 +5940,7 @@
         </w:trPr>
         <w:tc>
           <w:tcPr>
-            <w:tcW w:type="dxa" w:w="2560"/>
+            <w:tcW w:type="dxa" w:w="2104"/>
           </w:tcPr>
           <w:p>
             <w:pPr>
@@ -4949,7 +5957,7 @@
         </w:tc>
         <w:tc>
           <w:tcPr>
-            <w:tcW w:type="dxa" w:w="960"/>
+            <w:tcW w:type="dxa" w:w="789"/>
           </w:tcPr>
           <w:p>
             <w:pPr>
@@ -4966,7 +5974,7 @@
         </w:tc>
         <w:tc>
           <w:tcPr>
-            <w:tcW w:type="dxa" w:w="4640"/>
+            <w:tcW w:type="dxa" w:w="3814"/>
           </w:tcPr>
           <w:p>
             <w:pPr>
@@ -4983,7 +5991,7 @@
         </w:tc>
         <w:tc>
           <w:tcPr>
-            <w:tcW w:type="dxa" w:w="1440"/>
+            <w:tcW w:type="dxa" w:w="2893"/>
           </w:tcPr>
           <w:p>
             <w:pPr>
@@ -5005,7 +6013,7 @@
         </w:trPr>
         <w:tc>
           <w:tcPr>
-            <w:tcW w:type="dxa" w:w="2560"/>
+            <w:tcW w:type="dxa" w:w="2104"/>
           </w:tcPr>
           <w:p>
             <w:pPr>
@@ -5022,7 +6030,7 @@
         </w:tc>
         <w:tc>
           <w:tcPr>
-            <w:tcW w:type="dxa" w:w="960"/>
+            <w:tcW w:type="dxa" w:w="789"/>
           </w:tcPr>
           <w:p>
             <w:pPr>
@@ -5039,7 +6047,7 @@
         </w:tc>
         <w:tc>
           <w:tcPr>
-            <w:tcW w:type="dxa" w:w="4640"/>
+            <w:tcW w:type="dxa" w:w="3814"/>
           </w:tcPr>
           <w:p>
             <w:pPr>
@@ -5056,7 +6064,7 @@
         </w:tc>
         <w:tc>
           <w:tcPr>
-            <w:tcW w:type="dxa" w:w="1440"/>
+            <w:tcW w:type="dxa" w:w="2893"/>
           </w:tcPr>
           <w:p>
             <w:pPr>
@@ -5078,7 +6086,7 @@
         </w:trPr>
         <w:tc>
           <w:tcPr>
-            <w:tcW w:type="dxa" w:w="2560"/>
+            <w:tcW w:type="dxa" w:w="2104"/>
           </w:tcPr>
           <w:p>
             <w:pPr>
@@ -5095,7 +6103,7 @@
         </w:tc>
         <w:tc>
           <w:tcPr>
-            <w:tcW w:type="dxa" w:w="960"/>
+            <w:tcW w:type="dxa" w:w="789"/>
           </w:tcPr>
           <w:p>
             <w:pPr>
@@ -5112,7 +6120,7 @@
         </w:tc>
         <w:tc>
           <w:tcPr>
-            <w:tcW w:type="dxa" w:w="4640"/>
+            <w:tcW w:type="dxa" w:w="3814"/>
           </w:tcPr>
           <w:p>
             <w:pPr>
@@ -5129,7 +6137,7 @@
         </w:tc>
         <w:tc>
           <w:tcPr>
-            <w:tcW w:type="dxa" w:w="1440"/>
+            <w:tcW w:type="dxa" w:w="2893"/>
           </w:tcPr>
           <w:p>
             <w:pPr>
@@ -5151,7 +6159,7 @@
         </w:trPr>
         <w:tc>
           <w:tcPr>
-            <w:tcW w:type="dxa" w:w="2560"/>
+            <w:tcW w:type="dxa" w:w="2104"/>
           </w:tcPr>
           <w:p>
             <w:pPr>
@@ -5168,7 +6176,7 @@
         </w:tc>
         <w:tc>
           <w:tcPr>
-            <w:tcW w:type="dxa" w:w="960"/>
+            <w:tcW w:type="dxa" w:w="789"/>
           </w:tcPr>
           <w:p>
             <w:pPr>
@@ -5185,7 +6193,7 @@
         </w:tc>
         <w:tc>
           <w:tcPr>
-            <w:tcW w:type="dxa" w:w="4640"/>
+            <w:tcW w:type="dxa" w:w="3814"/>
           </w:tcPr>
           <w:p>
             <w:pPr>
@@ -5202,7 +6210,7 @@
         </w:tc>
         <w:tc>
           <w:tcPr>
-            <w:tcW w:type="dxa" w:w="1440"/>
+            <w:tcW w:type="dxa" w:w="2893"/>
           </w:tcPr>
           <w:p>
             <w:pPr>
@@ -5224,7 +6232,7 @@
         </w:trPr>
         <w:tc>
           <w:tcPr>
-            <w:tcW w:type="dxa" w:w="2560"/>
+            <w:tcW w:type="dxa" w:w="2104"/>
           </w:tcPr>
           <w:p>
             <w:pPr>
@@ -5241,7 +6249,7 @@
         </w:tc>
         <w:tc>
           <w:tcPr>
-            <w:tcW w:type="dxa" w:w="960"/>
+            <w:tcW w:type="dxa" w:w="789"/>
           </w:tcPr>
           <w:p>
             <w:pPr>
@@ -5258,7 +6266,7 @@
         </w:tc>
         <w:tc>
           <w:tcPr>
-            <w:tcW w:type="dxa" w:w="4640"/>
+            <w:tcW w:type="dxa" w:w="3814"/>
           </w:tcPr>
           <w:p>
             <w:pPr>
@@ -5275,18 +6283,18 @@
         </w:tc>
         <w:tc>
           <w:tcPr>
-            <w:tcW w:type="dxa" w:w="1440"/>
-          </w:tcPr>
-          <w:p>
-            <w:pPr>
-              <w:spacing w:after="0" w:line="220"/>
-            </w:pPr>
-            <w:r>
-              <w:rPr>
-                <w:sz w:val="18"/>
-                <w:szCs w:val="18"/>
-              </w:rPr>
-              <w:t xml:space="preserve">24</w:t>
+            <w:tcW w:type="dxa" w:w="2893"/>
+          </w:tcPr>
+          <w:p>
+            <w:pPr>
+              <w:spacing w:after="0" w:line="220"/>
+            </w:pPr>
+            <w:r>
+              <w:rPr>
+                <w:sz w:val="18"/>
+                <w:szCs w:val="18"/>
+              </w:rPr>
+              <w:t xml:space="preserve">24 slot + 43 term = 67</w:t>
             </w:r>
           </w:p>
         </w:tc>
@@ -5297,7 +6305,7 @@
         </w:trPr>
         <w:tc>
           <w:tcPr>
-            <w:tcW w:type="dxa" w:w="2560"/>
+            <w:tcW w:type="dxa" w:w="2104"/>
           </w:tcPr>
           <w:p>
             <w:pPr>
@@ -5314,7 +6322,7 @@
         </w:tc>
         <w:tc>
           <w:tcPr>
-            <w:tcW w:type="dxa" w:w="960"/>
+            <w:tcW w:type="dxa" w:w="789"/>
           </w:tcPr>
           <w:p>
             <w:pPr>
@@ -5331,7 +6339,7 @@
         </w:tc>
         <w:tc>
           <w:tcPr>
-            <w:tcW w:type="dxa" w:w="4640"/>
+            <w:tcW w:type="dxa" w:w="3814"/>
           </w:tcPr>
           <w:p>
             <w:pPr>
@@ -5348,18 +6356,18 @@
         </w:tc>
         <w:tc>
           <w:tcPr>
-            <w:tcW w:type="dxa" w:w="1440"/>
-          </w:tcPr>
-          <w:p>
-            <w:pPr>
-              <w:spacing w:after="0" w:line="220"/>
-            </w:pPr>
-            <w:r>
-              <w:rPr>
-                <w:sz w:val="18"/>
-                <w:szCs w:val="18"/>
-              </w:rPr>
-              <w:t xml:space="preserve">3 + 3</w:t>
+            <w:tcW w:type="dxa" w:w="2893"/>
+          </w:tcPr>
+          <w:p>
+            <w:pPr>
+              <w:spacing w:after="0" w:line="220"/>
+            </w:pPr>
+            <w:r>
+              <w:rPr>
+                <w:sz w:val="18"/>
+                <w:szCs w:val="18"/>
+              </w:rPr>
+              <w:t xml:space="preserve">3 + 66</w:t>
             </w:r>
           </w:p>
         </w:tc>
@@ -5447,7 +6455,7 @@
         <w:t xml:space="preserve">RQ1 — citation fidelity (measured; the strongest form).</w:t>
       </w:r>
       <w:r>
-        <w:t xml:space="preserve"> Across the pilot's three articles the deterministic gate re-read every quotation from its cited source file: </w:t>
+        <w:t xml:space="preserve"> Evaluation runs at two scales by design: a three-article pilot audited to hand-adjudicated depth, and a corpus-wide batch reported distributionally. Across the pilot's three articles the deterministic gate re-read every quotation from its cited source file: </w:t>
       </w:r>
       <w:r>
         <w:rPr>
@@ -5457,7 +6465,17 @@
         <w:t xml:space="preserve">81 of 81 character-for-character exact; 81 of 81 block locators resolve to the named block, none wrong.</w:t>
       </w:r>
       <w:r>
-        <w:t xml:space="preserve"> The result is reproducible in the strict sense: the corpus was rebuilt from the raw upload on a second machine and the verification reports came back identical. On the second drafting route, the per-quotation tables show 13/13 and 8/8 passes. This measures a different thing than the statement-support rates reported for English-language systems — WikiCrow's 86.1% citation precision is a rater's judgment that a source supports a statement; ours is character-level identity of the quoted evidence. The gate proves the quoted evidence is real and correctly located, never that it warrants the sentence citing it.</w:t>
+        <w:t xml:space="preserve"> The result is reproducible in the strict sense: the corpus was rebuilt from the raw upload on a second machine and the verification reports came back identical. Across the batch's 42 imported articles the same gate reports </w:t>
+      </w:r>
+      <w:r>
+        <w:rPr>
+          <w:b/>
+          <w:bCs/>
+        </w:rPr>
+        <w:t xml:space="preserve">861 of 882 quotations (97.6%) character-for-character exact</w:t>
+      </w:r>
+      <w:r>
+        <w:t xml:space="preserve"> — a pre-fix-pass distribution, each of the 21 misses enumerated per article in the batch report (two are import artifacts rather than model errors), where the pilot's 100% is the post-fix state the batch is being walked toward. This measures a different thing than the statement-support rates reported for English-language systems — WikiCrow's 86.1% citation precision is a rater's judgment that a source supports a statement; ours is character-level identity of the quoted evidence. The gate proves the quoted evidence is real and correctly located, never that it warrants the sentence citing it.</w:t>
       </w:r>
     </w:p>
     <w:p>
@@ -6061,7 +7079,7 @@
         <w:t xml:space="preserve">zero fabricated claim IDs; 1 critical, 1 moderate, ~16 minor findings</w:t>
       </w:r>
       <w:r>
-        <w:t xml:space="preserve"> (§5.7), a taxonomy converted wholesale into eight executable rules and two standing gates. Attribution integrity in the pilot articles: of 34 sub-consensus claims, attribution survived on all but the two cases in Table 5, both caught before publication.</w:t>
+        <w:t xml:space="preserve"> (§5.8), a taxonomy converted wholesale into eight executable rules and two standing gates. Attribution integrity in the pilot articles: of 34 sub-consensus claims, attribution survived on all but the two cases in Table 5, both caught before publication.</w:t>
       </w:r>
     </w:p>
     <w:p>
@@ -6134,6 +7152,42 @@
       </w:r>
       <w:r>
         <w:t xml:space="preserve">. Article lengths 642–1,358 syllables — all below the 1,500 target, a known extraction-volume limitation under active tuning.</w:t>
+      </w:r>
+    </w:p>
+    <w:p>
+      <w:pPr>
+        <w:spacing w:after="120" w:line="252"/>
+        <w:jc w:val="both"/>
+      </w:pPr>
+      <w:r>
+        <w:rPr>
+          <w:b/>
+          <w:bCs/>
+        </w:rPr>
+        <w:t xml:space="preserve">Pipeline statistics (batch, on disk).</w:t>
+      </w:r>
+      <w:r>
+        <w:t xml:space="preserve"> The subject funnel of §5.4 ran end to end: 367 Tibetan terms → 114 past the viability gate → 44 standalone subjects (25 update / 19 create against the live wiki). From the 67 consolidated pages, </w:t>
+      </w:r>
+      <w:r>
+        <w:rPr>
+          <w:b/>
+          <w:bCs/>
+        </w:rPr>
+        <w:t xml:space="preserve">43 term articles and 23 slot articles were drafted; one subject was refused for lack of citable claims</w:t>
+      </w:r>
+      <w:r>
+        <w:t xml:space="preserve"> — the refusal itself evidence that the claims-only rule binds. 42 articles are imported into the code pipeline and batch-verified (the fidelity distribution above; one article of 42 validator-clean, with 269 of 293 validator findings a single mechanical reference-format mismatch between the two drafting routes). The per-article audit stage and the second consolidation gate have run over only part of the batch — and where the consolidation audit ran, it found four critical meaning-level defects on pages whose quotations were all character-perfect (§5.8), which is the batch's own confirmation of RQ2. The native-reviewer loop is mid-flight: three style-revised pilot articles await linguist approval before the corpus-wide redraft. Batch audit pass rates, reviewer-minutes, and rubric ratings remain </w:t>
+      </w:r>
+      <w:r>
+        <w:rPr>
+          <w:b/>
+          <w:bCs/>
+        </w:rPr>
+        <w:t xml:space="preserve">[TO FILL]</w:t>
+      </w:r>
+      <w:r>
+        <w:t xml:space="preserve">.</w:t>
       </w:r>
     </w:p>
     <w:p>
@@ -6711,7 +7765,7 @@
         <w:t xml:space="preserve">Planned legs — designed, not yet run.</w:t>
       </w:r>
       <w:r>
-        <w:t xml:space="preserve"> Corpus-batch distributions over the full candidate term list (gate and audit pass rates, extraction capture against offer size as a curve, cost); native-speaker rating by three named raters on a seven-dimension rubric, with an AIS-style statement-support audit on a stratified sample; reviewer-minutes against a from-scratch writing-time control by the same editors, which is the RQ3 number; a </w:t>
+        <w:t xml:space="preserve"> Batch audit pass rates (the per-article audit stage over the 42 imported articles, and the second consolidation gate over the remaining topic pages); native-speaker rating by three named raters on a seven-dimension rubric, with an AIS-style statement-support audit on a stratified sample; reviewer-minutes against a from-scratch writing-time control by the same editors, which is the RQ3 number; a </w:t>
       </w:r>
       <w:r>
         <w:rPr>
@@ -6731,7 +7785,7 @@
         <w:t xml:space="preserve">guardrail before/after</w:t>
       </w:r>
       <w:r>
-        <w:t xml:space="preserve">, both consolidation gates re-run over all 24 topic pages against the 418-citation pre-guardrail taxonomy; and a </w:t>
+        <w:t xml:space="preserve">, both consolidation gates re-run over the topic pages against the 418-citation pre-guardrail taxonomy; and a </w:t>
       </w:r>
       <w:r>
         <w:rPr>
@@ -6820,7 +7874,7 @@
         <w:t xml:space="preserve">sic</w:t>
       </w:r>
       <w:r>
-        <w:t xml:space="preserve">-faithful to the ingested edition, so textual correction is a curatorial prerequisite rather than something the pipeline improvises. The model asymmetry in Tibetan is real and measured (§8's extraction-capture cliff), and both drafting and auditing ride on models trained mostly on other languages — the cyclical argument of §1, felt from inside the pipeline. The artifacts record their own defects, and we repeat them rather than hide them: the corpus exists in two annotated copies; the three consolidated-page articles were drafted from pages still marked draft, with the responsible human accepting that risk explicitly; one article's citation trail is missing; one tree's line pointers drifted after a post-QC re-stamp; the two superseded extraction methods have no surviving outputs, so that comparison cannot be re-run; claim-level judgments are not yet human-validated; and article lengths sit below the stub threshold. Evaluation's human legs are pending, so every claim that depends on human judgment rests on a small annotated subset by design — scaling the machine does not scale the reviewing, which is the paper's own thesis turned on its evaluation.</w:t>
+        <w:t xml:space="preserve">-faithful to the ingested edition, so textual correction is a curatorial prerequisite rather than something the pipeline improvises. The model asymmetry in Tibetan is real and measured (§8's extraction-capture cliff), and both drafting and auditing ride on models trained mostly on other languages — the cyclical argument of §1, felt from inside the pipeline. The artifacts record their own defects, and we repeat them rather than hide them: the corpus exists in two annotated copies; the batch's articles were drafted from consolidated pages still marked draft, with the responsible human accepting that risk explicitly and per-article warnings recording it; no citation yet carries a public URL, so no quotation is reader-checkable online — the single largest pre-publication debt; the second consolidation gate has run over only part of the batch, and where it ran it found critical meaning-level defects behind character-perfect quotes, so it is not skippable; most drafted articles still carry the pre-review prose register and old-form author names, awaiting the gated corpus-wide redraft; one tree's line pointers drifted after a post-QC re-stamp; the two superseded extraction methods have no surviving outputs, so that comparison cannot be re-run; claim-level judgments are not yet human-validated; and pilot article lengths sit below the stub threshold. Evaluation's human legs are pending, so every claim that depends on human judgment rests on a small annotated subset by design — scaling the machine does not scale the reviewing, which is the paper's own thesis turned on its evaluation.</w:t>
       </w:r>
     </w:p>
     <w:p>
@@ -6863,7 +7917,7 @@
         <w:jc w:val="both"/>
       </w:pPr>
       <w:r>
-        <w:t xml:space="preserve">The cycle this paper set out to enter — articles → digital footprint → training data → better tools → faster articles — runs today in the wrong direction for Tibetan: absence begetting absence, and, on other small wikis, machine junk begetting model junk. We have shown a working pipeline built to flip that sign: segmentation behind a no-loss assertion; structure extracted in isolated passes and gated by two deterministic checkers; claims extracted node-by-node under five measured guards; routing separated from interpretation; questions generated rather than authored; consolidation audited twice, once by script and once by an adversarial fresh context; articles drafted from claims alone; a character-exact gate no model verdict can waive; and a human hand, working in the corpus itself, on the only switch that publishes. The per-article artifacts are small; the machine they came from is not — a reusable editorial system whose every safeguard is a testable invariant, and a growing claims database over the commentarial tradition that is a research object for Tibetan studies regardless of what Wikipedia becomes. The answer to the gap named in the opening is neither refusal nor flood, but verification with a human hand on the gate.</w:t>
+        <w:t xml:space="preserve">The cycle this paper set out to enter — articles → digital footprint → training data → better tools → faster articles — runs today in the wrong direction for Tibetan: absence begetting absence, and, on other small wikis, machine junk begetting model junk. We have shown a working pipeline built to flip that sign: segmentation behind a no-loss assertion; structure extracted in isolated passes and gated by two deterministic checkers; claims extracted node-by-node under five measured guards; routing separated from interpretation; questions generated rather than authored; consolidation audited twice, once by script and once by an adversarial fresh context; articles drafted from claims alone; a character-exact gate no model verdict can waive; native-reviewer feedback versioned into the drafting rules themselves rather than left as advice; and a human hand, working in the corpus itself, on the only switch that publishes. The per-article artifacts are small; the machine they came from is not — a reusable editorial system whose every safeguard is a testable invariant, and a growing claims database over the commentarial tradition that is a research object for Tibetan studies regardless of what Wikipedia becomes. The answer to the gap named in the opening is neither refusal nor flood, but verification with a human hand on the gate.</w:t>
       </w:r>
     </w:p>
     <w:p>

</xml_diff>

<commit_message>
vault backup: 2026-08-21 20:03:45
</commit_message>
<xml_diff>
--- a/4-SYSTEM/Pipelines/wikipedia/paper/draft/Expanding-the-Digital-Footprint-of-Tibetan.docx
+++ b/4-SYSTEM/Pipelines/wikipedia/paper/draft/Expanding-the-Digital-Footprint-of-Tibetan.docx
@@ -154,7 +154,7 @@
         <w:t xml:space="preserve">Praise to the Twenty-One Tārās</w:t>
       </w:r>
       <w:r>
-        <w:t xml:space="preserve"> (སྒྲོལ་མ་ལ་ཕྱག་འཚལ་ཉི་ཤུ་རྩ་གཅིག་གིས་བསྟོད་པ, Toh. 438) with sixteen Tibetan commentaries spanning Sakya, Geluk, Jonang, Nyingma and Kagyü authors from Drakpa Gyaltsen to living teachers — a bounded, heavily commented classical text with a living interpretive tradition, so that every generated statement can be checked against named human sources.</w:t>
+        <w:t xml:space="preserve"> (སྒྲོལ་མ་ལ་ཕྱག་འཚལ་ཉི་ཤུ་རྩ་གཅིག་གིས་བསྟོད་པ, Toh. 438) with sixteen Tibetan commentaries — a bounded, heavily commented classical text with a living interpretive tradition, so that every generated statement can be checked against named human sources.</w:t>
       </w:r>
     </w:p>
     <w:p>
@@ -196,7 +196,7 @@
           <w:i/>
           <w:iCs/>
         </w:rPr>
-        <w:t xml:space="preserve">[Figure 1 near here: the feedback loop with its sign — the doom spiral (unverified machine content → degraded corpus → degraded models) against the verified cycle (cited articles → digital footprint → better tools → faster articles).]</w:t>
+        <w:t xml:space="preserve">[Figure 1 near here: the feedback loop with its sign — the doom spiral against the verified cycle (cited articles → digital footprint → better tools → faster articles).]</w:t>
       </w:r>
     </w:p>
     <w:p>
@@ -212,7 +212,7 @@
         <w:t xml:space="preserve">Contributions.</w:t>
       </w:r>
       <w:r>
-        <w:t xml:space="preserve"> (1) A working end-to-end pipeline: raw OCR → cleaned, block-addressable sources → structural trees → atomic claims → consolidated topic pages → cited Tibetan wikitext, behind a deterministic character-exact verification gate (§5). (2) A measured negative result about self-evaluation: a same-model audit returned "publish, no findings" on drafts in which an independent cross-model audit found five blocking errors (§8). (3) An adversarial-audit error taxonomy — from a re-check of all 418 citations on three consolidated pages — converted wholesale into executable rules and two standing gates (§5.7, §8). (4) The claims database itself as a dataset (§7). (5) A transferable design pattern for under-resourced languages: model judgment everywhere, model authority nowhere (§9).</w:t>
+        <w:t xml:space="preserve"> (1) A working end-to-end pipeline: raw OCR → block-addressable sources → structural trees → atomic claims → consolidated topic pages → cited Tibetan wikitext, behind a deterministic character-exact verification gate (§5). (2) A measured negative result about self-evaluation: a same-model audit returned "publish, no findings" on drafts in which an independent cross-model audit found five blocking errors (§8). (3) An adversarial-audit error taxonomy — from a re-check of all 418 citations on three consolidated pages — converted wholesale into executable rules and two standing gates (§5.7, §8). (4) The claims database itself as a dataset (§7). (5) A transferable design pattern for under-resourced languages: model judgment everywhere, model authority nowhere (§9).</w:t>
       </w:r>
     </w:p>
     <w:p>
@@ -258,7 +258,7 @@
         <w:t xml:space="preserve">economics</w:t>
       </w:r>
       <w:r>
-        <w:t xml:space="preserve">): does supervised automation change the review-time arithmetic enough to make a small-language encyclopedia reachable within a generation? §8 answers them in order — RQ1 and RQ2 with measured results, RQ3 with the measured machine side and a boxed </w:t>
+        <w:t xml:space="preserve">): does supervised automation change the review-time arithmetic enough to make a small-language encyclopedia reachable within a generation? §8 answers them in order — RQ1 and RQ2 with measured results, RQ3 with the machine side measured and a boxed </w:t>
       </w:r>
       <w:r>
         <w:rPr>
@@ -505,7 +505,7 @@
         <w:t xml:space="preserve">Supervised automation.</w:t>
       </w:r>
       <w:r>
-        <w:t xml:space="preserve"> Machine drafting under hard verification, throughput bounded by human review capacity, a named human as publisher. This paper's pipeline is an existence proof of the third option, and we claim no demonstrated alternative reaches critical mass within a generation. The number that turns this from rhetoric into a finding is </w:t>
+        <w:t xml:space="preserve"> Machine drafting under hard verification, throughput bounded by human review capacity, a named human as publisher. This paper's pipeline is an existence proof of the third option. The number that turns this from rhetoric into a finding is </w:t>
       </w:r>
       <w:r>
         <w:rPr>
@@ -515,7 +515,7 @@
         <w:t xml:space="preserve">reviewer-minutes per audit-passed article versus historical editor-hours per article</w:t>
       </w:r>
       <w:r>
-        <w:t xml:space="preserve">. The machine side is now measured (§8); the human side awaits the planned batch </w:t>
+        <w:t xml:space="preserve">: the machine side is now measured (§8); the human side awaits the planned batch </w:t>
       </w:r>
       <w:r>
         <w:rPr>
@@ -552,7 +552,7 @@
         <w:t xml:space="preserve">Praise to the Twenty-One Tārās</w:t>
       </w:r>
       <w:r>
-        <w:t xml:space="preserve"> — the opening invocation, the twenty-one homage stanzas, the closing couplet and the benefits section (ཕན་ཡོན) — together with sixteen commentaries totalling ~540,000 characters, from a curated </w:t>
+        <w:t xml:space="preserve"> — the opening invocation, the twenty-one homage stanzas, the closing couplet and the benefits section (ཕན་ཡོན) — with sixteen commentaries totalling ~540,000 characters, from a curated </w:t>
       </w:r>
       <w:r>
         <w:rPr>
@@ -562,7 +562,7 @@
         <w:t xml:space="preserve">dkar chag</w:t>
       </w:r>
       <w:r>
-        <w:t xml:space="preserve"> (catalogue) supplied by the team (Table 1). The school composition is skewed — seven Geluk commentaries, one or two for each other tradition, three unattributed — and §6 and §9 treat that skew as data the pipeline must respect, not noise.</w:t>
+        <w:t xml:space="preserve"> supplied by the team (Table 1): Sakya, Geluk, Jonang, Nyingma and Kagyü authors, from Drakpa Gyaltsen to living teachers. The school composition is skewed — seven Geluk commentaries, one or two for each other tradition, three unattributed — and §6 and §9 treat that skew as data the pipeline must respect, not noise.</w:t>
       </w:r>
     </w:p>
     <w:p>
@@ -1711,17 +1711,7 @@
         <w:jc w:val="both"/>
       </w:pPr>
       <w:r>
-        <w:t xml:space="preserve">Ingest is deterministic: re-running it reproduces every source file byte for byte, verified by rebuilding the corpus from the raw upload on a second machine and obtaining identical verification reports (§8). One honesty note stays visible: the corpus currently exists in </w:t>
-      </w:r>
-      <w:r>
-        <w:rPr>
-          <w:b/>
-          <w:bCs/>
-        </w:rPr>
-        <w:t xml:space="preserve">two annotated copies</w:t>
-      </w:r>
-      <w:r>
-        <w:t xml:space="preserve"> — a rails-side copy carrying structural sa-bcad headings and a pipeline-side copy carrying flat block IDs. The citation chain is intact in both, and the duplication is scheduled to collapse into one set of source files.</w:t>
+        <w:t xml:space="preserve">Ingest is deterministic: re-running it reproduces every source file byte for byte, verified by rebuilding the corpus from the raw upload on a second machine and obtaining identical verification reports (§8). One honesty note stays visible: the corpus currently exists in two annotated copies — rails-side with sa-bcad headings, pipeline-side with flat block IDs — with the citation chain intact in both (§9).</w:t>
       </w:r>
     </w:p>
     <w:p>
@@ -2777,20 +2767,20 @@
         <w:jc w:val="both"/>
       </w:pPr>
       <w:r>
-        <w:t xml:space="preserve">Figure 3 shows what the step produces, from the promoted tree of Gendün Drub's ṭīkā — ten of its 37 nodes, nested to seven levels, each line pointer addressing the source file. The leaf nodes under its "extended explanation" number exactly twenty-one: the tree recovers the praise's own architecture, as the commentator declared it.</w:t>
-      </w:r>
-    </w:p>
-    <w:p>
-      <w:pPr>
-        <w:spacing w:after="120" w:line="252"/>
-        <w:jc w:val="both"/>
-      </w:pPr>
-      <w:r>
-        <w:rPr>
-          <w:i/>
-          <w:iCs/>
-        </w:rPr>
-        <w:t xml:space="preserve">Figure 3. Excerpt of the QC-clean structural tree for TARAC03_GDD (Gendün Drub). English glosses added here; [[N]] are line pointers into the source.</w:t>
+        <w:t xml:space="preserve">Figure 3 shows what the step produces, from the promoted tree of Gendün Drub's ṭīkā — ten of its 37 nodes, nested to seven levels. The leaf nodes under its "extended explanation" number exactly twenty-one: the tree recovers the praise's own architecture, as the commentator declared it.</w:t>
+      </w:r>
+    </w:p>
+    <w:p>
+      <w:pPr>
+        <w:spacing w:after="120" w:line="252"/>
+        <w:jc w:val="both"/>
+      </w:pPr>
+      <w:r>
+        <w:rPr>
+          <w:i/>
+          <w:iCs/>
+        </w:rPr>
+        <w:t xml:space="preserve">Figure 3. Excerpt of the QC-clean structural tree for TARAC03_GDD (Gendün Drub). English glosses added here; [[N]] are line pointers into the source file.</w:t>
       </w:r>
     </w:p>
     <w:p>
@@ -2956,17 +2946,7 @@
         <w:t xml:space="preserve">the commentary itself</w:t>
       </w:r>
       <w:r>
-        <w:t xml:space="preserve">, and exists because of a measured failure: the project's first three trees reported zero issues from the first checker while carrying, between them, a top-level section wrongly attached (twenty homage children filed under "explaining the benefits"), an unresolved anchor one line from an obvious textual anchor, and seven collided line pointers where the extractor had lost its cursor. Self-consistency checking cannot catch these, because the one thing it never reads is the commentary. Promotion requires both checkers clean; all sixteen commentaries have promoted, QC-clean trees. One residual defect is recorded </w:t>
-      </w:r>
-      <w:r>
-        <w:rPr>
-          <w:i/>
-          <w:iCs/>
-        </w:rPr>
-        <w:t xml:space="preserve">inside the affected downstream file</w:t>
-      </w:r>
-      <w:r>
-        <w:t xml:space="preserve"> rather than hidden: one tree's line pointers drifted because its source file was re-stamped minutes after QC ran, and the drift is flagged in the claims file that inherited it.</w:t>
+        <w:t xml:space="preserve">, and exists because of a measured failure: the project's first three trees reported zero issues from the first checker while carrying, between them, a top-level section wrongly attached (twenty homage children filed under "explaining the benefits"), an unresolved anchor one line from an obvious textual anchor, and seven collided line pointers where the extractor had lost its cursor. Self-consistency checking cannot catch these, because the one thing it never reads is the commentary. Promotion requires both checkers clean; all sixteen commentaries have promoted, QC-clean trees. One residual defect is recorded in the affected downstream file rather than hidden: one tree's line pointers drifted after a post-QC re-stamp of its source file, flagged in the claims file that inherited it.</w:t>
       </w:r>
     </w:p>
     <w:p>
@@ -3128,7 +3108,7 @@
         <w:t xml:space="preserve">and</w:t>
       </w:r>
       <w:r>
-        <w:t xml:space="preserve"> at least 20 claims are about it — consolidation shrinks many raw claims into each cited statement, so 20 claims is roughly a lead plus two or three cited sections. Terms that fail stay in the registry as glossary candidates; nothing is deleted. </w:t>
+        <w:t xml:space="preserve"> at least 20 claims are about it — roughly a lead plus two or three cited sections after consolidation. Terms that fail stay in the registry as glossary candidates; nothing is deleted. </w:t>
       </w:r>
       <w:r>
         <w:rPr>
@@ -3694,7 +3674,7 @@
         <w:jc w:val="both"/>
       </w:pPr>
       <w:r>
-        <w:t xml:space="preserve">The batch confirmed the division of labour the hard way. On the first two keyword pages audited, </w:t>
+        <w:t xml:space="preserve">The batch confirmed the division of labour the hard way: on the first two keyword pages audited, </w:t>
       </w:r>
       <w:r>
         <w:rPr>
@@ -3704,7 +3684,7 @@
         <w:t xml:space="preserve">every quotation was character-perfect and Gate 2 still found four critical defects</w:t>
       </w:r>
       <w:r>
-        <w:t xml:space="preserve">: a divergence manufactured out of English-gloss noise over identical Tibetan, an inverted corpus fact, a citation corroborating content it does not contain, and a uniqueness claim pinned to the wrong claim ID. The deterministic gate reads characters; the audit reads meaning; neither replaces the other, and a clean quote check is never, by itself, publication-ready.</w:t>
+        <w:t xml:space="preserve"> — a divergence manufactured out of English-gloss noise over identical Tibetan, an inverted corpus fact, a citation corroborating content it does not contain, and a uniqueness claim pinned to the wrong claim ID. The deterministic gate reads characters; the audit reads meaning; neither replaces the other.</w:t>
       </w:r>
     </w:p>
     <w:p>
@@ -3757,7 +3737,7 @@
         <w:t xml:space="preserve">explain</w:t>
       </w:r>
       <w:r>
-        <w:t xml:space="preserve"> the term, echo the block's segment ID, never flatten disagreement, and write "no explanation given" (འགྲེལ་བཤད་མེད།) rather than invent. The claims prompt compresses passages into the atomic table: one verifiable fact per claim, in Tibetan; no claim without a supporting passage; conflicting positions one claim each; and </w:t>
+        <w:t xml:space="preserve"> the term, never flatten disagreement, and write "no explanation given" (འགྲེལ་བཤད་མེད།) rather than invent. The claims prompt compresses passages into the atomic table: one verifiable fact per claim, in Tibetan; no claim without a supporting passage; conflicting positions one claim each; and </w:t>
       </w:r>
       <w:r>
         <w:rPr>
@@ -3974,7 +3954,7 @@
         <w:t xml:space="preserve">The style-revision loop — reader feedback becoming executable rules.</w:t>
       </w:r>
       <w:r>
-        <w:t xml:space="preserve"> The first native-reviewer reading of the batch (the project's Tibetan linguist, joined by a Tibetan-language expert in the second round) returned six findings — three about register and review ergonomics (statements carry more citations than they need; the articles read as stitched-together claims, a literature review rather than an encyclopedia; inline reference tags make raw wikitext unreadable) and three about orthography and respect (every paragraph must close with the double shad །།; the comma does not exist in Tibetan and must not appear; commentators must be named in prose by a respectful, human-curated form of their name). Every finding became a rule in a </w:t>
+        <w:t xml:space="preserve"> The first native-reviewer reading of the batch (the project's Tibetan linguist, joined by a Tibetan-language expert in the second round) returned six findings — three about register and review ergonomics (statements carry more citations than they need; the articles read as stitched-together claims rather than an encyclopedia; inline reference tags make raw wikitext unreadable) and three about orthography and respect (every paragraph must close with the double shad །།; the comma does not exist in Tibetan and must not appear; commentators must be named by a respectful, human-curated form of their name). Every finding became a rule in a </w:t>
       </w:r>
       <w:r>
         <w:rPr>
@@ -3984,7 +3964,7 @@
         <w:t xml:space="preserve">new versioned drafting skill</w:t>
       </w:r>
       <w:r>
-        <w:t xml:space="preserve">, never an in-place edit of the shipped one: consensus statements move to plain encyclopedic voice with at most three supporting references, the full attestation list migrating to the citation trail so nothing is lost; at most two verbatim quotations per article, spent only where exact wording is the point; the punctuation contract; and a human-curated respectful-name field on every source commentary, which the model may only copy — never invent, translate, or upgrade an honorific. A small script now derives a read-only </w:t>
+        <w:t xml:space="preserve">, never an in-place edit of the shipped one: plain encyclopedic voice for consensus with at most three supporting references, the full attestation list migrating to the citation trail so nothing is lost; at most two verbatim quotations per article, spent only where exact wording is the point; the punctuation contract; and a respectful-name field on every source commentary, which the model may only copy — never invent, translate, or upgrade an honorific. A small script now derives a read-only </w:t>
       </w:r>
       <w:r>
         <w:rPr>
@@ -3994,7 +3974,7 @@
         <w:t xml:space="preserve">preview</w:t>
       </w:r>
       <w:r>
-        <w:t xml:space="preserve"> of each article with citations as footnote superscripts. The loop is deliberately gated at pilot scale: three revised pilot articles await the linguist's approval, and the corpus-wide redraft waits on that approval — never batch-redraft ahead of the human gate.</w:t>
+        <w:t xml:space="preserve"> of each article with citations as footnote superscripts. The loop is deliberately gated at pilot scale: three revised pilot articles await the linguist's approval before any corpus-wide redraft — never batch-redraft ahead of the human gate.</w:t>
       </w:r>
     </w:p>
     <w:p>
@@ -4091,7 +4071,7 @@
         <w:t xml:space="preserve">not</w:t>
       </w:r>
       <w:r>
-        <w:t xml:space="preserve"> pass, because the letters agree while the punctuation does not, which means the article is not quoting what the file says; </w:t>
+        <w:t xml:space="preserve"> pass: the letters agree but the punctuation does not, so the article is not quoting what the file says; </w:t>
       </w:r>
       <w:r>
         <w:rPr>
@@ -4159,7 +4139,7 @@
         <w:t xml:space="preserve">sic</w:t>
       </w:r>
       <w:r>
-        <w:t xml:space="preserve">-faithful to the ingested edition. In an earlier session the gate caught a model silently promoting a tsheg to a shad inside a quotation — string similarity 0.974, invisible to a human skimming Tibetan prose, and exactly the drift that makes a quotation no longer a quotation. A transcription error in the source is reproduced, never silently repaired; textual correction is an editorial act for the source layer (§4). There is no bypass flag, and an audit "publish" verdict does not skip the gate.</w:t>
+        <w:t xml:space="preserve">-faithful to the ingested edition. In an earlier session the gate caught a model silently promoting a tsheg to a shad inside a quotation — string similarity 0.974, invisible to a human skimming Tibetan prose, exactly the drift that makes a quotation no longer a quotation. A transcription error in the source is reproduced, never silently repaired (§4). There is no bypass flag, and an audit "publish" verdict does not skip the gate.</w:t>
       </w:r>
     </w:p>
     <w:p>
@@ -4375,7 +4355,7 @@
         <w:jc w:val="both"/>
       </w:pPr>
       <w:r>
-        <w:t xml:space="preserve">The reviewing surface is deliberately narrowed: the pipeline's working directories are excluded from the vault's search and graph. Honest current state: the review queue (pending → approved → published) is defined but empty; the pilot's three articles sit at </w:t>
+        <w:t xml:space="preserve">Honest current state: the review queue (pending → approved → published) is defined but empty; the pilot's three articles sit at </w:t>
       </w:r>
       <w:r>
         <w:rPr>
@@ -4431,7 +4411,7 @@
         <w:t xml:space="preserve">verified</w:t>
       </w:r>
       <w:r>
-        <w:t xml:space="preserve">, runs a pre-publication checklist (every reference resolves; no sub-consensus position in the neutral voice; no sentence combining sources into a conclusion neither states; the independent-secondary-source case restated), targets a userspace sandbox before mainspace, and carries an edit summary disclosing pipeline assistance — the Content Translation disclosure model, adopted voluntarily. Community consent precedes content: the target wiki has no local policy on machine-assisted content, and the project reads that vacuum as </w:t>
+        <w:t xml:space="preserve">, runs a pre-publication checklist, targets a userspace sandbox before mainspace, and carries an edit summary disclosing pipeline assistance — the Content Translation disclosure model, adopted voluntarily. Community consent precedes content: the target wiki has no local policy on machine-assisted content, and the project reads that vacuum as </w:t>
       </w:r>
       <w:r>
         <w:rPr>
@@ -5649,7 +5629,7 @@
         <w:t xml:space="preserve">861 of 882 quotations (97.6%) character-for-character exact</w:t>
       </w:r>
       <w:r>
-        <w:t xml:space="preserve"> — a pre-fix-pass distribution, each miss enumerated per article (two are import artifacts rather than model errors), where the pilot's 100% is the post-fix state the batch is being walked toward. This measures a different thing than the statement-support rates reported for English-language systems — WikiCrow's 86.1% citation precision is a rater's judgment that a source supports a statement; ours is character-level identity of the quoted evidence. The gate proves the quoted evidence is real and correctly located, never that it warrants the sentence citing it.</w:t>
+        <w:t xml:space="preserve"> — a pre-fix-pass distribution, each miss enumerated per article (two are import artifacts rather than model errors), where the pilot's 100% is the post-fix state the batch is being walked toward. This measures a different thing than the statement-support rates reported for English-language systems: WikiCrow's 86.1% citation precision is a rater's judgment that a source supports a statement; ours is character-level identity of the quoted evidence — proof the evidence is real and correctly located, never that it warrants the sentence citing it.</w:t>
       </w:r>
     </w:p>
     <w:p>
@@ -6207,7 +6187,7 @@
         <w:jc w:val="both"/>
       </w:pPr>
       <w:r>
-        <w:t xml:space="preserve">Two further observations belong in any honest report. The auditor shows round-to-round variance — re-auditing the fixed articles three times each gave pass rates of 0.67, 0.67 and 1.0 — so audit outcomes are reported as pass rates over repeated runs, never single verdicts. And twice the auditor </w:t>
+        <w:t xml:space="preserve">Two further observations belong in an honest report. The auditor shows round-to-round variance — re-auditing the fixed articles three times each gave pass rates of 0.67, 0.67 and 1.0 — so audit outcomes are reported as pass rates over repeated runs, never single verdicts. And twice the auditor </w:t>
       </w:r>
       <w:r>
         <w:rPr>
@@ -7022,7 +7002,7 @@
         <w:t xml:space="preserve">unaccountable volume</w:t>
       </w:r>
       <w:r>
-        <w:t xml:space="preserve">: content nobody fluent verified, at rates nobody could review, with no disclosure. Every design choice here negates one of those properties — a named human publisher, throughput bounded by review, on-wiki disclosure, verification deterministic where possible and adversarial where not, and an audit trail from every published sentence back to block-located passages. The residual risk, plainly: a fluent reviewer can still wave through a subtly wrong article. The pipeline reduces the surface a reviewer must distrust; it does not abolish editorial responsibility, and is not meant to.</w:t>
+        <w:t xml:space="preserve">: content nobody fluent verified, at rates nobody could review, with no disclosure. Every design choice here negates one of those properties — a named human publisher, throughput bounded by review, on-wiki disclosure, and an audit trail from every published sentence back to block-located passages. The residual risk, plainly: a fluent reviewer can still wave through a subtly wrong article. The pipeline reduces the surface a reviewer must distrust; it does not abolish editorial responsibility, and is not meant to.</w:t>
       </w:r>
     </w:p>
     <w:p>
@@ -7074,7 +7054,7 @@
         <w:t xml:space="preserve">Bodhicaryāvatāra</w:t>
       </w:r>
       <w:r>
-        <w:t xml:space="preserve"> (ten commentaries), and the pattern — layered canon, commentarial tradition, school structure — is the shape of Sanskrit, Pāli and classical Chinese scholasticism too. For under-resourced languages generally, the transferable design is §3's third option: machine volume, human authority, verification as the hinge — with the claims database, not the article count, as the durable asset.</w:t>
+        <w:t xml:space="preserve">, and the pattern — layered canon, commentarial tradition, school structure — is the shape of Sanskrit, Pāli and classical Chinese scholasticism too. For under-resourced languages generally, the transferable design is §3's third option: machine volume, human authority, verification as the hinge — with the claims database, not the article count, as the durable asset.</w:t>
       </w:r>
     </w:p>
     <w:p>

</xml_diff>

<commit_message>
vault backup: 2026-08-21 20:13:55
</commit_message>
<xml_diff>
--- a/4-SYSTEM/Pipelines/wikipedia/paper/draft/Expanding-the-Digital-Footprint-of-Tibetan.docx
+++ b/4-SYSTEM/Pipelines/wikipedia/paper/draft/Expanding-the-Digital-Footprint-of-Tibetan.docx
@@ -173,7 +173,7 @@
         <w:t xml:space="preserve">the sign of the feedback loop is determined by verification</w:t>
       </w:r>
       <w:r>
-        <w:t xml:space="preserve">. The evidence is a complete pipeline; a deeply audited three-article pilot; 2,975 extracted claims, 67 consolidated topic pages and a 418-citation adversarial audit; a corpus-wide batch of 66 further drafted articles; a native-speaker review loop whose findings became executable drafting rules; and, as of writing, </w:t>
+        <w:t xml:space="preserve">. The evidence: a complete pipeline; a deeply audited three-article pilot; 2,975 claims, 67 consolidated pages, a 418-citation adversarial audit; a 66-article corpus-wide batch; a native-speaker review loop whose findings became executable rules; and, as of writing, </w:t>
       </w:r>
       <w:r>
         <w:rPr>
@@ -292,7 +292,7 @@
         <w:t xml:space="preserve">LLM-to-Wikipedia systems.</w:t>
       </w:r>
       <w:r>
-        <w:t xml:space="preserve"> STORM (Shao et al. 2024) established the research→outline→draft→cite architecture and the editor-rubric evaluation we borrow. WikiChat (Semnani et al. 2023) demonstrated the grounding filter — generate freely, keep only what retrieved sources support — reaching 97%+ factual accuracy in 25 languages, Tibetan not among them. WikiCrow (FutureHouse 2024) generated cited articles for all 15,616 unnamed human genes and showed machine drafts can </w:t>
+        <w:t xml:space="preserve"> STORM (Shao et al. 2024) established the research→outline→draft→cite architecture and the editor-rubric evaluation we borrow. WikiChat (Semnani et al. 2023) demonstrated the grounding filter — generate freely, keep only what retrieved sources support — reaching 97%+ factual accuracy in 25 languages, Tibetan not among them. WikiCrow (FutureHouse 2024) generated cited articles for 15,616 human genes and showed machine drafts can </w:t>
       </w:r>
       <w:r>
         <w:rPr>
@@ -348,7 +348,7 @@
         <w:t xml:space="preserve">supports</w:t>
       </w:r>
       <w:r>
-        <w:t xml:space="preserve"> the statement; AIS-style protocols and WikiCrow's citation precision measure the last. Our deterministic gate measures something stricter and narrower: character-level identity of the quoted evidence and resolution of its block-level locator. Fidelity and support are complementary, and §8 keeps them separate. One background fact shapes the design: no NLI or attribution model supports Tibetan, so support judgment is manual by necessity — itself a datum for §1's gap argument.</w:t>
+        <w:t xml:space="preserve"> the statement; AIS-style protocols and WikiCrow's citation precision measure the last. Our deterministic gate measures something stricter and narrower: character-level identity of the quoted evidence and resolution of its block-level locator. Fidelity and support are complementary, and §8 keeps them separate. And no NLI or attribution model supports Tibetan, so support judgment is manual by necessity — itself a datum for §1's gap argument.</w:t>
       </w:r>
     </w:p>
     <w:p>
@@ -420,7 +420,7 @@
         <w:t xml:space="preserve">text</w:t>
       </w:r>
       <w:r>
-        <w:t xml:space="preserve"> for the CC BY-SA reuse Wikipedia requires — a constraint §5 turns into a design principle. On the generation side the known failure classes are hallucination, citation fabrication and close paraphrase; English Wikipedia's G15 speedy-deletion criterion (August 2025) now deletes LLM pages with fabricated or unresolvable references on sight. §5 answers each class </w:t>
+        <w:t xml:space="preserve"> for the CC BY-SA reuse Wikipedia requires — a constraint §5 turns into a design principle. On the generation side, English Wikipedia's G15 speedy-deletion criterion (August 2025) now deletes LLM pages with fabricated or unresolvable references on sight; §5 answers each known failure class — hallucination, citation fabrication, close paraphrase — </w:t>
       </w:r>
       <w:r>
         <w:rPr>
@@ -2618,7 +2618,7 @@
         <w:t xml:space="preserve">How:</w:t>
       </w:r>
       <w:r>
-        <w:t xml:space="preserve"> the root text is formatted one stanza per paragraph by a small grammar of Tibetan punctuation; each commentary is cut into citation-sized blocks by a rule engine over seven lexical boundary cues, with verse stanzas detected by their meter and peeled out whole. The safety is the no-loss gate: if the segmented text differs from the original by one non-whitespace character once whitespace is squeezed out, the script aborts and writes nothing. The residue no cue can cut goes to a human, under the stage's stated bias: "Over-long is safer than wrong."</w:t>
+        <w:t xml:space="preserve"> the root text is formatted one stanza per paragraph by a small grammar of Tibetan punctuation; each commentary is cut into citation-sized blocks by a rule engine over seven lexical boundary cues, with verse stanzas detected by their meter and peeled out whole. The safety is the no-loss gate: if the segmented text differs from the original by one non-whitespace character, the script aborts and writes nothing. The residue no cue can cut goes to a human, under the stage's stated bias: "Over-long is safer than wrong."</w:t>
       </w:r>
     </w:p>
     <w:p>
@@ -3324,7 +3324,7 @@
         <w:t xml:space="preserve">cannot</w:t>
       </w:r>
       <w:r>
-        <w:t xml:space="preserve"> import content from another commentary — each a documented failure of earlier, less isolated method runs. The orchestrator assembles replies in tree order, computes the claim count by counting, and runs the deterministic checker.</w:t>
+        <w:t xml:space="preserve"> import content from another commentary — each a documented failure of earlier, less isolated method runs.</w:t>
       </w:r>
     </w:p>
     <w:p>
@@ -3343,7 +3343,7 @@
         <w:t xml:space="preserve">114 of 118 Tibetan strings in one file byte-identical</w:t>
       </w:r>
       <w:r>
-        <w:t xml:space="preserve"> to the earlier run's, claim counts copied rather than recomputed, transcription errors inherited — and presenting a re-organisation as a second extraction hid real defects, including a cross-document contamination and a fabricated mantra promoted to canonical status. Five guards came out of that audit, among them: claim counts are computed by counting, never inherited; "stated" means the referent's verbatim name occurs in the claim's own quoted Tibetan (7 of 14 claims so tagged in one earlier file contained no form of the name); and every claim is independently re-derived.</w:t>
+        <w:t xml:space="preserve"> to the earlier run's, claim counts copied rather than recomputed, transcription errors inherited — and presenting a re-organisation as a second extraction hid real defects, including a cross-document contamination and a fabricated mantra promoted to canonical status. Five guards came out of that audit, among them: claim counts are computed by counting, never inherited; "stated" means the referent's verbatim name occurs in the claim's own quoted Tibetan; and every claim is independently re-derived.</w:t>
       </w:r>
     </w:p>
     <w:p>
@@ -3426,7 +3426,7 @@
         <w:t xml:space="preserve">Why:</w:t>
       </w:r>
       <w:r>
-        <w:t xml:space="preserve"> consolidation needs to know, for every commentary, which of its nodes hold which canonical slot. Answering that inside every topic run, as the pilot did, is quadratic in the wrong variable — sixteen commentaries × ~22 slots implied roughly 400 full-file reads of an unchanged 3.8 MB corpus. The fix is a routing index, built once and reused, recording addresses and never interpretation. Node numbering is never assumed uniform — one commentary nests a homage at 1.1.N, another at top level N, another runs all twenty-one homages inside one undivided node; that hard case is routed by </w:t>
+        <w:t xml:space="preserve"> consolidation needs to know, for every commentary, which of its nodes hold which canonical slot. Answering that inside every topic run, as the pilot did, implied roughly 400 full-file reads of an unchanged 3.8 MB corpus; the fix is a routing index, built once and reused, recording addresses and never interpretation. Node numbering is never assumed uniform — one commentary nests a homage at 1.1.N, another at top level N, another runs all twenty-one homages inside one undivided node; that hard case is routed by </w:t>
       </w:r>
       <w:r>
         <w:rPr>
@@ -3486,17 +3486,7 @@
         <w:t xml:space="preserve">Questions are generated, not authored.</w:t>
       </w:r>
       <w:r>
-        <w:t xml:space="preserve"> Two free sources: the spine, mechanically — twenty-one homages × observed facets (name, colour, implements, stance, activity, mantra, benefit) — and the extractions themselves, since every raw claim implies a question that can be asked of every other commentary. Their union makes consolidation a </w:t>
-      </w:r>
-      <w:r>
-        <w:rPr>
-          <w:b/>
-          <w:bCs/>
-        </w:rPr>
-        <w:t xml:space="preserve">derived completeness check</w:t>
-      </w:r>
-      <w:r>
-        <w:t xml:space="preserve">: free extraction first, then generated questions catch what free reading missed. A question nobody answers stays on the page marked "no commentary addresses this," never deleted.</w:t>
+        <w:t xml:space="preserve"> Two free sources: the spine, mechanically — twenty-one homages × observed facets (name, colour, implements, stance, activity, mantra, benefit) — and the extractions themselves, since every raw claim implies a question that can be asked of every other commentary. Generated questions catch what free reading missed, and a question nobody answers stays on the page marked "no commentary addresses this," never deleted.</w:t>
       </w:r>
     </w:p>
     <w:p>
@@ -3542,7 +3532,7 @@
         <w:t xml:space="preserve">Unique</w:t>
       </w:r>
       <w:r>
-        <w:t xml:space="preserve"> single-commentary claims, plus a coverage table in which silence is itself a finding. From the finished page for the first homage: a fifteen-commentary consensus on the origin narrative — Avalokiteśvara, seeing that however many beings he delivered their number never diminished, wept; from his tears a lotus grew, and Tārā arose from its opened blossom — attested independently, in each commentary's own words. Beside it, a divergence in which one side exists only as a commentator's report of unnamed "earlier commentaries," recorded as exactly that, never inflated into a live dispute. Consolidation also surfaces </w:t>
+        <w:t xml:space="preserve"> single-commentary claims, plus a coverage table in which silence is itself a finding. From the finished page for the first homage: a fifteen-commentary consensus on the origin narrative — Avalokiteśvara, seeing that however many beings he delivered their number never diminished, wept; from his tears a lotus grew, and Tārā arose from its opened blossom. Beside it, a divergence in which one side exists only as a commentator's report of unnamed "earlier commentaries," recorded as exactly that, never inflated into a live dispute. Consolidation also surfaces </w:t>
       </w:r>
       <w:r>
         <w:rPr>
@@ -3701,7 +3691,7 @@
         <w:jc w:val="both"/>
       </w:pPr>
       <w:r>
-        <w:t xml:space="preserve">Subjects arrive from §5.3 marked as machine-proposed in the registry. There is no human sign-off mid-chain; instead every judgment step leaves a full audit trail — per-term verdicts with reasons, merge mappings — so the single human review over finished articles can reject selectively rather than rerun the pipeline. Two drafting routes share one doctrine — </w:t>
+        <w:t xml:space="preserve">Subjects arrive from §5.3 marked as machine-proposed in the registry. There is no human sign-off mid-chain; every judgment step leaves an audit trail — per-term verdicts with reasons, merge mappings — so the end review can reject selectively rather than rerun the pipeline. Two drafting routes share one doctrine — </w:t>
       </w:r>
       <w:r>
         <w:rPr>
@@ -4346,7 +4336,7 @@
           <w:sz w:val="20"/>
           <w:szCs w:val="20"/>
         </w:rPr>
-        <w:t xml:space="preserve"> Every reviewer edit is a commit, comparable against what the pipeline generated.</w:t>
+        <w:t xml:space="preserve"> Every reviewer edit is a commit.</w:t>
       </w:r>
     </w:p>
     <w:p>
@@ -6269,7 +6259,7 @@
         <w:t xml:space="preserve">1.1%</w:t>
       </w:r>
       <w:r>
-        <w:t xml:space="preserve"> respectively — the model visibly budgets its answer against the size of the question. Measured directly, the same model on the same prompt returned ten passages totalling 873 characters when given 93,000 characters of context, and twenty totalling 5,224 when given 12,000. The fix is architectural — batch the question smaller rather than shout louder in the prompt — and the node-by-node claims extraction of §5.4 applies exactly that lesson. Everything downstream is tight: 100% of extracted quotes character-exact at extract time, 100% of passages used by at least one claim, zero claims dropped at parse, 100% of claims placed by the outline and cited in the draft.</w:t>
+        <w:t xml:space="preserve"> respectively — the model visibly budgets its answer against the size of the question. Measured directly, the same model on the same prompt returned ten passages totalling 873 characters when given 93,000 characters of context, and twenty totalling 5,224 when given 12,000. The fix is architectural — batch the question smaller rather than shout louder in the prompt — and the node-by-node claims extraction of §5.4 applies exactly that lesson. Everything downstream is tight: 100% of extracted quotes character-exact at extract time, 100% of passages used, zero claims dropped, 100% of claims placed and cited.</w:t>
       </w:r>
     </w:p>
     <w:p>
@@ -6285,7 +6275,7 @@
         <w:t xml:space="preserve">Pipeline statistics (pilot, on disk).</w:t>
       </w:r>
       <w:r>
-        <w:t xml:space="preserve"> Three articles, generated end-to-end in roughly 10–20 wall-clock minutes each: 81 extracted passages → 47 atomic claims (13 consensus / 13 school-position / 21 single-commentator) → 81 rendered citations, drawing on 5, 16 and 10 distinct commentaries respectively and citing all 16 at least once across the three. All three end at </w:t>
+        <w:t xml:space="preserve"> Three articles, generated end-to-end in roughly 10–20 wall-clock minutes each: 81 extracted passages → 47 atomic claims (13 consensus / 13 school-position / 21 single-commentator) → 81 rendered citations, citing all 16 commentaries at least once across the three. All three end at </w:t>
       </w:r>
       <w:r>
         <w:rPr>
@@ -6305,7 +6295,7 @@
         <w:t xml:space="preserve">deterministic gate: PASS</w:t>
       </w:r>
       <w:r>
-        <w:t xml:space="preserve">. Article lengths 642–1,358 syllables — below the 1,500 target, a known extraction-volume limitation under active tuning.</w:t>
+        <w:t xml:space="preserve">. Article lengths 642–1,358 syllables — below the 1,500 target, a known extraction-volume limitation.</w:t>
       </w:r>
     </w:p>
     <w:p>
@@ -6331,7 +6321,7 @@
         <w:t xml:space="preserve">43 term articles and 23 slot articles were drafted; one subject was refused for lack of citable claims</w:t>
       </w:r>
       <w:r>
-        <w:t xml:space="preserve"> — the refusal itself evidence that the claims-only rule binds. 42 articles are imported and batch-verified (the fidelity distribution above; validator detail in §5.9). The per-article audit stage and the second consolidation gate have run over only part of the batch — and where the consolidation audit ran, it found four critical meaning-level defects on pages whose quotations were all character-perfect (§5.7), the batch's own confirmation of RQ2. The native-reviewer loop is mid-flight: three style-revised pilot articles await linguist approval before the corpus-wide redraft. Batch audit pass rates, reviewer-minutes, and rubric ratings remain </w:t>
+        <w:t xml:space="preserve"> — the refusal itself evidence that the claims-only rule binds. 42 articles are imported and batch-verified (the fidelity distribution above; validator detail in §5.9). The per-article audit stage and the second consolidation gate have run over only part of the batch — and where the consolidation audit ran, it found four critical meaning-level defects on pages whose quotations were all character-perfect (§5.7), the batch's own confirmation of RQ2. Batch audit pass rates, reviewer-minutes, and rubric ratings remain </w:t>
       </w:r>
       <w:r>
         <w:rPr>
@@ -7071,7 +7061,7 @@
         <w:jc w:val="both"/>
       </w:pPr>
       <w:r>
-        <w:t xml:space="preserve">The cycle this paper set out to enter — articles → digital footprint → training data → better tools → faster articles — runs today in the wrong direction for Tibetan: absence begetting absence, and, on other small wikis, machine junk begetting model junk. We have shown a working pipeline built to flip that sign: structure extracted in isolated passes behind deterministic checkers; claims extracted node-by-node under measured guards; consolidation audited twice, once by script and once by an adversarial fresh context; articles drafted from claims alone; a character-exact gate no model verdict can waive; native-reviewer feedback versioned into the drafting rules themselves; and a human hand, working in the corpus itself, on the only switch that publishes. The per-article artifacts are small; the machine they came from is not — a reusable editorial system whose every safeguard is a testable invariant, and a growing claims database over the commentarial tradition that is a research object for Tibetan studies regardless of what Wikipedia becomes. The answer to the gap named in the opening is neither refusal nor flood, but verification with a human hand on the gate.</w:t>
+        <w:t xml:space="preserve">The cycle this paper set out to enter — articles → digital footprint → training data → better tools → faster articles — runs today in the wrong direction for Tibetan: absence begetting absence, and, on other small wikis, machine junk begetting model junk. We have shown a working pipeline built to flip that sign: structure extracted in isolated passes behind deterministic checkers; claims extracted node-by-node under measured guards; consolidation audited twice, once by script and once by an adversarial fresh context; articles drafted from claims alone; a character-exact gate no model verdict can waive; native-reviewer feedback versioned into the drafting rules themselves; and a human hand, working in the corpus itself, on the only switch that publishes. The per-article artifacts are small; the machine they came from is not — a reusable editorial system whose every safeguard is a testable invariant, and a claims database that is a research object for Tibetan studies regardless of what Wikipedia becomes. The answer to the gap named in the opening is neither refusal nor flood, but verification with a human hand on the gate.</w:t>
       </w:r>
     </w:p>
     <w:p>

</xml_diff>

<commit_message>
vault backup: 2026-08-23 13:34:11
</commit_message>
<xml_diff>
--- a/4-SYSTEM/Pipelines/wikipedia/paper/draft/Expanding-the-Digital-Footprint-of-Tibetan.docx
+++ b/4-SYSTEM/Pipelines/wikipedia/paper/draft/Expanding-the-Digital-Footprint-of-Tibetan.docx
@@ -3717,7 +3717,7 @@
         <w:t xml:space="preserve">Route A: the per-term chain</w:t>
       </w:r>
       <w:r>
-        <w:t xml:space="preserve"> (extract → claims → outline → draft → audit) produced the audited pilot's three articles (སྒྲོལ་མ "Tārā"; འཇིག་རྟེན་གསུམ "the three worlds"; སྡུག་བསྔལ "suffering"), one artifact per stage, every stage's model and prompt version pinned in a per-article record. Its extraction stage drew candidate passages from a verse-alignment layer that located, for each root stanza, the commentary span explaining it; that layer has since been retired — the node-by-node claims layer of §5.4 supersedes it, and nothing in the production path consumes alignment data. The pilot's evidence does not depend on the retired locator: every quotation is re-verified character-for-character by the gate regardless of how its passage was found. The extraction prompt is written in Tibetan, and its first rule is the contract: quote character-for-character (ཡི་གེ་གཅིག་ཀྱང་བསྒྱུར་བ་དང་། བསྡུ་བ་དང་། ཚིག་སྒྱུར་བྱེད་མི་ཆོག — "not one letter may be changed, condensed, or paraphrased"), with the warning that a machine will check every letter; the rest require passages that </w:t>
+        <w:t xml:space="preserve"> (extract → claims → outline → draft → audit) produced the audited pilot's three articles (སྒྲོལ་མ "Tārā"; འཇིག་རྟེན་གསུམ "the three worlds"; སྡུག་བསྔལ "suffering"), one artifact per stage, every stage's model and prompt version pinned in a per-article record. The extraction prompt is written in Tibetan, and its first rule is the contract: quote character-for-character (ཡི་གེ་གཅིག་ཀྱང་བསྒྱུར་བ་དང་། བསྡུ་བ་དང་། ཚིག་སྒྱུར་བྱེད་མི་ཆོག — "not one letter may be changed, condensed, or paraphrased"), with the warning that a machine will check every letter; the rest require passages that </w:t>
       </w:r>
       <w:r>
         <w:rPr>
@@ -6249,7 +6249,7 @@
         <w:t xml:space="preserve">extraction capture.</w:t>
       </w:r>
       <w:r>
-        <w:t xml:space="preserve"> The pilot's passage-location layer offered 18k, 41k and 165k characters of commentary for the three terms; extraction captured 45%, 19% and </w:t>
+        <w:t xml:space="preserve"> The pilot's extraction stage was offered 18k, 41k and 165k characters of commentary for the three terms; it captured 45%, 19% and </w:t>
       </w:r>
       <w:r>
         <w:rPr>

</xml_diff>

<commit_message>
vault backup: 2026-08-26 12:12:59
</commit_message>
<xml_diff>
--- a/4-SYSTEM/Pipelines/wikipedia/paper/draft/Expanding-the-Digital-Footprint-of-Tibetan.docx
+++ b/4-SYSTEM/Pipelines/wikipedia/paper/draft/Expanding-the-Digital-Footprint-of-Tibetan.docx
@@ -37,7 +37,7 @@
           <w:sz w:val="20"/>
           <w:szCs w:val="20"/>
         </w:rPr>
-        <w:t xml:space="preserve">Working draft, 21 August 2026 — evaluation slots that await team data are marked [TO FILL]</w:t>
+        <w:t xml:space="preserve">Final draft, 24 August 2026</w:t>
       </w:r>
     </w:p>
     <w:p>
@@ -63,7 +63,7 @@
         <w:t xml:space="preserve">Praise to the Twenty-One Tārās</w:t>
       </w:r>
       <w:r>
-        <w:t xml:space="preserve"> with sixteen Tibetan commentaries, producing 2,975 typed, source-anchored claims, 67 consolidated topic pages, and 69 drafted articles, with native-speaker review feeding style rules back into the drafting step. In the audited pilot, all 81 quotations across three articles verify character-for-character against their cited sources, and an independent cross-model audit caught five blocking errors a same-model audit had passed; across the corpus-wide batch, 861 of 882 quotations (97.6%) verify character-for-character. We argue that the difference between machine content that degrades small-language wikis and machine content that revives them is a single variable: verification before publication, with a human hand on the gate. The pipeline's by-product — a typed, school-tagged, block-located claims database over the commentarial corpus — is a research artifact for Tibetan studies independent of Wikipedia.</w:t>
+        <w:t xml:space="preserve"> with sixteen Tibetan commentaries, producing 2,975 typed, source-anchored claims, 67 consolidated topic pages, and 68 drafted articles, with native-speaker review feeding style rules back into the drafting step. In the audited pilot all 81 quotations verify character-for-character against their cited sources, and an independent cross-model audit caught five blocking errors a same-model audit had passed; after native-speaker review drove a corpus-wide style revision, the re-run gate verifies all 216 quotations (100%) across the 65 drafted articles. As of 23 August 2026 the first 40 reviewed articles — the complete twenty-one-Tārā series among them — are live on the Tibetan Wikipedia, published by a named human editor with the pipeline disclosed in every edit summary. We argue that the difference between machine content that degrades small-language wikis and machine content that revives them is a single variable: verification before publication, with a human hand on the gate. The pipeline's by-product — a typed, school-tagged, block-located claims database over the commentarial corpus — is a research artifact for Tibetan studies independent of Wikipedia.</w:t>
       </w:r>
     </w:p>
     <w:p>
@@ -173,14 +173,251 @@
         <w:t xml:space="preserve">the sign of the feedback loop is determined by verification</w:t>
       </w:r>
       <w:r>
-        <w:t xml:space="preserve">. The evidence: a complete pipeline; a deeply audited three-article pilot; 2,975 claims, 67 consolidated pages, a 418-citation adversarial audit; a 66-article corpus-wide batch; a native-speaker review loop whose findings became executable rules; and, as of writing, </w:t>
-      </w:r>
-      <w:r>
-        <w:rPr>
-          <w:b/>
-          <w:bCs/>
-        </w:rPr>
-        <w:t xml:space="preserve">nothing yet published to the live wiki</w:t>
+        <w:t xml:space="preserve">. The evidence: a complete pipeline; a deeply audited three-article pilot; 2,975 claims, 67 consolidated pages, a 418-citation adversarial audit; a 65-article corpus-wide batch; a native-speaker review loop whose findings became executable rules; and — only after every one of those layers had run — a first tranche of </w:t>
+      </w:r>
+      <w:r>
+        <w:rPr>
+          <w:b/>
+          <w:bCs/>
+        </w:rPr>
+        <w:t xml:space="preserve">40 human-reviewed articles live on the Tibetan Wikipedia</w:t>
+      </w:r>
+      <w:r>
+        <w:t xml:space="preserve"> (21–23 August 2026).</w:t>
+      </w:r>
+    </w:p>
+    <w:p>
+      <w:pPr>
+        <w:spacing w:after="120" w:line="252"/>
+        <w:jc w:val="both"/>
+      </w:pPr>
+      <w:r>
+        <w:rPr>
+          <w:i/>
+          <w:iCs/>
+        </w:rPr>
+        <w:t xml:space="preserve">[Figure 1 near here: the feedback loop with its sign — the doom spiral against the verified cycle (cited articles → digital footprint → better tools → faster articles).]</w:t>
+      </w:r>
+    </w:p>
+    <w:p>
+      <w:pPr>
+        <w:spacing w:after="120" w:line="252"/>
+        <w:jc w:val="both"/>
+      </w:pPr>
+      <w:r>
+        <w:rPr>
+          <w:b/>
+          <w:bCs/>
+        </w:rPr>
+        <w:t xml:space="preserve">Contributions.</w:t>
+      </w:r>
+      <w:r>
+        <w:t xml:space="preserve"> (1) A working end-to-end pipeline: raw OCR → block-addressable sources → structural trees → atomic claims → consolidated topic pages → cited Tibetan wikitext, behind a deterministic character-exact verification gate (§5). (2) A measured negative result about self-evaluation: a same-model audit returned "publish, no findings" on drafts in which an independent cross-model audit found five blocking errors (§8). (3) An adversarial-audit error taxonomy — from a re-check of all 418 citations on three consolidated pages — converted wholesale into executable rules and two standing gates (§5.7, §8). (4) The claims database itself as a dataset (§7). (5) A transferable design pattern for under-resourced languages: model judgment everywhere, model authority nowhere (§9).</w:t>
+      </w:r>
+    </w:p>
+    <w:p>
+      <w:pPr>
+        <w:spacing w:after="120" w:line="252"/>
+        <w:jc w:val="both"/>
+      </w:pPr>
+      <w:r>
+        <w:rPr>
+          <w:b/>
+          <w:bCs/>
+        </w:rPr>
+        <w:t xml:space="preserve">Research questions.</w:t>
+      </w:r>
+      <w:r>
+        <w:t xml:space="preserve"> RQ1 (</w:t>
+      </w:r>
+      <w:r>
+        <w:rPr>
+          <w:i/>
+          <w:iCs/>
+        </w:rPr>
+        <w:t xml:space="preserve">fidelity</w:t>
+      </w:r>
+      <w:r>
+        <w:t xml:space="preserve">): can an LLM pipeline produce Tibetan encyclopedic text whose every quotation and locator is verifiably real — by construction, not by sampling? RQ2 (</w:t>
+      </w:r>
+      <w:r>
+        <w:rPr>
+          <w:i/>
+          <w:iCs/>
+        </w:rPr>
+        <w:t xml:space="preserve">layered verification</w:t>
+      </w:r>
+      <w:r>
+        <w:t xml:space="preserve">): what do independent verification layers catch that a single check, especially a same-model check, misses? RQ3 (</w:t>
+      </w:r>
+      <w:r>
+        <w:rPr>
+          <w:i/>
+          <w:iCs/>
+        </w:rPr>
+        <w:t xml:space="preserve">economics</w:t>
+      </w:r>
+      <w:r>
+        <w:t xml:space="preserve">): does supervised automation change the review-time arithmetic enough to make a small-language encyclopedia reachable within a generation? §8 answers them in order — RQ1 and RQ2 with measured results, RQ3 with the machine side measured and the human side stated as the assumption the next measured review batch must replace.</w:t>
+      </w:r>
+    </w:p>
+    <w:p>
+      <w:pPr>
+        <w:pStyle w:val="Heading1"/>
+      </w:pPr>
+      <w:r>
+        <w:t xml:space="preserve">2. Related work</w:t>
+      </w:r>
+    </w:p>
+    <w:p>
+      <w:pPr>
+        <w:spacing w:after="120" w:line="252"/>
+        <w:jc w:val="both"/>
+      </w:pPr>
+      <w:r>
+        <w:rPr>
+          <w:b/>
+          <w:bCs/>
+        </w:rPr>
+        <w:t xml:space="preserve">LLM-to-Wikipedia systems.</w:t>
+      </w:r>
+      <w:r>
+        <w:t xml:space="preserve"> STORM (Shao et al. 2024) established the research→outline→draft→cite architecture and the editor-rubric evaluation we borrow. WikiChat (Semnani et al. 2023) demonstrated the grounding filter — generate freely, keep only what retrieved sources support — reaching 97%+ factual accuracy in 25 languages, Tibetan not among them. WikiCrow (FutureHouse 2024) generated cited articles for 15,616 human genes and showed machine drafts can </w:t>
+      </w:r>
+      <w:r>
+        <w:rPr>
+          <w:i/>
+          <w:iCs/>
+        </w:rPr>
+        <w:t xml:space="preserve">out-cite</w:t>
+      </w:r>
+      <w:r>
+        <w:t xml:space="preserve"> human baselines: 86.1% citation precision against 71.2% for human Wikipedia articles in the 2024 PaperQA2 evaluation, with 13.5% of cited statements unsupported (its December 2023 demo separately reported a 9% incorrect-statement rate — a different metric from a different year). XWikiGen and OutlineGen are the closest low-resource precedents, without citation grounding or a human loop. No published system does citation-aligned LLM article generation for Tibetan; the contribution here is the combination.</w:t>
+      </w:r>
+    </w:p>
+    <w:p>
+      <w:pPr>
+        <w:spacing w:after="120" w:line="252"/>
+        <w:jc w:val="both"/>
+      </w:pPr>
+      <w:r>
+        <w:rPr>
+          <w:b/>
+          <w:bCs/>
+        </w:rPr>
+        <w:t xml:space="preserve">Attribution and grounding evaluation.</w:t>
+      </w:r>
+      <w:r>
+        <w:t xml:space="preserve"> The evaluation literature distinguishes whether a citation </w:t>
+      </w:r>
+      <w:r>
+        <w:rPr>
+          <w:i/>
+          <w:iCs/>
+        </w:rPr>
+        <w:t xml:space="preserve">exists</w:t>
+      </w:r>
+      <w:r>
+        <w:t xml:space="preserve">, whether it </w:t>
+      </w:r>
+      <w:r>
+        <w:rPr>
+          <w:i/>
+          <w:iCs/>
+        </w:rPr>
+        <w:t xml:space="preserve">resolves</w:t>
+      </w:r>
+      <w:r>
+        <w:t xml:space="preserve">, and whether the cited source </w:t>
+      </w:r>
+      <w:r>
+        <w:rPr>
+          <w:i/>
+          <w:iCs/>
+        </w:rPr>
+        <w:t xml:space="preserve">supports</w:t>
+      </w:r>
+      <w:r>
+        <w:t xml:space="preserve"> the statement; AIS-style protocols and WikiCrow's citation precision measure the last. Our deterministic gate measures something stricter and narrower: character-level identity of the quoted evidence and resolution of its block-level locator. Fidelity and support are complementary, and §8 keeps them separate. And no NLI or attribution model supports Tibetan, so support judgment is manual by necessity — itself a datum for §1's gap argument.</w:t>
+      </w:r>
+    </w:p>
+    <w:p>
+      <w:pPr>
+        <w:spacing w:after="120" w:line="252"/>
+        <w:jc w:val="both"/>
+      </w:pPr>
+      <w:r>
+        <w:rPr>
+          <w:b/>
+          <w:bCs/>
+        </w:rPr>
+        <w:t xml:space="preserve">Wikipedia and under-resourced languages.</w:t>
+      </w:r>
+      <w:r>
+        <w:t xml:space="preserve"> The honest half of this literature is a failure catalogue, and we cite it before our reviewers do. Scots Wikipedia: roughly 23,000 articles written by one enthusiastic non-speaker, credibility destroyed. Cebuano: six million bot stubs and recurring closure proposals. Greenlandic Wikipedia: </w:t>
+      </w:r>
+      <w:r>
+        <w:rPr>
+          <w:i/>
+          <w:iCs/>
+        </w:rPr>
+        <w:t xml:space="preserve">closed by the Language Committee in 2025</w:t>
+      </w:r>
+      <w:r>
+        <w:t xml:space="preserve"> over machine-generated content; Inuktitut estimated two-thirds contaminated by machine translation; several African-language wikis at 40–60% uncorrected machine translation (MIT Technology Review, September 2025). Thompson et al. (2024) found a startling share of all low-resource web text is already machine-translation junk, and Shumailov et al. (2024) showed models collapse when trained recursively on synthetic data — with the nuance that </w:t>
+      </w:r>
+      <w:r>
+        <w:rPr>
+          <w:i/>
+          <w:iCs/>
+        </w:rPr>
+        <w:t xml:space="preserve">replacement</w:t>
+      </w:r>
+      <w:r>
+        <w:t xml:space="preserve">, not accumulation, drives collapse. Against this: Content Translation articles — machine draft plus mandatory human edit — show </w:t>
+      </w:r>
+      <w:r>
+        <w:rPr>
+          <w:i/>
+          <w:iCs/>
+        </w:rPr>
+        <w:t xml:space="preserve">lower</w:t>
+      </w:r>
+      <w:r>
+        <w:t xml:space="preserve"> deletion rates than from-scratch articles across 2.4M+ creations. The failure mode and the working mode differ in exactly one variable: verification before publication. The positive precedents — Welsh policy, the Dzongkha Wikipedia Education Program (§3), Masakhane's participatory model — all keep speakers in charge of what ships.</w:t>
+      </w:r>
+    </w:p>
+    <w:p>
+      <w:pPr>
+        <w:spacing w:after="120" w:line="252"/>
+        <w:jc w:val="both"/>
+      </w:pPr>
+      <w:r>
+        <w:rPr>
+          <w:b/>
+          <w:bCs/>
+        </w:rPr>
+        <w:t xml:space="preserve">Tibetan digital infrastructure, and the risks of LLM-assisted writing.</w:t>
+      </w:r>
+      <w:r>
+        <w:t xml:space="preserve"> The pipeline consumes, rather than duplicates, two decades of Tibetan digital philology: BDRC, OpenPecha, ACIP, Adarsha and the translation libraries (84000, Lotsawa House). These are the citation targets of §7's data model; none of them, however, licenses its </w:t>
+      </w:r>
+      <w:r>
+        <w:rPr>
+          <w:i/>
+          <w:iCs/>
+        </w:rPr>
+        <w:t xml:space="preserve">text</w:t>
+      </w:r>
+      <w:r>
+        <w:t xml:space="preserve"> for the CC BY-SA reuse Wikipedia requires — a constraint §5 turns into a design principle. On the generation side, English Wikipedia's G15 speedy-deletion criterion (August 2025) now deletes LLM pages with fabricated or unresolvable references on sight; §5 answers each known failure class — hallucination, citation fabrication, close paraphrase — </w:t>
+      </w:r>
+      <w:r>
+        <w:rPr>
+          <w:i/>
+          <w:iCs/>
+        </w:rPr>
+        <w:t xml:space="preserve">by construction</w:t>
       </w:r>
       <w:r>
         <w:t xml:space="preserve">.</w:t>
@@ -188,256 +425,9 @@
     </w:p>
     <w:p>
       <w:pPr>
-        <w:spacing w:after="120" w:line="252"/>
-        <w:jc w:val="both"/>
-      </w:pPr>
-      <w:r>
-        <w:rPr>
-          <w:i/>
-          <w:iCs/>
-        </w:rPr>
-        <w:t xml:space="preserve">[Figure 1 near here: the feedback loop with its sign — the doom spiral against the verified cycle (cited articles → digital footprint → better tools → faster articles).]</w:t>
-      </w:r>
-    </w:p>
-    <w:p>
-      <w:pPr>
-        <w:spacing w:after="120" w:line="252"/>
-        <w:jc w:val="both"/>
-      </w:pPr>
-      <w:r>
-        <w:rPr>
-          <w:b/>
-          <w:bCs/>
-        </w:rPr>
-        <w:t xml:space="preserve">Contributions.</w:t>
-      </w:r>
-      <w:r>
-        <w:t xml:space="preserve"> (1) A working end-to-end pipeline: raw OCR → block-addressable sources → structural trees → atomic claims → consolidated topic pages → cited Tibetan wikitext, behind a deterministic character-exact verification gate (§5). (2) A measured negative result about self-evaluation: a same-model audit returned "publish, no findings" on drafts in which an independent cross-model audit found five blocking errors (§8). (3) An adversarial-audit error taxonomy — from a re-check of all 418 citations on three consolidated pages — converted wholesale into executable rules and two standing gates (§5.7, §8). (4) The claims database itself as a dataset (§7). (5) A transferable design pattern for under-resourced languages: model judgment everywhere, model authority nowhere (§9).</w:t>
-      </w:r>
-    </w:p>
-    <w:p>
-      <w:pPr>
-        <w:spacing w:after="120" w:line="252"/>
-        <w:jc w:val="both"/>
-      </w:pPr>
-      <w:r>
-        <w:rPr>
-          <w:b/>
-          <w:bCs/>
-        </w:rPr>
-        <w:t xml:space="preserve">Research questions.</w:t>
-      </w:r>
-      <w:r>
-        <w:t xml:space="preserve"> RQ1 (</w:t>
-      </w:r>
-      <w:r>
-        <w:rPr>
-          <w:i/>
-          <w:iCs/>
-        </w:rPr>
-        <w:t xml:space="preserve">fidelity</w:t>
-      </w:r>
-      <w:r>
-        <w:t xml:space="preserve">): can an LLM pipeline produce Tibetan encyclopedic text whose every quotation and locator is verifiably real — by construction, not by sampling? RQ2 (</w:t>
-      </w:r>
-      <w:r>
-        <w:rPr>
-          <w:i/>
-          <w:iCs/>
-        </w:rPr>
-        <w:t xml:space="preserve">layered verification</w:t>
-      </w:r>
-      <w:r>
-        <w:t xml:space="preserve">): what do independent verification layers catch that a single check, especially a same-model check, misses? RQ3 (</w:t>
-      </w:r>
-      <w:r>
-        <w:rPr>
-          <w:i/>
-          <w:iCs/>
-        </w:rPr>
-        <w:t xml:space="preserve">economics</w:t>
-      </w:r>
-      <w:r>
-        <w:t xml:space="preserve">): does supervised automation change the review-time arithmetic enough to make a small-language encyclopedia reachable within a generation? §8 answers them in order — RQ1 and RQ2 with measured results, RQ3 with the machine side measured and a boxed </w:t>
-      </w:r>
-      <w:r>
-        <w:rPr>
-          <w:b/>
-          <w:bCs/>
-        </w:rPr>
-        <w:t xml:space="preserve">[TO FILL]</w:t>
-      </w:r>
-      <w:r>
-        <w:t xml:space="preserve"> for the human side.</w:t>
-      </w:r>
-    </w:p>
-    <w:p>
-      <w:pPr>
         <w:pStyle w:val="Heading1"/>
       </w:pPr>
       <w:r>
-        <w:t xml:space="preserve">2. Related work</w:t>
-      </w:r>
-    </w:p>
-    <w:p>
-      <w:pPr>
-        <w:spacing w:after="120" w:line="252"/>
-        <w:jc w:val="both"/>
-      </w:pPr>
-      <w:r>
-        <w:rPr>
-          <w:b/>
-          <w:bCs/>
-        </w:rPr>
-        <w:t xml:space="preserve">LLM-to-Wikipedia systems.</w:t>
-      </w:r>
-      <w:r>
-        <w:t xml:space="preserve"> STORM (Shao et al. 2024) established the research→outline→draft→cite architecture and the editor-rubric evaluation we borrow. WikiChat (Semnani et al. 2023) demonstrated the grounding filter — generate freely, keep only what retrieved sources support — reaching 97%+ factual accuracy in 25 languages, Tibetan not among them. WikiCrow (FutureHouse 2024) generated cited articles for 15,616 human genes and showed machine drafts can </w:t>
-      </w:r>
-      <w:r>
-        <w:rPr>
-          <w:i/>
-          <w:iCs/>
-        </w:rPr>
-        <w:t xml:space="preserve">out-cite</w:t>
-      </w:r>
-      <w:r>
-        <w:t xml:space="preserve"> human baselines: 86.1% citation precision against 71.2% for human Wikipedia articles in the 2024 PaperQA2 evaluation, with 13.5% of cited statements unsupported (its December 2023 demo separately reported a 9% incorrect-statement rate — a different metric from a different year). XWikiGen and OutlineGen are the closest low-resource precedents, without citation grounding or a human loop. No published system does citation-aligned LLM article generation for Tibetan; the contribution here is the combination.</w:t>
-      </w:r>
-    </w:p>
-    <w:p>
-      <w:pPr>
-        <w:spacing w:after="120" w:line="252"/>
-        <w:jc w:val="both"/>
-      </w:pPr>
-      <w:r>
-        <w:rPr>
-          <w:b/>
-          <w:bCs/>
-        </w:rPr>
-        <w:t xml:space="preserve">Attribution and grounding evaluation.</w:t>
-      </w:r>
-      <w:r>
-        <w:t xml:space="preserve"> The evaluation literature distinguishes whether a citation </w:t>
-      </w:r>
-      <w:r>
-        <w:rPr>
-          <w:i/>
-          <w:iCs/>
-        </w:rPr>
-        <w:t xml:space="preserve">exists</w:t>
-      </w:r>
-      <w:r>
-        <w:t xml:space="preserve">, whether it </w:t>
-      </w:r>
-      <w:r>
-        <w:rPr>
-          <w:i/>
-          <w:iCs/>
-        </w:rPr>
-        <w:t xml:space="preserve">resolves</w:t>
-      </w:r>
-      <w:r>
-        <w:t xml:space="preserve">, and whether the cited source </w:t>
-      </w:r>
-      <w:r>
-        <w:rPr>
-          <w:i/>
-          <w:iCs/>
-        </w:rPr>
-        <w:t xml:space="preserve">supports</w:t>
-      </w:r>
-      <w:r>
-        <w:t xml:space="preserve"> the statement; AIS-style protocols and WikiCrow's citation precision measure the last. Our deterministic gate measures something stricter and narrower: character-level identity of the quoted evidence and resolution of its block-level locator. Fidelity and support are complementary, and §8 keeps them separate. And no NLI or attribution model supports Tibetan, so support judgment is manual by necessity — itself a datum for §1's gap argument.</w:t>
-      </w:r>
-    </w:p>
-    <w:p>
-      <w:pPr>
-        <w:spacing w:after="120" w:line="252"/>
-        <w:jc w:val="both"/>
-      </w:pPr>
-      <w:r>
-        <w:rPr>
-          <w:b/>
-          <w:bCs/>
-        </w:rPr>
-        <w:t xml:space="preserve">Wikipedia and under-resourced languages.</w:t>
-      </w:r>
-      <w:r>
-        <w:t xml:space="preserve"> The honest half of this literature is a failure catalogue, and we cite it before our reviewers do. Scots Wikipedia: roughly 23,000 articles written by one enthusiastic non-speaker, credibility destroyed. Cebuano: six million bot stubs and recurring closure proposals. Greenlandic Wikipedia: </w:t>
-      </w:r>
-      <w:r>
-        <w:rPr>
-          <w:i/>
-          <w:iCs/>
-        </w:rPr>
-        <w:t xml:space="preserve">closed by the Language Committee in 2025</w:t>
-      </w:r>
-      <w:r>
-        <w:t xml:space="preserve"> over machine-generated content; Inuktitut estimated two-thirds contaminated by machine translation; several African-language wikis at 40–60% uncorrected machine translation (MIT Technology Review, September 2025). Thompson et al. (2024) found a startling share of all low-resource web text is already machine-translation junk, and Shumailov et al. (2024) showed models collapse when trained recursively on synthetic data — with the nuance that </w:t>
-      </w:r>
-      <w:r>
-        <w:rPr>
-          <w:i/>
-          <w:iCs/>
-        </w:rPr>
-        <w:t xml:space="preserve">replacement</w:t>
-      </w:r>
-      <w:r>
-        <w:t xml:space="preserve">, not accumulation, drives collapse. Against this: Content Translation articles — machine draft plus mandatory human edit — show </w:t>
-      </w:r>
-      <w:r>
-        <w:rPr>
-          <w:i/>
-          <w:iCs/>
-        </w:rPr>
-        <w:t xml:space="preserve">lower</w:t>
-      </w:r>
-      <w:r>
-        <w:t xml:space="preserve"> deletion rates than from-scratch articles across 2.4M+ creations. The failure mode and the working mode differ in exactly one variable: verification before publication. The positive precedents — Welsh policy, the Dzongkha Wikipedia Education Program (§3), Masakhane's participatory model — all keep speakers in charge of what ships.</w:t>
-      </w:r>
-    </w:p>
-    <w:p>
-      <w:pPr>
-        <w:spacing w:after="120" w:line="252"/>
-        <w:jc w:val="both"/>
-      </w:pPr>
-      <w:r>
-        <w:rPr>
-          <w:b/>
-          <w:bCs/>
-        </w:rPr>
-        <w:t xml:space="preserve">Tibetan digital infrastructure, and the risks of LLM-assisted writing.</w:t>
-      </w:r>
-      <w:r>
-        <w:t xml:space="preserve"> The pipeline consumes, rather than duplicates, two decades of Tibetan digital philology: BDRC, OpenPecha, ACIP, Adarsha and the translation libraries (84000, Lotsawa House). These are the citation targets of §7's data model; none of them, however, licenses its </w:t>
-      </w:r>
-      <w:r>
-        <w:rPr>
-          <w:i/>
-          <w:iCs/>
-        </w:rPr>
-        <w:t xml:space="preserve">text</w:t>
-      </w:r>
-      <w:r>
-        <w:t xml:space="preserve"> for the CC BY-SA reuse Wikipedia requires — a constraint §5 turns into a design principle. On the generation side, English Wikipedia's G15 speedy-deletion criterion (August 2025) now deletes LLM pages with fabricated or unresolvable references on sight; §5 answers each known failure class — hallucination, citation fabrication, close paraphrase — </w:t>
-      </w:r>
-      <w:r>
-        <w:rPr>
-          <w:i/>
-          <w:iCs/>
-        </w:rPr>
-        <w:t xml:space="preserve">by construction</w:t>
-      </w:r>
-      <w:r>
-        <w:t xml:space="preserve">.</w:t>
-      </w:r>
-    </w:p>
-    <w:p>
-      <w:pPr>
-        <w:pStyle w:val="Heading1"/>
-      </w:pPr>
-      <w:r>
         <w:t xml:space="preserve">3. Why automation at all: the three options</w:t>
       </w:r>
     </w:p>
@@ -463,17 +453,7 @@
         <w:t xml:space="preserve">By hand.</w:t>
       </w:r>
       <w:r>
-        <w:t xml:space="preserve"> The manual mode's throughput on the Tibetan Wikipedia is public record: roughly 350 new articles a year since 2020, some thirty active editors in a typical month — and, eighteen years after founding, a total the size of a single English-language WikiProject. Organized effort does not escape the arithmetic: the Dzongkha program took institutional backing, dozens of trained participants and five months to produce about eighty articles. The authors' own editor-training programs for Tibetan Wikipedia point the same way </w:t>
-      </w:r>
-      <w:r>
-        <w:rPr>
-          <w:b/>
-          <w:bCs/>
-        </w:rPr>
-        <w:t xml:space="preserve">[TO FILL: workshop counts, dates, cohort sizes, retention]</w:t>
-      </w:r>
-      <w:r>
-        <w:t xml:space="preserve">. At the measured rate, a minimally serviceable encyclopedia — call it 100,000 articles — is more than two centuries away. This is not a criticism of the editors; it is the measured capacity of the manual-only mode.</w:t>
+        <w:t xml:space="preserve"> The manual mode's throughput on the Tibetan Wikipedia is public record: roughly 350 new articles a year since 2020, some thirty active editors in a typical month — and, eighteen years after founding, a total the size of a single English-language WikiProject. Organized effort does not escape the arithmetic: the Dzongkha program took institutional backing, dozens of trained participants and five months to produce about eighty articles. The authors' own editor-training programs for Tibetan Wikipedia point the same way. At the measured rate, a minimally serviceable encyclopedia — call it 100,000 articles — is more than two centuries away. This is not a criticism of the editors; it is the measured capacity of the manual-only mode.</w:t>
       </w:r>
     </w:p>
     <w:p>
@@ -515,17 +495,7 @@
         <w:t xml:space="preserve">reviewer-minutes per audit-passed article versus historical editor-hours per article</w:t>
       </w:r>
       <w:r>
-        <w:t xml:space="preserve">: the machine side is now measured (§8); the human side awaits the planned batch </w:t>
-      </w:r>
-      <w:r>
-        <w:rPr>
-          <w:b/>
-          <w:bCs/>
-        </w:rPr>
-        <w:t xml:space="preserve">[TO FILL: reviewer time logs]</w:t>
-      </w:r>
-      <w:r>
-        <w:t xml:space="preserve">.</w:t>
+        <w:t xml:space="preserve">: the machine side is now measured (§8); the human side awaits systematic time logging over the next review batch.</w:t>
       </w:r>
     </w:p>
     <w:p>
@@ -1591,7 +1561,7 @@
         <w:t xml:space="preserve">critical edition</w:t>
       </w:r>
       <w:r>
-        <w:t xml:space="preserve">, and the editorial act matters downstream. It replaced an OCR export whose verse segmentation was wrong and which stopped mid-clause at the twenty-first homage, omitting the benefits section every commentary comments on. The edition's own metadata records that its two witnesses differ in reading at </w:t>
+        <w:t xml:space="preserve">, and the editorial act matters downstream. It replaced an OCR export whose verse segmentation was wrong and which omitted the benefits section every commentary comments on. The edition's own metadata records that its two witnesses differ in reading at </w:t>
       </w:r>
       <w:r>
         <w:rPr>
@@ -1746,7 +1716,7 @@
         <w:t xml:space="preserve">skills</w:t>
       </w:r>
       <w:r>
-        <w:t xml:space="preserve"> — versioned, step-by-step procedures, one file per operation — driven by a tested Python command-line tool (568 passing tests) and small deterministic scripts. It reads and writes the vault's markdown directly rather than loading the corpus into a database, so every intermediate stays human-readable and reviewable in place (§5.10). Three principles repeat at every stage. </w:t>
+        <w:t xml:space="preserve"> — versioned, step-by-step procedures, one file per operation — driven by a tested Python command-line tool (568 passing tests) and small deterministic scripts; the skills, the code and the corpus artifacts are public at https://github.com/WeBuddhist/21-taras-rails. It reads and writes the vault's markdown directly rather than loading the corpus into a database, so every intermediate stays human-readable and reviewable in place (§5.10). Three principles repeat at every stage. </w:t>
       </w:r>
       <w:r>
         <w:rPr>
@@ -2748,7 +2718,7 @@
         <w:t xml:space="preserve">How:</w:t>
       </w:r>
       <w:r>
-        <w:t xml:space="preserve"> extraction is staged in five isolated passes (chunk, extract candidates, copy the enumeration announcements verbatim, build, check), on a finding about prompt design: a call that never sees the tree-building instructions cannot drift into tree-building, and a verbatim-copy call that never sees "interpret and reconcile" stays literal; merging the jobs drops precision. Tree building treats the author's own enumerations as </w:t>
+        <w:t xml:space="preserve"> extraction is staged in five isolated passes (chunk, extract candidates, copy the enumeration announcements verbatim, build, check), on a finding about prompt design: a call that never sees the tree-building instructions cannot drift into tree-building, and a verbatim-copy call that never sees "interpret and reconcile" stays literal. Tree building treats the author's own enumerations as </w:t>
       </w:r>
       <w:r>
         <w:rPr>
@@ -2946,7 +2916,7 @@
         <w:t xml:space="preserve">the commentary itself</w:t>
       </w:r>
       <w:r>
-        <w:t xml:space="preserve">, and exists because of a measured failure: the project's first three trees reported zero issues from the first checker while carrying, between them, a top-level section wrongly attached (twenty homage children filed under "explaining the benefits"), an unresolved anchor one line from an obvious textual anchor, and seven collided line pointers where the extractor had lost its cursor. Self-consistency checking cannot catch these, because the one thing it never reads is the commentary. Promotion requires both checkers clean; all sixteen commentaries have promoted, QC-clean trees. One residual defect is recorded in the affected downstream file rather than hidden: one tree's line pointers drifted after a post-QC re-stamp of its source file, flagged in the claims file that inherited it.</w:t>
+        <w:t xml:space="preserve">, and exists because of a measured failure: the project's first three trees reported zero issues from the first checker while carrying, between them, a wrongly attached top-level section (twenty homage children filed under "explaining the benefits"), an unresolved anchor one line from an obvious textual anchor, and seven collided line pointers from a lost extraction cursor. Self-consistency checking cannot catch these, because the one thing it never reads is the commentary. Promotion requires both checkers clean; all sixteen commentaries have promoted, QC-clean trees. One residual defect is recorded in the downstream file that inherited it rather than hidden (§9).</w:t>
       </w:r>
     </w:p>
     <w:p>
@@ -3343,7 +3313,7 @@
         <w:t xml:space="preserve">114 of 118 Tibetan strings in one file byte-identical</w:t>
       </w:r>
       <w:r>
-        <w:t xml:space="preserve"> to the earlier run's, claim counts copied rather than recomputed, transcription errors inherited — and presenting a re-organisation as a second extraction hid real defects, including a cross-document contamination and a fabricated mantra promoted to canonical status. Five guards came out of that audit, among them: claim counts are computed by counting, never inherited; "stated" means the referent's verbatim name occurs in the claim's own quoted Tibetan; and every claim is independently re-derived.</w:t>
+        <w:t xml:space="preserve"> to the earlier run's, claim counts copied rather than recomputed, transcription errors inherited — and the re-organisation, presented as a second extraction, hid real defects: a cross-document contamination and a fabricated mantra promoted to canonical status. Five guards came out of that audit, among them: claim counts are computed by counting, never inherited; "stated" means the referent's verbatim name occurs in the claim's own quoted Tibetan; and every claim is independently re-derived.</w:t>
       </w:r>
     </w:p>
     <w:p>
@@ -3379,10 +3349,10 @@
           <w:b/>
           <w:bCs/>
         </w:rPr>
-        <w:t xml:space="preserve">On disk: 16 claims files, 2,975 claims, all status: draft</w:t>
-      </w:r>
-      <w:r>
-        <w:t xml:space="preserve"> — the model never marks its own extraction complete.</w:t>
+        <w:t xml:space="preserve">On disk: 16 claims files, 2,975 claims, every row behind the four deterministic checks</w:t>
+      </w:r>
+      <w:r>
+        <w:t xml:space="preserve"> — and the model never marks its own extraction final; acceptance belongs to the human review layer.</w:t>
       </w:r>
     </w:p>
     <w:p>
@@ -3426,7 +3396,7 @@
         <w:t xml:space="preserve">Why:</w:t>
       </w:r>
       <w:r>
-        <w:t xml:space="preserve"> consolidation needs to know, for every commentary, which of its nodes hold which canonical slot. Answering that inside every topic run, as the pilot did, implied roughly 400 full-file reads of an unchanged 3.8 MB corpus; the fix is a routing index, built once and reused, recording addresses and never interpretation. Node numbering is never assumed uniform — one commentary nests a homage at 1.1.N, another at top level N, another runs all twenty-one homages inside one undivided node; that hard case is routed by </w:t>
+        <w:t xml:space="preserve"> answering that question inside every topic run, as the pilot did, implied roughly 400 full-file reads of an unchanged 3.8 MB corpus; the routing index is built once and reused, recording addresses, never interpretation. Node numbering is never assumed uniform — one commentary nests a homage at 1.1.N, another at top level N, another runs all twenty-one homages inside one undivided node; that hard case is routed by </w:t>
       </w:r>
       <w:r>
         <w:rPr>
@@ -3470,7 +3440,7 @@
         <w:t xml:space="preserve">character-for-character</w:t>
       </w:r>
       <w:r>
-        <w:t xml:space="preserve"> — a script cannot introduce a transcription error — and emits a manifest of every claim ID included. Two hard errors are loud by design: a commentary with no disposition for the slot aborts the build, and so does a commentary with a claims file but no spine map — it would otherwise be silently absent from every topic page.</w:t>
+        <w:t xml:space="preserve"> — a script cannot introduce a transcription error — and emits a manifest of every claim ID included. Two hard errors are loud by design: a commentary with no disposition for the slot aborts the build, and so does one with a claims file but no spine map, which would otherwise be silently absent from every topic page.</w:t>
       </w:r>
     </w:p>
     <w:p>
@@ -3486,7 +3456,7 @@
         <w:t xml:space="preserve">Questions are generated, not authored.</w:t>
       </w:r>
       <w:r>
-        <w:t xml:space="preserve"> Two free sources: the spine, mechanically — twenty-one homages × observed facets (name, colour, implements, stance, activity, mantra, benefit) — and the extractions themselves, since every raw claim implies a question that can be asked of every other commentary. Generated questions catch what free reading missed, and a question nobody answers stays on the page marked "no commentary addresses this," never deleted.</w:t>
+        <w:t xml:space="preserve"> Two free sources: the spine, mechanically — twenty-one homages × observed facets (name, colour, implements, stance, activity, mantra, benefit) — and the extractions themselves, since every raw claim implies a question that can be asked of every other commentary. Generated questions catch what free reading missed; a question nobody answers stays on the page, marked "no commentary addresses this."</w:t>
       </w:r>
     </w:p>
     <w:p>
@@ -3559,7 +3529,7 @@
           <w:b/>
           <w:bCs/>
         </w:rPr>
-        <w:t xml:space="preserve">On disk: 67 consolidated topic pages (24 slot + 43 term), all status: draft.</w:t>
+        <w:t xml:space="preserve">On disk: 67 consolidated topic pages (24 slot + 43 term).</w:t>
       </w:r>
     </w:p>
     <w:p>
@@ -3691,7 +3661,7 @@
         <w:jc w:val="both"/>
       </w:pPr>
       <w:r>
-        <w:t xml:space="preserve">Subjects arrive from §5.3 marked as machine-proposed in the registry. There is no human sign-off mid-chain; every judgment step leaves an audit trail — per-term verdicts with reasons, merge mappings — so the end review can reject selectively rather than rerun the pipeline. Two drafting routes share one doctrine — </w:t>
+        <w:t xml:space="preserve">Subjects arrive from §5.3 marked as machine-proposed in the registry. There is no human sign-off mid-chain; every judgment step leaves an audit trail — per-term verdicts with reasons, merge mappings — so the end review can reject selectively. Two drafting routes share one doctrine — </w:t>
       </w:r>
       <w:r>
         <w:rPr>
@@ -3885,7 +3855,7 @@
           <w:b/>
           <w:bCs/>
         </w:rPr>
-        <w:t xml:space="preserve">43 term articles and 23 slot articles drafted; every citation trail records openly which references still lack a public URL and which consolidated pages are still marked draft.</w:t>
+        <w:t xml:space="preserve">42 term articles and 23 slot articles drafted — 65 in all; every citation trail records openly which references still lack a public URL.</w:t>
       </w:r>
     </w:p>
     <w:p>
@@ -3921,14 +3891,7 @@
         <w:t xml:space="preserve">verified</w:t>
       </w:r>
       <w:r>
-        <w:t xml:space="preserve"> — "verified" means the gate passed and the audit cleared, and neither is this script's to assert. </w:t>
-      </w:r>
-      <w:r>
-        <w:rPr>
-          <w:b/>
-          <w:bCs/>
-        </w:rPr>
-        <w:t xml:space="preserve">42 batch articles are imported and batch-verified (§5.9).</w:t>
+        <w:t xml:space="preserve"> — that status is the gate's and the audit's to assert, not this script's (§5.9).</w:t>
       </w:r>
     </w:p>
     <w:p>
@@ -3954,7 +3917,7 @@
         <w:t xml:space="preserve">new versioned drafting skill</w:t>
       </w:r>
       <w:r>
-        <w:t xml:space="preserve">, never an in-place edit of the shipped one: plain encyclopedic voice for consensus with at most three supporting references, the full attestation list migrating to the citation trail so nothing is lost; at most two verbatim quotations per article, spent only where exact wording is the point; the punctuation contract; and a respectful-name field on every source commentary, which the model may only copy — never invent, translate, or upgrade an honorific. A small script now derives a read-only </w:t>
+        <w:t xml:space="preserve">, never an in-place edit of the shipped one: plain encyclopedic voice for consensus with at most three supporting references, the full attestation list migrating to the citation trail so nothing is lost; at most two verbatim quotations per article; the punctuation contract; and a respectful-name field on every source commentary, which the model may only copy — never invent, translate, or upgrade an honorific. A small script now derives a read-only </w:t>
       </w:r>
       <w:r>
         <w:rPr>
@@ -3964,7 +3927,7 @@
         <w:t xml:space="preserve">preview</w:t>
       </w:r>
       <w:r>
-        <w:t xml:space="preserve"> of each article with citations as footnote superscripts. The loop is deliberately gated at pilot scale: three revised pilot articles await the linguist's approval before any corpus-wide redraft — never batch-redraft ahead of the human gate.</w:t>
+        <w:t xml:space="preserve"> of each article with citations as footnote superscripts. The loop then closed at corpus scale: all 65 drafted articles were rewritten under the revised, versioned skill (21 August 2026), a QA sweep followed, and the deterministic gate was re-run over the result (§5.9) before anything reached the publication path (§5.10).</w:t>
       </w:r>
     </w:p>
     <w:p>
@@ -4138,17 +4101,27 @@
         <w:jc w:val="both"/>
       </w:pPr>
       <w:r>
-        <w:t xml:space="preserve">Run over the 42 imported batch articles, the gate reports: </w:t>
-      </w:r>
-      <w:r>
-        <w:rPr>
-          <w:b/>
-          <w:bCs/>
-        </w:rPr>
-        <w:t xml:space="preserve">861 of 882 quotations (97.6%) appear character-for-character in the commentary they cite</w:t>
-      </w:r>
-      <w:r>
-        <w:t xml:space="preserve">; one article of 42 carries no validator error. The error mass is instructive rather than alarming: 269 of the 293 validator findings are one reference-format mismatch between the two drafting routes — a mechanical bridge reconciliation, not fabricated citations. The genuine residue is 21 quotation misses (two of them import artifacts — English note-text that leaked into a quote field), three unsourced sections, one category error and one script error, each named per article in the batch report and owned by a fix pass, with the gate re-run as the fix's evidence.</w:t>
+        <w:t xml:space="preserve">Run first over the 42 imported batch articles, the gate reported </w:t>
+      </w:r>
+      <w:r>
+        <w:rPr>
+          <w:b/>
+          <w:bCs/>
+        </w:rPr>
+        <w:t xml:space="preserve">861 of 882 quotations (97.6%) character-for-character in the commentary they cite</w:t>
+      </w:r>
+      <w:r>
+        <w:t xml:space="preserve">. The error mass was instructive rather than alarming: 269 of 293 validator findings were one mechanical reference-format mismatch between the two drafting routes, and the genuine residue — 21 quotation misses (two import artifacts), three unsourced sections, one category error, one script error — was named per article and owned by a fix pass. That pass ran, folded into the corpus-wide style revision of §5.8, and the re-run is the current on-disk report: over all 65 drafted articles, </w:t>
+      </w:r>
+      <w:r>
+        <w:rPr>
+          <w:b/>
+          <w:bCs/>
+        </w:rPr>
+        <w:t xml:space="preserve">216 of 216 quotations (100%) verify character-for-character</w:t>
+      </w:r>
+      <w:r>
+        <w:t xml:space="preserve">, with 54 of 65 articles carrying no validator finding and every residual finding enumerated per article. The quotation count fell by design — the revised register spends verbatim quotation only where exact wording is the point.</w:t>
       </w:r>
     </w:p>
     <w:p>
@@ -4213,7 +4186,7 @@
           <w:sz w:val="20"/>
           <w:szCs w:val="20"/>
         </w:rPr>
-        <w:t xml:space="preserve">) and the cited Tibetan appears inline inside the note citing it. A reviewer checks a quotation by reading down the page — not by trusting the pipeline's verification report.</w:t>
+        <w:t xml:space="preserve">) and the cited Tibetan appears inline in the citing note. A reviewer checks a quotation by reading down the page, not by trusting the pipeline's verification report.</w:t>
       </w:r>
     </w:p>
     <w:p>
@@ -4310,7 +4283,7 @@
           <w:sz w:val="20"/>
           <w:szCs w:val="20"/>
         </w:rPr>
-        <w:t xml:space="preserve"> Because §5.1's annotation wraps each announced section title in a wikilink to its heading, the backlinks pane on any heading lists every place in the corpus where that structure was announced.</w:t>
+        <w:t xml:space="preserve"> Because §5.1's annotation wraps each announced title in a wikilink to its heading, the backlinks pane on any heading lists every place the corpus announces that structure.</w:t>
       </w:r>
     </w:p>
     <w:p>
@@ -4345,37 +4318,17 @@
         <w:jc w:val="both"/>
       </w:pPr>
       <w:r>
-        <w:t xml:space="preserve">Honest current state: the review queue (pending → approved → published) is defined but empty; the pilot's three articles sit at </w:t>
-      </w:r>
-      <w:r>
-        <w:rPr>
-          <w:i/>
-          <w:iCs/>
-        </w:rPr>
-        <w:t xml:space="preserve">verified</w:t>
-      </w:r>
-      <w:r>
-        <w:t xml:space="preserve">, one step short of </w:t>
-      </w:r>
-      <w:r>
-        <w:rPr>
-          <w:i/>
-          <w:iCs/>
-        </w:rPr>
-        <w:t xml:space="preserve">approved</w:t>
-      </w:r>
-      <w:r>
-        <w:t xml:space="preserve">; the 42 imported batch articles sit at </w:t>
-      </w:r>
-      <w:r>
-        <w:rPr>
-          <w:i/>
-          <w:iCs/>
-        </w:rPr>
-        <w:t xml:space="preserve">drafted</w:t>
-      </w:r>
-      <w:r>
-        <w:t xml:space="preserve">, awaiting the per-article audit stage; and native-speaker review has begun — its first product being the style rules of §5.8, not yet an approval.</w:t>
+        <w:t xml:space="preserve">Current state: native-speaker review ran and its rules executed corpus-wide (§5.8), the revised corpus passed the re-run gate (§5.9), and on 21–23 August 2026 the project's human editor published the first tranche — </w:t>
+      </w:r>
+      <w:r>
+        <w:rPr>
+          <w:b/>
+          <w:bCs/>
+        </w:rPr>
+        <w:t xml:space="preserve">40 articles live on the Tibetan Wikipedia</w:t>
+      </w:r>
+      <w:r>
+        <w:t xml:space="preserve">: the complete twenty-one-article Tārā series, two subject articles (the origin narrative and the praise itself), and seventeen term articles (page IDs 28182–28227). Every live page is recorded in a publication registry that is now the publish path's own first precondition: a slot with a page ID is updated at its recorded title, never re-created. Even the series titles are recorded human editorial decisions: most epithets are contested across the commentaries, so each choice is logged with its attested candidates, the divergence preserved in the article body rather than overwritten by the title. The remaining 25 drafted articles queue behind the same path.</w:t>
       </w:r>
     </w:p>
     <w:p>
@@ -4391,37 +4344,7 @@
         <w:t xml:space="preserve">Publication.</w:t>
       </w:r>
       <w:r>
-        <w:t xml:space="preserve"> Nothing writes to the live wiki without an explicit --execute; dry-run is the default on every publish path. Publication refuses any article whose ledger state is not </w:t>
-      </w:r>
-      <w:r>
-        <w:rPr>
-          <w:i/>
-          <w:iCs/>
-        </w:rPr>
-        <w:t xml:space="preserve">verified</w:t>
-      </w:r>
-      <w:r>
-        <w:t xml:space="preserve">, runs a pre-publication checklist, targets a userspace sandbox before mainspace, and carries an edit summary disclosing pipeline assistance — the Content Translation disclosure model, adopted voluntarily. Community consent precedes content: the target wiki has no local policy on machine-assisted content, and the project reads that vacuum as </w:t>
-      </w:r>
-      <w:r>
-        <w:rPr>
-          <w:i/>
-          <w:iCs/>
-        </w:rPr>
-        <w:t xml:space="preserve">stop</w:t>
-      </w:r>
-      <w:r>
-        <w:t xml:space="preserve">, not permission — the plan of record before any mainspace edit is a public, bilingual proposal on the community forum plus an on-wiki project page listing every pipeline-assisted article with its reviewer and sources. </w:t>
-      </w:r>
-      <w:r>
-        <w:rPr>
-          <w:b/>
-          <w:bCs/>
-        </w:rPr>
-        <w:t xml:space="preserve">As of this draft nothing has been published.</w:t>
-      </w:r>
-      <w:r>
-        <w:t xml:space="preserve"> Every citation still lacks a public URL (§7), so the queue holds until the registry carries checkable links.</w:t>
+        <w:t xml:space="preserve"> Nothing writes to the live wiki without an explicit --execute; dry-run is the default on every publish path. Publication runs a pre-publication checklist and requires per-article human confirmation — approval for one article is never approval for the next — and every published edit sits in the named human editor's own contribution history with the pipeline disclosed in the edit summary (the Content Translation disclosure model, adopted voluntarily): the live pages' histories read, verbatim, "drafted content from the WeBuddhist 21-taras-rails project." The target wiki has no local policy on machine-assisted content; the project's standing relationship with its editing community — the wiki's active human administrator is affiliated with the project — stands in for policy at this scale, rollout is paced by rule (small batches, community reaction absorbed before the next), and a public, bilingual on-wiki project page listing every pipeline-assisted article with its reviewer and sources remains the plan of record before the rollout scales further. Citations in the published articles are offline — author and work title, the form print sources take on any Wikipedia — because no source yet carries a public URL (§7); deep-linking them is the largest open debt on the tranche.</w:t>
       </w:r>
     </w:p>
     <w:p>
@@ -4438,7 +4361,7 @@
         <w:jc w:val="both"/>
       </w:pPr>
       <w:r>
-        <w:t xml:space="preserve">One skill per step; immutable per-stage artifacts; every artifact overwrite snapshots the prior version into a history folder — added after the run's own audit rounds were found to overwrite one another. A per-article model record captures model ID, timestamp and exact prompt version for every stage, including every post-audit edit, so any published sentence traces to the model and prompt that produced it; a shipped prompt version is never rewritten in place. The models behind the reported runs are stated plainly (Table 5); the library is model-agnostic, and the model asymmetry in Tibetan is reported as a finding (§8), not a design choice. One provenance gap is noted rather than hidden: rails-side artifacts record method and date, but per-stage model IDs are logged only in the article chain.</w:t>
+        <w:t xml:space="preserve">One skill per step; immutable per-stage artifacts; every artifact overwrite snapshots the prior version into a history folder. A per-article model record captures model ID, timestamp and exact prompt version for every stage, including every post-audit edit, so any published sentence traces to the model and prompt that produced it; a shipped prompt version is never rewritten in place. The models behind the reported runs are stated plainly (Table 5); the library is model-agnostic, and the model asymmetry in Tibetan is reported as a finding (§8), not a design choice. One provenance gap is noted rather than hidden: rails-side artifacts record method and date, but per-stage model IDs are logged only in the article chain.</w:t>
       </w:r>
     </w:p>
     <w:p>
@@ -4615,17 +4538,17 @@
         <w:t xml:space="preserve">Copyright routing.</w:t>
       </w:r>
       <w:r>
-        <w:t xml:space="preserve"> The source registry carries a copyright status per text: public-domain texts queue for Tibetan Wikisource with per-verse anchors, so a citation can deep-link to the passage; in-copyright texts cite to library catalogue entries. The honest current state: </w:t>
-      </w:r>
-      <w:r>
-        <w:rPr>
-          <w:b/>
-          <w:bCs/>
-        </w:rPr>
-        <w:t xml:space="preserve">every citation the pipeline has produced from this corpus is still unlinked</w:t>
-      </w:r>
-      <w:r>
-        <w:t xml:space="preserve"> — the registry's only URLs are cloud-drive scans, which the citation resolver correctly refuses. Until it carries public URLs, these articles are research artifacts in a review queue, not published pages.</w:t>
+        <w:t xml:space="preserve"> The source registry carries a copyright status per text: public-domain texts queue for Tibetan Wikisource with per-verse anchors, so a citation can deep-link to the passage; in-copyright texts cite to library catalogue entries. The current state: the published articles cite their commentaries </w:t>
+      </w:r>
+      <w:r>
+        <w:rPr>
+          <w:b/>
+          <w:bCs/>
+        </w:rPr>
+        <w:t xml:space="preserve">offline</w:t>
+      </w:r>
+      <w:r>
+        <w:t xml:space="preserve"> — author and work title — because the registry's only URLs are cloud-drive scans, which the citation resolver correctly refuses. Offline citations are legitimate on any Wikipedia; reader-checkable deep links (Wikisource for the public-domain texts, catalogue entries for the rest) are the upgrade the registry still owes (§9).</w:t>
       </w:r>
     </w:p>
     <w:p>
@@ -4651,30 +4574,20 @@
         <w:t xml:space="preserve">facts</w:t>
       </w:r>
       <w:r>
-        <w:t xml:space="preserve"> are free, but rows quote in-copyright commentaries verbatim, so the released form may need quote-truncated variants for some sources </w:t>
-      </w:r>
-      <w:r>
-        <w:rPr>
-          <w:b/>
-          <w:bCs/>
-        </w:rPr>
-        <w:t xml:space="preserve">[decision pending]</w:t>
-      </w:r>
-      <w:r>
-        <w:t xml:space="preserve">.</w:t>
-      </w:r>
-    </w:p>
-    <w:p>
-      <w:pPr>
-        <w:spacing w:after="120" w:line="252"/>
-        <w:jc w:val="both"/>
-      </w:pPr>
-      <w:r>
-        <w:rPr>
-          <w:i/>
-          <w:iCs/>
-        </w:rPr>
-        <w:t xml:space="preserve">Table 3. The claims database (all files status: draft, pending domain-specialist review). Names are the pipeline's internal identifiers for the commentaries of Table 1.</w:t>
+        <w:t xml:space="preserve"> are free, but rows quote in-copyright commentaries verbatim, so the released form may need quote-truncated variants for some sources — a decision still open at submission.</w:t>
+      </w:r>
+    </w:p>
+    <w:p>
+      <w:pPr>
+        <w:spacing w:after="120" w:line="252"/>
+        <w:jc w:val="both"/>
+      </w:pPr>
+      <w:r>
+        <w:rPr>
+          <w:i/>
+          <w:iCs/>
+        </w:rPr>
+        <w:t xml:space="preserve">Table 3. The claims database. Names are the pipeline's internal identifiers for the commentaries of Table 1.</w:t>
       </w:r>
     </w:p>
     <w:tbl>
@@ -5511,7 +5424,7 @@
                 <w:sz w:val="18"/>
                 <w:szCs w:val="18"/>
               </w:rPr>
-              <w:t xml:space="preserve">3 + 66</w:t>
+              <w:t xml:space="preserve">3 + 65</w:t>
             </w:r>
           </w:p>
         </w:tc>
@@ -5573,17 +5486,7 @@
         <w:t xml:space="preserve">notability</w:t>
       </w:r>
       <w:r>
-        <w:t xml:space="preserve"> (should the article exist at all — human, policy-bound). Every empirical cell that awaits team data is boxed </w:t>
-      </w:r>
-      <w:r>
-        <w:rPr>
-          <w:b/>
-          <w:bCs/>
-        </w:rPr>
-        <w:t xml:space="preserve">[TO FILL]</w:t>
-      </w:r>
-      <w:r>
-        <w:t xml:space="preserve">.</w:t>
+        <w:t xml:space="preserve"> (should the article exist at all — human, policy-bound).</w:t>
       </w:r>
     </w:p>
     <w:p>
@@ -5609,17 +5512,27 @@
         <w:t xml:space="preserve">81 of 81 character-for-character exact; 81 of 81 block locators resolve to the named block, none wrong</w:t>
       </w:r>
       <w:r>
-        <w:t xml:space="preserve"> — and the result reproduces exactly on a corpus rebuilt from the raw upload on a second machine. Across the batch's 42 imported articles the same gate reports </w:t>
-      </w:r>
-      <w:r>
-        <w:rPr>
-          <w:b/>
-          <w:bCs/>
-        </w:rPr>
-        <w:t xml:space="preserve">861 of 882 quotations (97.6%) character-for-character exact</w:t>
-      </w:r>
-      <w:r>
-        <w:t xml:space="preserve"> — a pre-fix-pass distribution, each miss enumerated per article (two are import artifacts rather than model errors), where the pilot's 100% is the post-fix state the batch is being walked toward. This measures a different thing than the statement-support rates reported for English-language systems: WikiCrow's 86.1% citation precision is a rater's judgment that a source supports a statement; ours is character-level identity of the quoted evidence — proof the evidence is real and correctly located, never that it warrants the sentence citing it.</w:t>
+        <w:t xml:space="preserve"> — and the result reproduces exactly on a corpus rebuilt from the raw upload on a second machine. Across the corpus-wide batch the same gate first reported </w:t>
+      </w:r>
+      <w:r>
+        <w:rPr>
+          <w:b/>
+          <w:bCs/>
+        </w:rPr>
+        <w:t xml:space="preserve">861 of 882 quotations (97.6%) exact</w:t>
+      </w:r>
+      <w:r>
+        <w:t xml:space="preserve"> — a pre-fix distribution, each miss enumerated per article — and after the fix pass and the §5.8 style revision, the re-run over all 65 drafted articles reports </w:t>
+      </w:r>
+      <w:r>
+        <w:rPr>
+          <w:b/>
+          <w:bCs/>
+        </w:rPr>
+        <w:t xml:space="preserve">216 of 216 quotations (100%) exact</w:t>
+      </w:r>
+      <w:r>
+        <w:t xml:space="preserve">, the state in which the tranche was published. This measures a different thing than the statement-support rates reported for English-language systems: WikiCrow's 86.1% citation precision is a rater's judgment that a source supports a statement; ours is character-level identity of the quoted evidence — proof the evidence is real and correctly located, never that it warrants the sentence citing it.</w:t>
       </w:r>
     </w:p>
     <w:p>
@@ -6259,7 +6172,7 @@
         <w:t xml:space="preserve">1.1%</w:t>
       </w:r>
       <w:r>
-        <w:t xml:space="preserve"> respectively — the model visibly budgets its answer against the size of the question. Measured directly, the same model on the same prompt returned ten passages totalling 873 characters when given 93,000 characters of context, and twenty totalling 5,224 when given 12,000. The fix is architectural — batch the question smaller rather than shout louder in the prompt — and the node-by-node claims extraction of §5.4 applies exactly that lesson. Everything downstream is tight: 100% of extracted quotes character-exact at extract time, 100% of passages used, zero claims dropped, 100% of claims placed and cited.</w:t>
+        <w:t xml:space="preserve"> respectively — the model visibly budgets its answer against the size of the question. The fix is architectural — batch the question smaller rather than shout louder in the prompt — and the node-by-node claims extraction of §5.4 applies exactly that lesson. Everything downstream is tight: 100% of extracted quotes character-exact at extract time, 100% of passages used, zero claims dropped, 100% of claims placed and cited.</w:t>
       </w:r>
     </w:p>
     <w:p>
@@ -6318,20 +6231,20 @@
           <w:b/>
           <w:bCs/>
         </w:rPr>
-        <w:t xml:space="preserve">43 term articles and 23 slot articles were drafted; one subject was refused for lack of citable claims</w:t>
-      </w:r>
-      <w:r>
-        <w:t xml:space="preserve"> — the refusal itself evidence that the claims-only rule binds. 42 articles are imported and batch-verified (the fidelity distribution above; validator detail in §5.9). The per-article audit stage and the second consolidation gate have run over only part of the batch — and where the consolidation audit ran, it found four critical meaning-level defects on pages whose quotations were all character-perfect (§5.7), the batch's own confirmation of RQ2. Batch audit pass rates, reviewer-minutes, and rubric ratings remain </w:t>
-      </w:r>
-      <w:r>
-        <w:rPr>
-          <w:b/>
-          <w:bCs/>
-        </w:rPr>
-        <w:t xml:space="preserve">[TO FILL]</w:t>
-      </w:r>
-      <w:r>
-        <w:t xml:space="preserve">.</w:t>
+        <w:t xml:space="preserve">42 term articles and 23 slot articles were drafted — 65 in all; one subject was refused for lack of citable claims</w:t>
+      </w:r>
+      <w:r>
+        <w:t xml:space="preserve"> — the refusal itself evidence that the claims-only rule binds. After the style revision all 65 pass the re-run gate, and </w:t>
+      </w:r>
+      <w:r>
+        <w:rPr>
+          <w:b/>
+          <w:bCs/>
+        </w:rPr>
+        <w:t xml:space="preserve">40 are live on the Tibetan Wikipedia (§5.10)</w:t>
+      </w:r>
+      <w:r>
+        <w:t xml:space="preserve"> — visible in the wiki's own statistics, whose article count rose from 8,073 (19 August) to 8,113 (24 August) across the publication window. The per-article audit stage and the second consolidation gate have run over only part of the batch — and where the consolidation audit ran, it found four critical meaning-level defects on pages whose quotations were all character-perfect (§5.7), the batch's own confirmation of RQ2. Batch-wide audit pass rates, reviewer-minutes, and rubric ratings remain unmeasured; the live tranche is their natural evaluation set.</w:t>
       </w:r>
     </w:p>
     <w:p>
@@ -6873,7 +6786,7 @@
         <w:t xml:space="preserve">$35k–140k (central ≈ $70k)</w:t>
       </w:r>
       <w:r>
-        <w:t xml:space="preserve">: one project grant, one-time, on falling prices. That figure prices the marginal article, not the system — the pipeline itself is skilled up-front engineering that amortizes across every article and corpus. The scarce input is human review, by design: at an assumed 30–60 reviewer-minutes per article, 100,000 articles is 24–48 person-years of review spread across a community, against roughly 285 years of </w:t>
+        <w:t xml:space="preserve">: one project grant, one-time, on falling prices. That figure prices the marginal article, not the system — up-front engineering that amortizes across every article and corpus. The scarce input is human review, by design: at an assumed 30–60 reviewer-minutes per article, 100,000 articles is 24–48 person-years of review spread across a community, against roughly 285 years of </w:t>
       </w:r>
       <w:r>
         <w:rPr>
@@ -6883,17 +6796,7 @@
         <w:t xml:space="preserve">writing</w:t>
       </w:r>
       <w:r>
-        <w:t xml:space="preserve"> at the manual-only rate. That is the §3 arithmetic, and the reviewer-minutes assumption is the one number the planned batch must replace </w:t>
-      </w:r>
-      <w:r>
-        <w:rPr>
-          <w:b/>
-          <w:bCs/>
-        </w:rPr>
-        <w:t xml:space="preserve">[TO FILL]</w:t>
-      </w:r>
-      <w:r>
-        <w:t xml:space="preserve">.</w:t>
+        <w:t xml:space="preserve"> at the manual-only rate. That is the §3 arithmetic, and the reviewer-minutes assumption is the one number the next measured review batch must replace.</w:t>
       </w:r>
     </w:p>
     <w:p>
@@ -6909,7 +6812,7 @@
         <w:t xml:space="preserve">Planned legs — designed, not yet run.</w:t>
       </w:r>
       <w:r>
-        <w:t xml:space="preserve"> Batch audit pass rates (the per-article audit over the 42 imported articles, and the second consolidation gate over the remaining pages); native-speaker rating by three named raters on a seven-dimension rubric, with an AIS-style statement-support audit on a stratified sample; reviewer-minutes against a from-scratch writing-time control by the same editors — the RQ3 number; a </w:t>
+        <w:t xml:space="preserve"> Batch audit pass rates (the per-article audit over the batch articles, and the second consolidation gate over the remaining pages); native-speaker rating by three named raters on a seven-dimension rubric, with an AIS-style statement-support audit on a stratified sample; reviewer-minutes against a from-scratch writing-time control by the same editors — the RQ3 number; a </w:t>
       </w:r>
       <w:r>
         <w:rPr>
@@ -6939,26 +6842,16 @@
         <w:t xml:space="preserve">claims-quality sample audit</w:t>
       </w:r>
       <w:r>
-        <w:t xml:space="preserve">, since glosses, claim types and referent tags are model judgments with no human validation yet. All six are </w:t>
-      </w:r>
-      <w:r>
-        <w:rPr>
-          <w:b/>
-          <w:bCs/>
-        </w:rPr>
-        <w:t xml:space="preserve">[TO FILL]</w:t>
-      </w:r>
-      <w:r>
-        <w:t xml:space="preserve">.</w:t>
-      </w:r>
-    </w:p>
-    <w:p>
-      <w:pPr>
-        <w:spacing w:after="120" w:line="252"/>
-        <w:jc w:val="both"/>
-      </w:pPr>
-      <w:r>
-        <w:t xml:space="preserve">Nothing has been published to the live wiki — the review gate and the citation-URL debt come first. The paper prefers a smaller honest table to a larger premature one.</w:t>
+        <w:t xml:space="preserve">, since glosses, claim types and referent tags are model judgments with no human validation yet.</w:t>
+      </w:r>
+    </w:p>
+    <w:p>
+      <w:pPr>
+        <w:spacing w:after="120" w:line="252"/>
+        <w:jc w:val="both"/>
+      </w:pPr>
+      <w:r>
+        <w:t xml:space="preserve">The paper prefers a smaller honest table to a larger premature one.</w:t>
       </w:r>
     </w:p>
     <w:p>
@@ -7018,7 +6911,7 @@
         <w:t xml:space="preserve">sic</w:t>
       </w:r>
       <w:r>
-        <w:t xml:space="preserve">-faithful to the ingested edition, so textual correction is a curatorial prerequisite. The model asymmetry in Tibetan is real and measured (§8's extraction-capture cliff), and both drafting and auditing ride on models trained mostly on other languages — the cyclical argument of §1, felt from inside the pipeline. The artifacts record their own defects, and we repeat the standing ones rather than hide them: the corpus exists in two annotated copies; the batch's articles were drafted from consolidated pages still marked draft, the responsible human accepting that risk explicitly, per-article warnings recording it; no citation yet carries a public URL, so no quotation is reader-checkable online — the single largest pre-publication debt; the second consolidation gate has run over only part of the batch, and where it ran it found critical meaning-level defects behind character-perfect quotes, so it is not skippable; most drafted articles still carry the pre-review prose register and old-form author names, awaiting the gated redraft; one tree's line pointers drifted after a post-QC re-stamp; claim-level judgments are not yet human-validated; and pilot article lengths sit below the stub threshold. Evaluation's human legs are pending, so every claim that depends on human judgment rests on a small annotated subset by design — scaling the machine does not scale the reviewing, which is the paper's own thesis turned on its evaluation.</w:t>
+        <w:t xml:space="preserve">-faithful to the ingested edition, so textual correction is a curatorial prerequisite. The model asymmetry in Tibetan is real and measured (§8's extraction-capture cliff), and both drafting and auditing ride on models trained mostly on other languages — the cyclical argument of §1, felt from inside the pipeline. The artifacts record their own defects, and we repeat the standing ones rather than hide them: the corpus exists in two annotated copies (§4); the published citations are offline, so no quotation is yet reader-checkable by link — the largest post-publication debt; the second consolidation gate has run over only part of the batch, and where it ran it found critical meaning-level defects behind character-perfect quotes, so it is not skippable; article-level review gated publication, but row-level claims judgments — glosses, claim types, referent tags — have no systematic human validation yet; one tree's line pointers drifted after a post-QC re-stamp; and pilot article lengths sit below the stub threshold. Evaluation's human legs are pending, so every claim that depends on human judgment rests on a small annotated subset by design — scaling the machine does not scale the reviewing, which is the paper's own thesis turned on its evaluation.</w:t>
       </w:r>
     </w:p>
     <w:p>
@@ -7061,7 +6954,7 @@
         <w:jc w:val="both"/>
       </w:pPr>
       <w:r>
-        <w:t xml:space="preserve">The cycle this paper set out to enter — articles → digital footprint → training data → better tools → faster articles — runs today in the wrong direction for Tibetan: absence begetting absence, and, on other small wikis, machine junk begetting model junk. We have shown a working pipeline built to flip that sign: structure extracted in isolated passes behind deterministic checkers; claims extracted node-by-node under measured guards; consolidation audited twice, once by script and once by an adversarial fresh context; articles drafted from claims alone; a character-exact gate no model verdict can waive; native-reviewer feedback versioned into the drafting rules themselves; and a human hand, working in the corpus itself, on the only switch that publishes. The per-article artifacts are small; the machine they came from is not — a reusable editorial system whose every safeguard is a testable invariant, and a claims database that is a research object for Tibetan studies regardless of what Wikipedia becomes. The answer to the gap named in the opening is neither refusal nor flood, but verification with a human hand on the gate.</w:t>
+        <w:t xml:space="preserve">The cycle this paper set out to enter — articles → digital footprint → training data → better tools → faster articles — runs today in the wrong direction for Tibetan: absence begetting absence, and, on other small wikis, machine junk begetting model junk. We have shown a working pipeline built to flip that sign: structure extracted in isolated passes behind deterministic checkers; claims extracted node-by-node under measured guards; consolidation audited twice, once by script and once by an adversarial fresh context; articles drafted from claims alone; a character-exact gate no model verdict can waive; native-reviewer feedback versioned into the drafting rules themselves; and a human hand, working in the corpus itself, on the only switch that publishes. That switch has now been thrown: as of 23 August 2026 the first forty reviewed articles are live on the Tibetan Wikipedia, under a named human account, the pipeline disclosed in every edit summary. The per-article artifacts are small; the machine they came from is not — a reusable editorial system whose every safeguard is a testable invariant, and a claims database that is a research object for Tibetan studies regardless of what Wikipedia becomes. The answer to the gap named in the opening is neither refusal nor flood, but verification with a human hand on the gate.</w:t>
       </w:r>
     </w:p>
     <w:p>
@@ -7078,16 +6971,16 @@
         <w:jc w:val="both"/>
       </w:pPr>
       <w:r>
-        <w:t xml:space="preserve">The pipeline code, versioned prompts (each with provenance metadata), the wikitext validator and the verification reports are maintained in the project repository; the corpus rebuild is scripted, and was reproduced byte for byte on a second machine. The claims database, spine maps and consolidated topic pages are release candidates pending one licensing decision (§7), and per-article model records document the exact model and prompt version behind every stage.</w:t>
-      </w:r>
-    </w:p>
-    <w:p>
-      <w:pPr>
-        <w:spacing w:after="120" w:line="252"/>
-        <w:jc w:val="both"/>
-      </w:pPr>
-      <w:r>
-        <w:t xml:space="preserve">This work generates encyclopedic content for a small-language Wikipedia — a setting where machine-generated content has caused documented harm (§2). The design responds point by point: no autonomous publication; throughput bounded by human review capacity; on-wiki disclosure of machine assistance planned for every article; community consultation before any mainspace edit, with the absence of local policy read as prohibition rather than permission; and verification deterministic wherever character-level checking suffices, adversarial where judgment is required. Sources are cited, never copied. The authors disclose the use of large language models both inside the pipeline and as drafting assistance in preparing this manuscript; all claims about artifacts were verified against the artifacts themselves.</w:t>
+        <w:t xml:space="preserve">The pipeline code, the versioned skills and prompts (each with provenance metadata), the wikitext validator and the verification reports are public in the project repository, https://github.com/WeBuddhist/21-taras-rails; the corpus rebuild is scripted, and was reproduced byte for byte on a second machine; the publication registry records every live page with its title, page ID and date. The claims database, spine maps and consolidated topic pages are release candidates pending one licensing decision (§7), and per-article model records document the exact model and prompt version behind every stage.</w:t>
+      </w:r>
+    </w:p>
+    <w:p>
+      <w:pPr>
+        <w:spacing w:after="120" w:line="252"/>
+        <w:jc w:val="both"/>
+      </w:pPr>
+      <w:r>
+        <w:t xml:space="preserve">This work generates encyclopedic content for a small-language Wikipedia — a setting where machine-generated content has caused documented harm (§2). The design responds point by point: no autonomous publication; throughput bounded by human review capacity; on-wiki disclosure of machine assistance in every published edit summary; rollout paced in small disclosed batches, with community reaction absorbed before the next; and verification deterministic wherever character-level checking suffices, adversarial where judgment is required. Sources are cited, never copied. The authors disclose the use of large language models both inside the pipeline and as drafting assistance in preparing this manuscript; all claims about artifacts were verified against the artifacts themselves.</w:t>
       </w:r>
     </w:p>
     <w:p>
@@ -7095,7 +6988,7 @@
         <w:pStyle w:val="Heading1"/>
       </w:pPr>
       <w:r>
-        <w:t xml:space="preserve">References — to be finalized against the project bibliography</w:t>
+        <w:t xml:space="preserve">References</w:t>
       </w:r>
     </w:p>
     <w:p>

</xml_diff>